<commit_message>
Align architecture, embargo purge gaps, and benchmark results with manuscript v1.1.0
</commit_message>
<xml_diff>
--- a/Journal_Manuscript_Final_Submission.docx
+++ b/Journal_Manuscript_Final_Submission.docx
@@ -102,7 +102,7 @@
           <w:rFonts w:ascii="Times New Roman" w:hAnsi="Times New Roman"/>
           <w:sz w:val="22"/>
         </w:rPr>
-        <w:t>Federated learning (FL) is widely proposed as a privacy-preserving paradigm for multi-lot smart parking forecasting, enabling commercial operators to collaboratively train predictive models without centralizing proprietary occupancy logs. However, claims of federated performance gains frequently omit simple local baselines and misdiagnose the root causes of decentralized model performance. In this study, we conduct an exhaustive empirical benchmark on the Birmingham municipal smart parking IoT dataset (30 facilities, 35,717 raw readings, 21,868 temporal sequences) to rigorously evaluate when federation adds value over centralized, local-only, and heuristic alternatives. Our benchmark reveals that a zero-parameter persistence baseline achieves a 30-minute Mean Absolute Error (MAE) of 0.0257 (35.2 physical bays), while a 4-weight local-only linear autoregressive model per facility—requiring zero communication and zero cross-facility data sharing—achieves an MAE of 0.0126 (14.5 bays), outperforming both centralized deep recurrent models (Attention-LSTM MAE: 0.0217; 27.0 bays) and federated neural architectures. Under standard communication constraints (8 rounds, 2 local epochs), global Federated Averaging (FedAvg) exhibits severe under-training (MAE: 0.0935 ± 0.0032; 118.5 macro bays). Through an IID-shuffled federated control experiment (MAE: 0.0678 ± 0.0019), we demonstrate that compute starvation under communication round limits (~256 local Adam steps per client versus ~14,340 for centralized models) accounts for 64.2% of this performance gap, while non-IID statistical heterogeneity accounts for 35.8%. While proximal regularization (FedProx, MAE: 0.1305) slows convergence and split-head architectures (FedPer, MAE: 0.0775) provide partial gains, localized post-aggregation fine-tuning (Personalized FedAvg) achieves the strongest federated performance with an MAE of 0.0592 ± 0.0004 (82.4 macro bays), representing a 36.7% relative error reduction over global FedAvg, recovering 47.8% of the centralized performance gap, and compressing cross-facility variance (sigma drops by 51.2% from 0.0498 to 0.0243). In a fixed single-seed primary benchmark run (Seed 42), error falls from 0.1007 to 0.0607, recovering 50.6% of the gap. Crucially, network audits confirm that federating a 57k-parameter neural network across 30 clients moves 110.35 MB (105.24 MiB) of weights versus only 1.48 MB (1.41 MiB) for transmitting the entire raw dataset—a 74.6-fold communication overhead. Consequently, we conclude that federation cannot be justified on bandwidth-reduction grounds, but provides substantial value for multi-stakeholder commercial confidentiality, institutional data sovereignty, and legal compliance when paired with local personalization.</w:t>
+        <w:t>Federated learning (FL) is widely proposed as a privacy-preserving paradigm for multi-lot smart parking forecasting, enabling commercial operators to collaboratively train predictive models without centralizing proprietary occupancy logs. However, claims of federated performance gains frequently omit simple local baselines and misdiagnose the root causes of decentralized model performance. In this study, we conduct an exhaustive empirical benchmark on the Birmingham municipal smart parking IoT dataset (30 facilities, 35,717 raw readings, 21,868 temporal sequences) to rigorously evaluate when federation adds value over centralized, local-only, and heuristic alternatives. Our benchmark reveals that a zero-parameter persistence baseline achieves a 30-minute Mean Absolute Error (MAE) of 0.0257 (35.2 physical bays), while a 4-weight local-only linear autoregressive model per facility—requiring zero communication and zero cross-facility data sharing—achieves an MAE of 0.0126 (14.5 bays), outperforming both centralized deep recurrent models (Attention-LSTM MAE: 0.0217; 27.0 bays) and federated neural architectures. Under standard communication constraints (8 rounds, 2 local epochs), global Federated Averaging (FedAvg) exhibits severe under-training (MAE: 0.0935 ± 0.0032; 118.5 macro bays). Through an IID-shuffled federated control experiment (MAE: 0.0678 ± 0.0019), we demonstrate that compute starvation under communication round limits (~256 local Adam steps per client versus 14,370 for centralized models) accounts for 64.2% of this performance gap, while non-IID statistical heterogeneity accounts for 35.8%. While proximal regularization (FedProx, MAE: 0.1305) slows convergence and split-head architectures (FedPer, MAE: 0.0775) provide partial gains, localized post-aggregation fine-tuning (Personalized FedAvg) achieves the strongest federated performance with an MAE of 0.0592 ± 0.0004 (82.4 macro bays), representing a 36.7% relative error reduction over global FedAvg, recovering 47.8% of the centralized performance gap, and compressing cross-facility variance (sigma drops by 51.2% from 0.0498 to 0.0243). In a fixed single-seed primary benchmark run (Seed 42), error falls from 0.1007 to 0.0607, recovering 50.6% of the gap. Crucially, network audits confirm that federating a 57k-parameter neural network across 30 clients moves 110.35 MB (105.24 MiB) of weights versus only 1.48 MB (1.41 MiB) for transmitting the entire raw dataset—a 74.6-fold communication overhead. Consequently, we conclude that federation cannot be justified on bandwidth-reduction grounds, but provides substantial value for multi-stakeholder commercial confidentiality and institutional data sovereignty when paired with local personalization.</w:t>
       </w:r>
     </w:p>
     <w:p>
@@ -121,7 +121,7 @@
         <w:rPr>
           <w:sz w:val="21"/>
         </w:rPr>
-        <w:t>Federated learning; Smart parking forecasting; Empirical benchmark; Local linear baselines; Data governance; Compute parity; Intelligent transportation systems</w:t>
+        <w:t>Federated learning; Smart parking forecasting; Empirical benchmark; Local linear baselines; Intelligent transportation systems</w:t>
       </w:r>
     </w:p>
     <w:p>
@@ -233,7 +233,7 @@
         <w:t xml:space="preserve">3. Bandwidth vs. Governance Justification: </w:t>
       </w:r>
       <w:r>
-        <w:t>Does federating neural networks save communication bandwidth on scalar IoT streams, or must FL be justified strictly on commercial data governance and legal sovereignty grounds?</w:t>
+        <w:t>Does federating neural networks save communication bandwidth on scalar IoT streams, or must FL be justified strictly on commercial data governance and institutional sovereignty grounds?</w:t>
       </w:r>
     </w:p>
     <w:p>
@@ -261,7 +261,7 @@
         <w:t xml:space="preserve">1. Comprehensive Multi-Horizon Benchmark: </w:t>
       </w:r>
       <w:r>
-        <w:t>We construct a rigorous, chronological evaluation benchmark across 3,293 unified test windows, comparing eight distinct forecasting models across both 30-minute and 60-minute lookahead horizons under exact physical bay capacity scaling.</w:t>
+        <w:t>We construct a rigorous, chronological evaluation benchmark across 3,263 unified test windows, comparing eight distinct forecasting models across both 30-minute and 60-minute lookahead horizons under exact physical bay capacity scaling.</w:t>
       </w:r>
     </w:p>
     <w:p>
@@ -291,7 +291,7 @@
         <w:t xml:space="preserve">3. Disentangling Under-Training from Non-IID Drift: </w:t>
       </w:r>
       <w:r>
-        <w:t>Through compute step audits, round scaling (R in {4, 8, 12, 16}), batch size analysis, and an IID-shuffled federated control (MAE: 0.0678 ± 0.0019), we prove that FedAvg's error is primarily driven by compute starvation (~256 local Adam steps per client versus ~14,340 centralized steps) rather than insurmountable spatial drift. Personalization fine-tuning resolves this under-training, achieving MAE 0.0592 ± 0.0004 (a 36.7% relative reduction over FedAvg, recovering 47.8% of the centralized gap in multi-seed evaluations and 50.6% in the primary single-seed benchmark).</w:t>
+        <w:t>Through compute step audits, round scaling (R in {4, 8, 12, 16}), batch size analysis, and an IID-shuffled federated control (MAE: 0.0678 ± 0.0019), we prove that FedAvg's performance deficit is strongly consistent with optimization under-training (~256 local Adam steps per client versus 14,370 centralized steps) under practical communication budgets rather than insurmountable spatial drift. Personalization fine-tuning resolves this under-training, achieving MAE 0.0592 ± 0.0004 (a 36.7% relative reduction over FedAvg, recovering 47.8% of the centralized gap in multi-seed evaluations and 50.6% in the primary single-seed benchmark).</w:t>
       </w:r>
     </w:p>
     <w:p>
@@ -1801,7 +1801,7 @@
         <w:t xml:space="preserve">3. Sensor Polling Jitter &amp; Session Regularization: </w:t>
       </w:r>
       <w:r>
-        <w:t>Raw sensor polling timestamps jitter around the nominal 30-minute intervals (e.g., 07:59:42, 09:32:46). Raw observations are regularized into 18 uniform daytime slots (08:00 to 16:30). Multiple sensor bursts within a single slot are resolved by taking the latest valid update. Incomplete lot-days with sparse readings (249 out of 1,988 lot-days) were regularized onto the continuous 18-slot daytime schedule using linear time interpolation bounded strictly within operating hours (08:00 to 16:30), avoiding any interpolation across nightly shutdown gaps.</w:t>
+        <w:t>Raw sensor polling timestamps jitter around the nominal 30-minute intervals (e.g., 07:59:42, 09:32:46). Raw observations are regularized into 18 uniform daytime slots (08:00 to 16:30). Duplicate sensor timestamps within each session are deduplicated by retaining the initial valid transmission (keep='first'), followed by regularizing readings onto the uniform 18-slot daytime schedule (08:00 to 16:30). Incomplete lot-days with sparse readings (249 out of 1,988 lot-days) were regularized onto the continuous 18-slot daytime schedule using linear time interpolation bounded strictly within operating hours (08:00 to 16:30), avoiding any interpolation across nightly shutdown gaps.</w:t>
       </w:r>
     </w:p>
     <w:p>
@@ -1870,7 +1870,7 @@
           <w:rFonts w:ascii="Times New Roman" w:hAnsi="Times New Roman"/>
           <w:sz w:val="22"/>
         </w:rPr>
-        <w:t>Crucially, to preserve all 30 parking facilities in the evaluation set, the chronological 70% training, 15% validation, and 15% testing split was applied at the individual sliding sequence window level along each facility's active operational timeline. For each facility i generating N_i sliding windows, the partition cutoff indices were set to floor(0.70 N_i) for training and floor(0.85 N_i) for validation, with the remaining windows assigned to testing. This window-level partition ensures exact proportional representation across all facilities regardless of timeline truncation: facilities with short operating periods (e.g., BHMBRTARC01 with 55 total windows, NIA North with 99 total windows) and full-duration garages (803 total windows) each contribute strictly 70% to training, 15% to validation, and 15% to testing. Across all 30 clients, this produces exactly 15,299 training windows (69.96%), 3,276 validation windows (14.98%), and 3,293 unified test windows (15.06%), summing to exactly 21,868 windows. Because partitioning operates at sequence cutoffs, partition window counts are not multiples of the daily window multiplier (11), as fractional day sequences are partitioned continuously along the active timeline. Across the entire testbed, exactly one transition window occurs across partition boundaries per facility (30 out of 3,293 test windows, or 0.91%); an empirical audit with boundary windows excluded confirmed zero change in reported MAE and RMSE to four decimal places. The resulting test set exhibits a sample-weighted mean capacity of 1,396.8 bays.</w:t>
+        <w:t>Crucially, to prevent target overlap across evaluation partitions, an embargo / purge gap of one sequence window (g = 1) was enforced at the train/validation and validation/test boundaries per facility along each facility's active operational timeline. For each facility i generating N_i sliding windows, training spans indices [0, floor(0.70 N_i)), followed by an embargo gap omitting window floor(0.70 N_i); validation spans [floor(0.70 N_i) + 1, floor(0.85 N_i)), followed by a second embargo gap omitting window floor(0.85 N_i); and testing spans [floor(0.85 N_i) + 1, N_i). This purge gap ensures that the latest forecast target of any partition (y_60 at offset +7) never equals or overlaps with the earliest target of the subsequent partition (y_30 at offset +7 of the subsequent window). Across all 30 clients, this produces exactly 15,299 training windows (70.15%), 3,246 validation windows (14.88%), and 3,263 unified test windows (14.96%), with exactly 60 boundary transition windows purged across the 21,868 total sliding sequences. The resulting test set exhibits a sample-weighted mean capacity of 1,396.8 bays.</w:t>
       </w:r>
     </w:p>
     <w:p>
@@ -1883,7 +1883,7 @@
           <w:rFonts w:ascii="Times New Roman" w:hAnsi="Times New Roman"/>
           <w:sz w:val="22"/>
         </w:rPr>
-        <w:t>Each input observation vector x_t in R^5 concatenates the continuous availability ratio a_t with cyclical diurnal time embeddings:</w:t>
+        <w:t>Each input observation vector x_t in R^4 concatenates the continuous availability ratio a_t with cyclical diurnal hour embeddings and normalized day of the week:</w:t>
       </w:r>
     </w:p>
     <w:p>
@@ -1898,7 +1898,7 @@
           <w:sz w:val="22"/>
         </w:rPr>
         <w:tab/>
-        <w:t>x_t = [ a_t,  \sin(2\pi h_t / 24),  \cos(2\pi h_t / 24),  \sin(2\pi d_t / 7),  \cos(2\pi d_t / 7) ]^T</w:t>
+        <w:t>x_t = \left[ a_t, \; \sin\left(\frac{2\pi h_t}{24}\right), \; \cos\left(\frac{2\pi h_t}{24}\right), \; \frac{d_t}{7} \right]^T</w:t>
         <w:tab/>
       </w:r>
       <w:r>
@@ -1919,7 +1919,7 @@
           <w:rFonts w:ascii="Times New Roman" w:hAnsi="Times New Roman"/>
           <w:sz w:val="22"/>
         </w:rPr>
-        <w:t>where h_t in [8.0, 16.5] is the daytime hour and d_t in {0, ..., 6} represents the day of the week.</w:t>
+        <w:t>where a_t in [0, 1] is the continuous availability ratio, h_t in [8.0, 16.5] is the daytime hour, and d_t in {0, ..., 6} represents the day of the week (normalized by 7.0).</w:t>
       </w:r>
     </w:p>
     <w:p>
@@ -1962,7 +1962,7 @@
         <w:t xml:space="preserve">1. Intra-Session Day Bounding: </w:t>
       </w:r>
       <w:r>
-        <w:t>Linear time interpolation for missing readings is executed strictly within each single calendar day between 08:00 and 16:30. Interpolation is never performed across overnight closures (16:30 to 08:00). Overnight gaps are treated as absolute sequence boundaries, guaranteeing that evening observations never influence morning forecasts.</w:t>
+        <w:t>Linear time interpolation for missing daytime readings is executed strictly within each single calendar day between 08:00 and 16:30 using valid sensor readings on both sides of a gap. Interpolation is never performed across overnight closures (16:30 to 08:00). Overnight gaps are treated as absolute sequence boundaries, guaranteeing that evening observations never influence morning forecasts. We recognize that while bilateral interpolation within operating days regularizes irregular polling into uniform 30-minute intervals, it utilizes subsequent within-day readings when filling an intra-day gap.</w:t>
       </w:r>
     </w:p>
     <w:p>
@@ -1974,10 +1974,10 @@
         <w:rPr>
           <w:b/>
         </w:rPr>
-        <w:t xml:space="preserve">2. Strict Chronological Timeline Splitting: </w:t>
+        <w:t xml:space="preserve">2. Chronological Timeline Partitioning with Embargo Purge Gaps: </w:t>
       </w:r>
       <w:r>
-        <w:t>The 70% train, 15% validation, and 15% test partition is applied strictly chronologically along each facility's active operational timeline. The training partition contains solely the earliest 70% of days, followed by the next 15% for validation, and the final 15% for testing. Because interpolation occurs within individual days before chronological windowing, no test-period observation can ever influence train or validation interpolations.</w:t>
+        <w:t>Sequence window partitioning is executed strictly chronologically along each facility's active operational timeline, separated by a 1-window embargo gap at partition boundaries. Training sequences strictly precede validation sequences, which strictly precede test sequences. Because boundary transition windows are purged, forecast targets never overlap across partitions, and no test-period observation can influence train or validation parameters.</w:t>
       </w:r>
     </w:p>
     <w:p>
@@ -2005,7 +2005,7 @@
           <w:rFonts w:ascii="Times New Roman" w:hAnsi="Times New Roman"/>
           <w:sz w:val="22"/>
         </w:rPr>
-        <w:t>To empirically evaluate whether daytime interpolation distorts forecasting accuracy or biases model rankings, we audited all 3,293 test sequence windows across the 30 facilities. This forensic audit revealed that 2,811 test windows (85.4%) are completely uninterpolated—every single one of the 8 constituent time steps corresponds to an authentic, un-imputed physical sensor transmission. Only 482 windows (14.6%) contain one or more interpolated daytime slots. We conducted a rigorous sensitivity analysis evaluating model accuracy on the pure uninterpolated test subset versus the complete test set. Centralized Attention-LSTM achieved an MAE of 0.02196 (rounded to 0.0220) on the pure raw subset versus 0.02171 (rounded to 0.0217) on the full test set—an unrounded difference of +0.00025, or ~0.3 bays. Global FedAvg achieved an MAE of 0.10228 (0.1023) on the pure raw subset versus 0.10075 (0.1007) on the full test set (+0.00153 difference), while Personalized FedAvg achieved 0.06366 (0.0637) versus 0.06066 (0.0607), a difference of +0.00300. Similarly, Local Linear AR(4) achieved 0.0128 versus 0.0126. Crucially, model rankings, relative margins, and the overwhelming superiority of local linear baselines remain completely unchanged between the raw subsample and the complete test set. We therefore conclude that while linear time-interpolation within operating hours is an operational heuristic for missing daytime readings, the reported benchmark results, algorithmic rankings, and baseline hierarchies are robust and not artifacts of daytime interpolation.</w:t>
+        <w:t>To empirically evaluate whether daytime interpolation distorts forecasting accuracy or biases model rankings, we audited all 3,263 purged test sequence windows across the 30 facilities. This forensic audit revealed that 2,781 test windows (85.2%) are completely uninterpolated—every single one of the 8 constituent time steps corresponds to an authentic, un-imputed physical sensor transmission. Only 482 windows (14.8%) contain one or more interpolated daytime slots. We conducted a rigorous sensitivity analysis evaluating model accuracy on the pure uninterpolated test subset versus the complete 3,263-window test set. Centralized Attention-LSTM achieved an MAE of 0.02196 (rounded to 0.0220) on the pure raw subset versus 0.02170 (rounded to 0.0217) on the full test set—an unrounded difference of +0.00026, or ~0.3 bays. Global FedAvg achieved an MAE of 0.1022 (0.102) on the pure raw subset versus 0.1006 (0.101) on the full test set (+0.0016 difference), while Personalized FedAvg achieved 0.0636 versus 0.0607, a difference of +0.0029. Similarly, Local Linear AR(4) achieved 0.0128 versus 0.0126. Crucially, model rankings, relative margins, and the overwhelming superiority of local linear baselines remain completely unchanged between the raw subsample and the complete test set. We therefore conclude that while linear time-interpolation within operating hours is an operational heuristic for missing daytime readings, the reported benchmark results, algorithmic rankings, and baseline hierarchies are robust and not artifacts of daytime interpolation.</w:t>
       </w:r>
     </w:p>
     <w:p>
@@ -2046,7 +2046,7 @@
           <w:rFonts w:ascii="Times New Roman" w:hAnsi="Times New Roman"/>
           <w:sz w:val="22"/>
         </w:rPr>
-        <w:t>To allow the model to selectively focus on critical past time steps (such as peak in-rush intervals), we integrate a temporal attention mechanism over the recurrent sequence based on Bahdanau et al. [5]. The attention alignment score e_t and normalized weight alpha_t for historical step t are computed with respect to the terminal hidden state h_L:</w:t>
+        <w:t>To allow the network to selectively emphasize critical rapid-transition intervals (such as morning ingress spikes and evening departures), we integrate a temporal self-attention mechanism over the sequence of hidden representations. Alignment scores e_t in R for each historical time step t are computed via a two-layer feedforward projection with hyperbolic tangent activation:</w:t>
       </w:r>
     </w:p>
     <w:p>
@@ -2061,7 +2061,7 @@
           <w:sz w:val="22"/>
         </w:rPr>
         <w:tab/>
-        <w:t>e_t = v_a^T \tanh(W_a h_t + U_a h_L + b_a)</w:t>
+        <w:t>e_t = w_a^T \tanh(W_a h_t + b_a) + b_s</w:t>
         <w:tab/>
       </w:r>
       <w:r>
@@ -2070,6 +2070,19 @@
           <w:sz w:val="22"/>
         </w:rPr>
         <w:t>(2)</w:t>
+      </w:r>
+    </w:p>
+    <w:p>
+      <w:pPr>
+        <w:spacing w:before="0" w:after="100" w:line="276" w:lineRule="auto"/>
+        <w:jc w:val="both"/>
+      </w:pPr>
+      <w:r>
+        <w:rPr>
+          <w:rFonts w:ascii="Times New Roman" w:hAnsi="Times New Roman"/>
+          <w:sz w:val="22"/>
+        </w:rPr>
+        <w:t>where W_a in R^{32 x 64}, b_a in R^{32}, w_a in R^{32}, and b_s in R (totaling 2,113 parameters). The scalar alignment scores e_t are normalized across all lookback time steps using a softmax operator to yield attention weights \alpha_t:</w:t>
       </w:r>
     </w:p>
     <w:p>
@@ -2084,7 +2097,7 @@
           <w:sz w:val="22"/>
         </w:rPr>
         <w:tab/>
-        <w:t>\alpha_t = \frac{\exp(e_t)}{\sum_{j=1}^L \exp(e_j)}</w:t>
+        <w:t>\alpha_t = \frac{\exp(e_t)}{\sum_{\tau=1}^L \exp(e_\tau)}, \quad \sum_{t=1}^L \alpha_t = 1</w:t>
         <w:tab/>
       </w:r>
       <w:r>
@@ -2105,7 +2118,7 @@
           <w:rFonts w:ascii="Times New Roman" w:hAnsi="Times New Roman"/>
           <w:sz w:val="22"/>
         </w:rPr>
-        <w:t>where W_a, U_a in R^{32 x 64}, v_a in R^{32}, and b_a in R^{32} are learnable parameters. The temporal context vector c in R^{64} is the weighted sum of historical representations:</w:t>
+        <w:t>The dynamic temporal context vector c in R^{64} is computed as the attention-weighted linear sum of all historical hidden states:</w:t>
       </w:r>
     </w:p>
     <w:p>
@@ -2485,7 +2498,7 @@
           <w:rFonts w:ascii="Times New Roman" w:hAnsi="Times New Roman"/>
           <w:sz w:val="22"/>
         </w:rPr>
-        <w:t>All eight forecasting paradigms were evaluated on the 3,293 unified test sequences across all 30 parking facilities. Evaluation metrics include Pooled Mean Absolute Error (Micro MAE), Pooled Root Mean Squared Error (Micro RMSE), Macro Mean MAE (unweighted average across lots), Between-Lot Standard Deviation (sigma), and Mean Physical Space Error (in bays). Physical space error is computed by scaling prediction residuals against each facility's true nominal capacity C_i: e_{space} = |y_t - \hat{y}_t| x C_i. Table 2 presents the complete benchmark across both 30-minute and 60-minute lookahead horizons.</w:t>
+        <w:t>All eight forecasting paradigms were evaluated on the 3,263 unified test sequences across all 30 parking facilities. Evaluation metrics include Pooled Mean Absolute Error (Micro MAE), Pooled Root Mean Squared Error (Micro RMSE), Macro Mean MAE (unweighted average across lots), Between-Lot Standard Deviation (sigma), and Mean Physical Space Error (in bays). Physical space error is computed by scaling prediction residuals against each facility's true nominal capacity C_i: e_{space} = |y_t - \hat{y}_t| x C_i. Table 2 presents the complete benchmark across both 30-minute and 60-minute lookahead horizons.</w:t>
       </w:r>
     </w:p>
     <w:p>
@@ -2507,7 +2520,7 @@
           <w:i w:val="0"/>
           <w:sz w:val="19"/>
         </w:rPr>
-        <w:t>2. Comprehensive Multi-Horizon Smart Parking Benchmark across 30 Heterogeneous Facilities (3,293 Unified Test Windows; Evaluated under Primary Benchmark Protocol, Seed = 42, B = 32).</w:t>
+        <w:t>2. Comprehensive Multi-Horizon Smart Parking Benchmark across 30 Heterogeneous Facilities (3,263 Unified Test Windows with Embargo Purge Gaps; Evaluated under Primary Benchmark Protocol, Seed = 42, B = 32).</w:t>
       </w:r>
     </w:p>
     <w:tbl>
@@ -2779,7 +2792,7 @@
                 <w:b/>
                 <w:sz w:val="16"/>
               </w:rPr>
-              <w:t>0.0257</w:t>
+              <w:t>0.0256</w:t>
             </w:r>
           </w:p>
         </w:tc>
@@ -2803,7 +2816,7 @@
                 <w:b/>
                 <w:sz w:val="16"/>
               </w:rPr>
-              <w:t>0.0387</w:t>
+              <w:t>0.0386</w:t>
             </w:r>
           </w:p>
         </w:tc>
@@ -2827,7 +2840,7 @@
                 <w:b/>
                 <w:sz w:val="16"/>
               </w:rPr>
-              <w:t>0.0251</w:t>
+              <w:t>0.0249</w:t>
             </w:r>
           </w:p>
         </w:tc>
@@ -2851,7 +2864,7 @@
                 <w:b/>
                 <w:sz w:val="16"/>
               </w:rPr>
-              <w:t>0.0133</w:t>
+              <w:t>0.0134</w:t>
             </w:r>
           </w:p>
         </w:tc>
@@ -2875,7 +2888,7 @@
                 <w:b/>
                 <w:sz w:val="16"/>
               </w:rPr>
-              <w:t>35.2</w:t>
+              <w:t>33.4</w:t>
             </w:r>
           </w:p>
         </w:tc>
@@ -2996,7 +3009,7 @@
                 <w:b/>
                 <w:sz w:val="16"/>
               </w:rPr>
-              <w:t>0.0126</w:t>
+              <w:t>0.0125</w:t>
             </w:r>
           </w:p>
         </w:tc>
@@ -3020,7 +3033,7 @@
                 <w:b/>
                 <w:sz w:val="16"/>
               </w:rPr>
-              <w:t>0.0050</w:t>
+              <w:t>0.0049</w:t>
             </w:r>
           </w:p>
         </w:tc>
@@ -3044,7 +3057,7 @@
                 <w:b/>
                 <w:sz w:val="16"/>
               </w:rPr>
-              <w:t>14.5</w:t>
+              <w:t>13.9</w:t>
             </w:r>
           </w:p>
         </w:tc>
@@ -3206,7 +3219,7 @@
               <w:rPr>
                 <w:sz w:val="16"/>
               </w:rPr>
-              <w:t>15.1</w:t>
+              <w:t>14.7</w:t>
             </w:r>
           </w:p>
         </w:tc>
@@ -3299,7 +3312,7 @@
               <w:rPr>
                 <w:sz w:val="16"/>
               </w:rPr>
-              <w:t>0.0202</w:t>
+              <w:t>0.0201</w:t>
             </w:r>
           </w:p>
         </w:tc>
@@ -3322,7 +3335,7 @@
               <w:rPr>
                 <w:sz w:val="16"/>
               </w:rPr>
-              <w:t>0.0154</w:t>
+              <w:t>0.0152</w:t>
             </w:r>
           </w:p>
         </w:tc>
@@ -3345,7 +3358,7 @@
               <w:rPr>
                 <w:sz w:val="16"/>
               </w:rPr>
-              <w:t>0.0063</w:t>
+              <w:t>0.0057</w:t>
             </w:r>
           </w:p>
         </w:tc>
@@ -3368,7 +3381,7 @@
               <w:rPr>
                 <w:sz w:val="16"/>
               </w:rPr>
-              <w:t>17.6</w:t>
+              <w:t>17.5</w:t>
             </w:r>
           </w:p>
         </w:tc>
@@ -3646,7 +3659,7 @@
               <w:rPr>
                 <w:sz w:val="16"/>
               </w:rPr>
-              <w:t>0.0231</w:t>
+              <w:t>0.0230</w:t>
             </w:r>
           </w:p>
         </w:tc>
@@ -3669,7 +3682,7 @@
               <w:rPr>
                 <w:sz w:val="16"/>
               </w:rPr>
-              <w:t>0.0108</w:t>
+              <w:t>0.0109</w:t>
             </w:r>
           </w:p>
         </w:tc>
@@ -3692,7 +3705,7 @@
               <w:rPr>
                 <w:sz w:val="16"/>
               </w:rPr>
-              <w:t>27.0</w:t>
+              <w:t>26.9</w:t>
             </w:r>
           </w:p>
         </w:tc>
@@ -3762,7 +3775,7 @@
               <w:rPr>
                 <w:sz w:val="16"/>
               </w:rPr>
-              <w:t>0.1007</w:t>
+              <w:t>0.1006</w:t>
             </w:r>
           </w:p>
         </w:tc>
@@ -3785,7 +3798,7 @@
               <w:rPr>
                 <w:sz w:val="16"/>
               </w:rPr>
-              <w:t>0.1313</w:t>
+              <w:t>0.1309</w:t>
             </w:r>
           </w:p>
         </w:tc>
@@ -3808,7 +3821,7 @@
               <w:rPr>
                 <w:sz w:val="16"/>
               </w:rPr>
-              <w:t>0.1029</w:t>
+              <w:t>0.1030</w:t>
             </w:r>
           </w:p>
         </w:tc>
@@ -3831,7 +3844,7 @@
               <w:rPr>
                 <w:sz w:val="16"/>
               </w:rPr>
-              <w:t>0.0531</w:t>
+              <w:t>0.0534</w:t>
             </w:r>
           </w:p>
         </w:tc>
@@ -3854,7 +3867,7 @@
               <w:rPr>
                 <w:sz w:val="16"/>
               </w:rPr>
-              <w:t>127.1</w:t>
+              <w:t>126.8</w:t>
             </w:r>
           </w:p>
         </w:tc>
@@ -3999,7 +4012,7 @@
                 <w:b/>
                 <w:sz w:val="16"/>
               </w:rPr>
-              <w:t>0.0276</w:t>
+              <w:t>0.0279</w:t>
             </w:r>
           </w:p>
         </w:tc>
@@ -4023,7 +4036,7 @@
                 <w:b/>
                 <w:sz w:val="16"/>
               </w:rPr>
-              <w:t>73.1</w:t>
+              <w:t>73.2</w:t>
             </w:r>
           </w:p>
         </w:tc>
@@ -4097,7 +4110,7 @@
                 <w:b/>
                 <w:sz w:val="16"/>
               </w:rPr>
-              <w:t>0.0494</w:t>
+              <w:t>0.0492</w:t>
             </w:r>
           </w:p>
         </w:tc>
@@ -4121,7 +4134,7 @@
                 <w:b/>
                 <w:sz w:val="16"/>
               </w:rPr>
-              <w:t>0.0716</w:t>
+              <w:t>0.0715</w:t>
             </w:r>
           </w:p>
         </w:tc>
@@ -4145,7 +4158,7 @@
                 <w:b/>
                 <w:sz w:val="16"/>
               </w:rPr>
-              <w:t>0.0481</w:t>
+              <w:t>0.0477</w:t>
             </w:r>
           </w:p>
         </w:tc>
@@ -4169,7 +4182,7 @@
                 <w:b/>
                 <w:sz w:val="16"/>
               </w:rPr>
-              <w:t>0.0248</w:t>
+              <w:t>0.0250</w:t>
             </w:r>
           </w:p>
         </w:tc>
@@ -4193,7 +4206,7 @@
                 <w:b/>
                 <w:sz w:val="16"/>
               </w:rPr>
-              <w:t>67.8</w:t>
+              <w:t>64.2</w:t>
             </w:r>
           </w:p>
         </w:tc>
@@ -4314,7 +4327,7 @@
                 <w:b/>
                 <w:sz w:val="16"/>
               </w:rPr>
-              <w:t>0.0247</w:t>
+              <w:t>0.0243</w:t>
             </w:r>
           </w:p>
         </w:tc>
@@ -4362,7 +4375,7 @@
                 <w:b/>
                 <w:sz w:val="16"/>
               </w:rPr>
-              <w:t>29.7</w:t>
+              <w:t>28.4</w:t>
             </w:r>
           </w:p>
         </w:tc>
@@ -4432,7 +4445,7 @@
               <w:rPr>
                 <w:sz w:val="16"/>
               </w:rPr>
-              <w:t>0.0258</w:t>
+              <w:t>0.0259</w:t>
             </w:r>
           </w:p>
         </w:tc>
@@ -4455,7 +4468,7 @@
               <w:rPr>
                 <w:sz w:val="16"/>
               </w:rPr>
-              <w:t>0.0374</w:t>
+              <w:t>0.0375</w:t>
             </w:r>
           </w:p>
         </w:tc>
@@ -4478,7 +4491,7 @@
               <w:rPr>
                 <w:sz w:val="16"/>
               </w:rPr>
-              <w:t>0.0265</w:t>
+              <w:t>0.0266</w:t>
             </w:r>
           </w:p>
         </w:tc>
@@ -4524,7 +4537,7 @@
               <w:rPr>
                 <w:sz w:val="16"/>
               </w:rPr>
-              <w:t>31.2</w:t>
+              <w:t>30.4</w:t>
             </w:r>
           </w:p>
         </w:tc>
@@ -4640,7 +4653,7 @@
               <w:rPr>
                 <w:sz w:val="16"/>
               </w:rPr>
-              <w:t>0.0262</w:t>
+              <w:t>0.0264</w:t>
             </w:r>
           </w:p>
         </w:tc>
@@ -4663,7 +4676,7 @@
               <w:rPr>
                 <w:sz w:val="16"/>
               </w:rPr>
-              <w:t>0.0106</w:t>
+              <w:t>0.0112</w:t>
             </w:r>
           </w:p>
         </w:tc>
@@ -4686,7 +4699,7 @@
               <w:rPr>
                 <w:sz w:val="16"/>
               </w:rPr>
-              <w:t>30.0</w:t>
+              <w:t>30.1</w:t>
             </w:r>
           </w:p>
         </w:tc>
@@ -4802,7 +4815,7 @@
               <w:rPr>
                 <w:sz w:val="16"/>
               </w:rPr>
-              <w:t>0.0308</w:t>
+              <w:t>0.0305</w:t>
             </w:r>
           </w:p>
         </w:tc>
@@ -4825,7 +4838,7 @@
               <w:rPr>
                 <w:sz w:val="16"/>
               </w:rPr>
-              <w:t>0.0124</w:t>
+              <w:t>0.0117</w:t>
             </w:r>
           </w:p>
         </w:tc>
@@ -4848,7 +4861,7 @@
               <w:rPr>
                 <w:sz w:val="16"/>
               </w:rPr>
-              <w:t>35.6</w:t>
+              <w:t>35.5</w:t>
             </w:r>
           </w:p>
         </w:tc>
@@ -4964,7 +4977,7 @@
               <w:rPr>
                 <w:sz w:val="16"/>
               </w:rPr>
-              <w:t>0.0318</w:t>
+              <w:t>0.0316</w:t>
             </w:r>
           </w:p>
         </w:tc>
@@ -4987,7 +5000,7 @@
               <w:rPr>
                 <w:sz w:val="16"/>
               </w:rPr>
-              <w:t>0.0122</w:t>
+              <w:t>0.0118</w:t>
             </w:r>
           </w:p>
         </w:tc>
@@ -5080,7 +5093,7 @@
               <w:rPr>
                 <w:sz w:val="16"/>
               </w:rPr>
-              <w:t>0.1079</w:t>
+              <w:t>0.1078</w:t>
             </w:r>
           </w:p>
         </w:tc>
@@ -5103,7 +5116,7 @@
               <w:rPr>
                 <w:sz w:val="16"/>
               </w:rPr>
-              <w:t>0.1418</w:t>
+              <w:t>0.1416</w:t>
             </w:r>
           </w:p>
         </w:tc>
@@ -5126,7 +5139,7 @@
               <w:rPr>
                 <w:sz w:val="16"/>
               </w:rPr>
-              <w:t>0.1105</w:t>
+              <w:t>0.1106</w:t>
             </w:r>
           </w:p>
         </w:tc>
@@ -5149,7 +5162,7 @@
               <w:rPr>
                 <w:sz w:val="16"/>
               </w:rPr>
-              <w:t>0.0549</w:t>
+              <w:t>0.0552</w:t>
             </w:r>
           </w:p>
         </w:tc>
@@ -5172,7 +5185,7 @@
               <w:rPr>
                 <w:sz w:val="16"/>
               </w:rPr>
-              <w:t>137.5</w:t>
+              <w:t>137.1</w:t>
             </w:r>
           </w:p>
         </w:tc>
@@ -5245,7 +5258,7 @@
                 <w:b/>
                 <w:sz w:val="16"/>
               </w:rPr>
-              <w:t>0.0717</w:t>
+              <w:t>0.0732</w:t>
             </w:r>
           </w:p>
         </w:tc>
@@ -5269,7 +5282,7 @@
                 <w:b/>
                 <w:sz w:val="16"/>
               </w:rPr>
-              <w:t>0.0943</w:t>
+              <w:t>0.0962</w:t>
             </w:r>
           </w:p>
         </w:tc>
@@ -5293,7 +5306,7 @@
                 <w:b/>
                 <w:sz w:val="16"/>
               </w:rPr>
-              <w:t>0.0747</w:t>
+              <w:t>0.0750</w:t>
             </w:r>
           </w:p>
         </w:tc>
@@ -5317,7 +5330,7 @@
                 <w:b/>
                 <w:sz w:val="16"/>
               </w:rPr>
-              <w:t>0.0277</w:t>
+              <w:t>0.0263</w:t>
             </w:r>
           </w:p>
         </w:tc>
@@ -5341,7 +5354,7 @@
                 <w:b/>
                 <w:sz w:val="16"/>
               </w:rPr>
-              <w:t>90.0</w:t>
+              <w:t>92.3</w:t>
             </w:r>
           </w:p>
         </w:tc>
@@ -7143,7 +7156,7 @@
           <w:rFonts w:ascii="Times New Roman" w:hAnsi="Times New Roman"/>
           <w:sz w:val="22"/>
         </w:rPr>
-        <w:t>Consequently, if a parking operator possesses private edge compute and is not required to coordinate with outside operators, the optimal engineering decision is to deploy a local linear autoregressive model. It achieves superior accuracy (14.5 bays mean error), incurs zero communication overhead, requires no GPU hardware, and guarantees absolute data confidentiality.</w:t>
+        <w:t>Consequently, if a parking operator possesses private edge compute and is not required to coordinate with outside operators, the optimal engineering decision is to deploy a local linear autoregressive model. It achieves superior accuracy (14.5 bays mean error), incurs zero communication overhead, requires no GPU hardware, and maintains complete local data containment without cross-facility communication.</w:t>
       </w:r>
     </w:p>
     <w:p>
@@ -7633,7 +7646,7 @@
               <w:rPr>
                 <w:sz w:val="17"/>
               </w:rPr>
-              <w:t>14,340 Adam steps (pooled)</w:t>
+              <w:t>14,370 Adam steps (pooled)</w:t>
             </w:r>
           </w:p>
         </w:tc>
@@ -7858,7 +7871,7 @@
           <w:rFonts w:ascii="Times New Roman" w:hAnsi="Times New Roman"/>
           <w:sz w:val="22"/>
         </w:rPr>
-        <w:t>Our findings demonstrate that a 4-weight local linear autoregressive model per facility achieves superior accuracy (30-minute MAE: 0.0126; 14.5 bays), outperforming both centralized deep neural networks (0.0217; 27.0 bays) and federated models while requiring zero communication and preserving absolute data privacy. Under practical communication constraints (8 rounds, 2 local epochs), global FedAvg under-trains severely, achieving a 30-minute MAE of 0.0935 ± 0.0032 (118.5 macro bays in multi-seed evaluation, and 0.1007 / 127.1 bays in the primary single-seed benchmark). This degradation is primarily driven by compute starvation (~256 local Adam updates per client versus ~14,340 centralized steps) rather than non-IID collapse: an IID-shuffled federated control demonstrates that compute deficits account for 64.2% of the gap, while client heterogeneity contributes 35.8%. Post-aggregation personalization fine-tuning mitigates this gap, reducing error to 0.0592 ± 0.0004 (82.4 macro bays; a 36.7% relative reduction over FedAvg, recovering 47.8% of the centralized gap in multi-seed evaluations and 50.6% in the primary single-seed benchmark), while compressing between-lot variance by 51.2%. Furthermore, network audits confirm that federating neural networks moves 110.35 MB (105.24 MiB) of weights across 8 rounds versus only 1.48 MB (1.41 MiB) for streaming the raw sensor telemetry—a 74.6-fold communication overhead. Consequently, federated parking forecasting cannot be justified on bandwidth-reduction grounds, but provides substantial value for multi-stakeholder commercial confidentiality, institutional data sovereignty, and legal compliance when paired with local personalization.</w:t>
+        <w:t>Our findings demonstrate that a 4-weight local linear autoregressive model per facility achieves superior accuracy (30-minute MAE: 0.0126; 14.5 bays), outperforming both centralized deep neural networks (0.0217; 27.0 bays) and federated models while requiring zero communication and preserving absolute data privacy. Under practical communication constraints (8 rounds, 2 local epochs), global FedAvg under-trains severely, achieving a 30-minute MAE of 0.0935 ± 0.0032 (118.5 macro bays in multi-seed evaluation, and 0.1007 / 127.1 bays in the primary single-seed benchmark). This degradation is primarily driven by compute starvation (~256 local Adam updates per client versus 14,370 centralized steps) rather than non-IID collapse: an IID-shuffled federated control demonstrates that compute deficits account for 64.2% of the gap, while client heterogeneity contributes 35.8%. Post-aggregation personalization fine-tuning mitigates this gap, reducing error to 0.0592 ± 0.0004 (82.4 macro bays; a 36.7% relative reduction over FedAvg, recovering 47.8% of the centralized gap in multi-seed evaluations and 50.6% in the primary single-seed benchmark), while compressing between-lot variance by 51.2%. Furthermore, network audits confirm that federating neural networks moves 110.35 MB (105.24 MiB) of weights across 8 rounds versus only 1.48 MB (1.41 MiB) for streaming the raw sensor telemetry—a 74.6-fold communication overhead. Consequently, federated parking forecasting cannot be justified on bandwidth-reduction grounds, but provides substantial value for multi-stakeholder commercial confidentiality, institutional data sovereignty, and legal compliance when paired with local personalization.</w:t>
       </w:r>
     </w:p>
     <w:p>

</xml_diff>

<commit_message>
Calibrate data leakage and compute starvation claims, add splitting verification unit test
</commit_message>
<xml_diff>
--- a/Journal_Manuscript_Final_Submission.docx
+++ b/Journal_Manuscript_Final_Submission.docx
@@ -102,7 +102,7 @@
           <w:rFonts w:ascii="Times New Roman" w:hAnsi="Times New Roman"/>
           <w:sz w:val="22"/>
         </w:rPr>
-        <w:t>Federated learning (FL) is widely proposed as a privacy-preserving paradigm for multi-lot smart parking forecasting, enabling commercial operators to collaboratively train predictive models without centralizing proprietary occupancy logs. However, claims of federated performance gains frequently omit simple local baselines and misdiagnose the root causes of decentralized model performance. In this study, we conduct an exhaustive empirical benchmark on the Birmingham municipal smart parking IoT dataset (30 facilities, 35,717 raw readings, 21,868 temporal sequences) to rigorously evaluate when federation adds value over centralized, local-only, and heuristic alternatives. Our benchmark reveals that a zero-parameter persistence baseline achieves a 30-minute Mean Absolute Error (MAE) of 0.0257 (35.2 physical bays), while a 4-weight local-only linear autoregressive model per facility—requiring zero communication and zero cross-facility data sharing—achieves an MAE of 0.0126 (14.5 bays), outperforming both centralized deep recurrent models (Attention-LSTM MAE: 0.0217; 27.0 bays) and federated neural architectures. Under standard communication constraints (8 rounds, 2 local epochs), global Federated Averaging (FedAvg) exhibits severe under-training (MAE: 0.0935 ± 0.0032; 118.5 macro bays). Through an IID-shuffled federated control experiment (MAE: 0.0678 ± 0.0019), we demonstrate that compute starvation under communication round limits (~256 local Adam steps per client versus 14,370 for centralized models) accounts for 64.2% of this performance gap, while non-IID statistical heterogeneity accounts for 35.8%. While proximal regularization (FedProx, MAE: 0.1305) slows convergence and split-head architectures (FedPer, MAE: 0.0775) provide partial gains, localized post-aggregation fine-tuning (Personalized FedAvg) achieves the strongest federated performance with an MAE of 0.0592 ± 0.0004 (82.4 macro bays), representing a 36.7% relative error reduction over global FedAvg, recovering 47.8% of the centralized performance gap, and compressing cross-facility variance (sigma drops by 51.2% from 0.0498 to 0.0243). In a fixed single-seed primary benchmark run (Seed 42), error falls from 0.1007 to 0.0607, recovering 50.6% of the gap. Crucially, network audits confirm that federating a 57k-parameter neural network across 30 clients moves 110.35 MB (105.24 MiB) of weights versus only 1.48 MB (1.41 MiB) for transmitting the entire raw dataset—a 74.6-fold communication overhead. Consequently, we conclude that federation cannot be justified on bandwidth-reduction grounds, but provides substantial value for multi-stakeholder commercial confidentiality and institutional data sovereignty when paired with local personalization.</w:t>
+        <w:t>Federated learning (FL) is widely proposed as a privacy-preserving paradigm for multi-lot smart parking forecasting, enabling commercial operators to collaboratively train predictive models without centralizing proprietary occupancy logs. However, claims of federated performance gains frequently omit simple local baselines and misdiagnose the root causes of decentralized model performance. In this study, we conduct an exhaustive empirical benchmark on the Birmingham municipal smart parking IoT dataset (30 facilities, 35,717 raw readings, 21,868 temporal sequences) to rigorously evaluate when federation adds value over centralized, local-only, and heuristic alternatives. Our benchmark reveals that a zero-parameter persistence baseline achieves a 30-minute Mean Absolute Error (MAE) of 0.0257 (35.2 physical bays), while a 4-weight local-only linear autoregressive model per facility—requiring zero communication and zero cross-facility data sharing—achieves an MAE of 0.0126 (14.5 bays), outperforming both centralized deep recurrent models (Attention-LSTM MAE: 0.0217; 27.0 bays) and federated neural architectures. Under standard communication constraints (8 rounds, 2 local epochs), global Federated Averaging (FedAvg) exhibits severe under-training (MAE: 0.0935 ± 0.0032; 118.5 macro bays). Through an IID-shuffled federated control experiment (MAE: 0.0678 ± 0.0019), we demonstrate that compute starvation provides an empirical decomposition under our experimental protocol: eliminating statistical heterogeneity accounts for 35.8% of the gap, while the remaining 64.2% residual deficit is strongly consistent with optimization under-training under communication round constraints (~256 local Adam steps per client versus 14,370 for centralized models), though definitive causal proof would require exhaustive compute-parity experiments. While proximal regularization (FedProx, MAE: 0.1305) slows convergence and split-head architectures (FedPer, MAE: 0.0775) provide partial gains, localized post-aggregation fine-tuning (Personalized FedAvg) achieves the strongest federated performance with an MAE of 0.0592 ± 0.0004 (82.4 macro bays), representing a 36.7% relative error reduction over global FedAvg, recovering 47.8% of the centralized performance gap, and compressing cross-facility variance (sigma drops by 51.2% from 0.0498 to 0.0243). In a fixed single-seed primary benchmark run (Seed 42), error falls from 0.1007 to 0.0607, recovering 50.6% of the gap. Crucially, network audits confirm that federating a 57k-parameter neural network across 30 clients moves 110.35 MB (105.24 MiB) of weights versus only 1.48 MB (1.41 MiB) for transmitting the entire raw dataset—a 74.6-fold communication overhead. Consequently, we conclude that federation cannot be justified on bandwidth-reduction grounds, but provides substantial value for multi-stakeholder commercial confidentiality and institutional data sovereignty when paired with local personalization.</w:t>
       </w:r>
     </w:p>
     <w:p>
@@ -1947,7 +1947,7 @@
           <w:rFonts w:ascii="Times New Roman" w:hAnsi="Times New Roman"/>
           <w:sz w:val="22"/>
         </w:rPr>
-        <w:t>A critical methodological concern in time series forecasting is the potential for predictive lookahead leakage. In our preprocessing pipeline, three strict architectural safeguards prevent future information from contaminating model inputs or evaluation partitions:</w:t>
+        <w:t>A critical methodological consideration in IoT time series forecasting is evaluating the potential for predictive lookahead leakage. In our preprocessing pipeline, we institute three structural boundaries to control and mitigate temporal information contamination:</w:t>
       </w:r>
     </w:p>
     <w:p>
@@ -1962,7 +1962,7 @@
         <w:t xml:space="preserve">1. Intra-Session Day Bounding: </w:t>
       </w:r>
       <w:r>
-        <w:t>Linear time interpolation for missing daytime readings is executed strictly within each single calendar day between 08:00 and 16:30 using valid sensor readings on both sides of a gap. Interpolation is never performed across overnight closures (16:30 to 08:00). Overnight gaps are treated as absolute sequence boundaries, guaranteeing that evening observations never influence morning forecasts. We recognize that while bilateral interpolation within operating days regularizes irregular polling into uniform 30-minute intervals, it utilizes subsequent within-day readings when filling an intra-day gap.</w:t>
+        <w:t>Linear time interpolation for missing daytime readings is executed strictly within each single calendar day between 08:00 and 16:30 using valid sensor readings on both sides of a gap. Interpolation is never performed across overnight closures (16:30 to 08:00). Overnight gaps are treated as absolute sequence boundaries, guaranteeing that evening observations never influence morning forecasts. However, an inherent limitation of bilateral interpolation is that it uses subsequent observations within the same calendar day to impute earlier missing slots; hence, within sparse daytime sessions, imputed features at step t theoretically incorporate within-day future readings that would not have been available in real-time streaming operations.</w:t>
       </w:r>
     </w:p>
     <w:p>
@@ -1977,7 +1977,7 @@
         <w:t xml:space="preserve">2. Chronological Timeline Partitioning with Embargo Purge Gaps: </w:t>
       </w:r>
       <w:r>
-        <w:t>Sequence window partitioning is executed strictly chronologically along each facility's active operational timeline, separated by a 1-window embargo gap at partition boundaries. Training sequences strictly precede validation sequences, which strictly precede test sequences. Because boundary transition windows are purged, forecast targets never overlap across partitions, and no test-period observation can influence train or validation parameters.</w:t>
+        <w:t>To strictly isolate evaluation partitions, the 70% train, 15% validation, and 15% test split is executed chronologically along each facility's active operational timeline at the sequence-window level, separated by an embargo/purge gap (g = 1 sequence window) at each boundary. This ensures that the forecast targets of training windows (up to y_60 at t+7) never overlap with validation targets, and validation targets never overlap with test targets. Because training sequences strictly precede validation sequences, which strictly precede test sequences, no test-period data can influence model training or hyperparameter selection.</w:t>
       </w:r>
     </w:p>
     <w:p>
@@ -1992,7 +1992,7 @@
         <w:t xml:space="preserve">3. Causal Sequence Directionality: </w:t>
       </w:r>
       <w:r>
-        <w:t>Within each sliding sequence window (x_{t-5}, ..., x_t), input features reflect strictly past observations up to current time t, while forecast targets y_{t+1} (30-min ahead) and y_{t+2} (60-min ahead) reside strictly in future time steps.</w:t>
+        <w:t>Within each sliding sequence window (x_{t-5}, ..., x_t), input features reflect strictly past observations up to current time t, while forecast targets y_{t+1} (30-min ahead) and y_{t+2} (60-min ahead) reside strictly at future time steps.</w:t>
       </w:r>
     </w:p>
     <w:p>
@@ -2005,7 +2005,7 @@
           <w:rFonts w:ascii="Times New Roman" w:hAnsi="Times New Roman"/>
           <w:sz w:val="22"/>
         </w:rPr>
-        <w:t>To empirically evaluate whether daytime interpolation distorts forecasting accuracy or biases model rankings, we audited all 3,263 purged test sequence windows across the 30 facilities. This forensic audit revealed that 2,781 test windows (85.2%) are completely uninterpolated—every single one of the 8 constituent time steps corresponds to an authentic, un-imputed physical sensor transmission. Only 482 windows (14.8%) contain one or more interpolated daytime slots. We conducted a rigorous sensitivity analysis evaluating model accuracy on the pure uninterpolated test subset versus the complete 3,263-window test set. Centralized Attention-LSTM achieved an MAE of 0.02196 (rounded to 0.0220) on the pure raw subset versus 0.02170 (rounded to 0.0217) on the full test set—an unrounded difference of +0.00026, or ~0.3 bays. Global FedAvg achieved an MAE of 0.1022 (0.102) on the pure raw subset versus 0.1006 (0.101) on the full test set (+0.0016 difference), while Personalized FedAvg achieved 0.0636 versus 0.0607, a difference of +0.0029. Similarly, Local Linear AR(4) achieved 0.0128 versus 0.0126. Crucially, model rankings, relative margins, and the overwhelming superiority of local linear baselines remain completely unchanged between the raw subsample and the complete test set. We therefore conclude that while linear time-interpolation within operating hours is an operational heuristic for missing daytime readings, the reported benchmark results, algorithmic rankings, and baseline hierarchies are robust and not artifacts of daytime interpolation.</w:t>
+        <w:t>To evaluate the practical empirical impact of intra-day interpolation on model performance, we audited all 3,263 purged test sequence windows across the 30 facilities. This forensic audit revealed that 2,781 test windows (85.2%) are completely uninterpolated—every single one of the 8 constituent time steps corresponds to an authentic, un-imputed physical sensor transmission. Only 482 windows (14.8%) contain one or more interpolated daytime slots. We conducted a sensitivity analysis evaluating model accuracy on the pure uninterpolated test subset versus the complete 3,263-window test set. Centralized Attention-LSTM achieved an MAE of 0.02196 (rounded to 0.0220) on the pure raw subset versus 0.02170 (rounded to 0.0217) on the full test set—an unrounded difference of +0.00026, or ~0.3 bays. Global FedAvg achieved an MAE of 0.1022 (0.102) on the pure raw subset versus 0.1006 (0.101) on the full test set (+0.0016 difference), while Personalized FedAvg achieved 0.0636 versus 0.0607, a difference of +0.0029. Similarly, Local Linear AR(4) achieved 0.0128 versus 0.0126. Crucially, model rankings, relative margins, and the overwhelming superiority of local linear baselines remain completely unchanged between the raw subsample and the complete test set. We emphasize that this empirical sensitivity analysis does not prove the complete absence of lookahead bias across imputed time steps. Rather, it provides strong empirical evidence that our core benchmark findings—namely, the superiority of local linear models, the under-training of FedAvg, and the relative recovery achieved via personalization—are robust, stable, and not artifacts of daytime linear interpolation.</w:t>
       </w:r>
     </w:p>
     <w:p>
@@ -2455,7 +2455,7 @@
           <w:rFonts w:ascii="Times New Roman" w:hAnsi="Times New Roman"/>
           <w:sz w:val="22"/>
         </w:rPr>
-        <w:t>Thus, each federated client executes barely 1.78% of the gradient updates performed by the centralized model. While the IID-shuffled control experiment demonstrates that non-IID statistical heterogeneity accounts for 35.8% of the initial gap between FedAvg and centralized models, the remaining 64.2% residual deficit is strongly consistent with optimization under-training under communication round constraints. Because FedAvg test error continues to improve gradually when communication rounds are extended from R = 8 to R = 16 (falling from 0.1007 to 0.0978), strict round limits impose substantial optimization friction on decentralized convergence.</w:t>
+        <w:t>Thus, each federated client executes barely 1.78% of the gradient updates performed by the centralized model. While the IID-shuffled control experiment demonstrates that non-IID statistical heterogeneity accounts for 35.8% of the initial gap between FedAvg and centralized models, the remaining 64.2% residual deficit is strongly consistent with optimization under-training under communication round constraints. We emphasize that this 64.2% figure represents an experimental decomposition under our benchmarking assumptions rather than a definitive causal proof; establishing conclusive causality would require extended round scaling up to strict gradient-step parity with centralized models. Because FedAvg test error continues to improve gradually when communication rounds are extended from R = 8 to R = 16 (falling from 0.1006 to 0.0978), strict round limits impose substantial optimization friction on decentralized convergence.</w:t>
       </w:r>
     </w:p>
     <w:p>
@@ -6247,7 +6247,7 @@
         <w:t xml:space="preserve">1. Quantitative Separation of Heterogeneity vs. Under-Training: </w:t>
       </w:r>
       <w:r>
-        <w:t>Under the IID-shuffled control, where statistical heterogeneity between clients is strictly eliminated, FedAvg achieves a pooled MAE of 0.0678 ± 0.0019. Comparing the non-IID FedAvg error (0.0935) and the centralized Attention-LSTM benchmark (0.0217), the total performance gap is 0.0718. Shuffling data IID reduces the gap by 0.0257 (35.8%), leaving a residual gap of 0.0461 (64.2%). This proves that compute starvation under communication round budgets is responsible for the majority of the performance gap, while non-IID drift contributes the remaining 35.8%.</w:t>
+        <w:t>Under the IID-shuffled control, where statistical heterogeneity between clients is strictly eliminated, FedAvg achieves a pooled MAE of 0.0678 ± 0.0019. Comparing the non-IID FedAvg error (0.0935) and the centralized Attention-LSTM benchmark (0.0217), the total performance gap is 0.0718. Shuffling data IID reduces the gap by 0.0257 (35.8%), leaving a residual gap of 0.0461 (64.2%). Under our experimental decomposition, this residual deficit is strongly consistent with optimization under-training under communication round constraints, while non-IID client drift accounts for the remaining 35.8%, though definitive causal attribution would require full compute-parity training across extended communication rounds.</w:t>
       </w:r>
     </w:p>
     <w:p>
@@ -7197,7 +7197,7 @@
           <w:rFonts w:ascii="Times New Roman" w:hAnsi="Times New Roman"/>
           <w:sz w:val="22"/>
         </w:rPr>
-        <w:t>Instead, the primary culprit is compute starvation under communication constraints. Federated clients in an 8-round protocol execute barely ~200 local gradient steps, compared to over 14,000 steps executed by the centralized model. Our IID-shuffled control experiment (Table 3) rigorously quantifies this division: compute starvation accounts for 64.2% of the performance deficit, while non-IID statistical heterogeneity accounts for 35.8%. Local personalization acts as a high-leverage compensation mechanism: by fine-tuning the under-converged global recurrent features on lot-specific data, the model rapidly aligns its output scale to local capacity, recovering 50.6% of the centralized gap.</w:t>
+        <w:t>Instead, the primary culprit is compute starvation under communication constraints. Federated clients in an 8-round protocol execute barely ~200 local gradient steps, compared to over 14,000 steps executed by the centralized model. Our IID-shuffled control experiment (Table 3) provides an empirical decomposition of this division under our benchmarking protocol: statistical heterogeneity accounts for 35.8% of the performance deficit, while the remaining 64.2% is an empirical residual deficit strongly consistent with compute constraints and optimization under-training. Local personalization acts as a high-leverage compensation mechanism: by fine-tuning the under-converged global recurrent features on lot-specific data, the model rapidly aligns its output scale to local capacity, recovering 50.6% of the centralized gap.</w:t>
       </w:r>
     </w:p>
     <w:p>
@@ -7871,7 +7871,7 @@
           <w:rFonts w:ascii="Times New Roman" w:hAnsi="Times New Roman"/>
           <w:sz w:val="22"/>
         </w:rPr>
-        <w:t>Our findings demonstrate that a 4-weight local linear autoregressive model per facility achieves superior accuracy (30-minute MAE: 0.0126; 14.5 bays), outperforming both centralized deep neural networks (0.0217; 27.0 bays) and federated models while requiring zero communication and preserving absolute data privacy. Under practical communication constraints (8 rounds, 2 local epochs), global FedAvg under-trains severely, achieving a 30-minute MAE of 0.0935 ± 0.0032 (118.5 macro bays in multi-seed evaluation, and 0.1007 / 127.1 bays in the primary single-seed benchmark). This degradation is primarily driven by compute starvation (~256 local Adam updates per client versus 14,370 centralized steps) rather than non-IID collapse: an IID-shuffled federated control demonstrates that compute deficits account for 64.2% of the gap, while client heterogeneity contributes 35.8%. Post-aggregation personalization fine-tuning mitigates this gap, reducing error to 0.0592 ± 0.0004 (82.4 macro bays; a 36.7% relative reduction over FedAvg, recovering 47.8% of the centralized gap in multi-seed evaluations and 50.6% in the primary single-seed benchmark), while compressing between-lot variance by 51.2%. Furthermore, network audits confirm that federating neural networks moves 110.35 MB (105.24 MiB) of weights across 8 rounds versus only 1.48 MB (1.41 MiB) for streaming the raw sensor telemetry—a 74.6-fold communication overhead. Consequently, federated parking forecasting cannot be justified on bandwidth-reduction grounds, but provides substantial value for multi-stakeholder commercial confidentiality, institutional data sovereignty, and legal compliance when paired with local personalization.</w:t>
+        <w:t>Our findings demonstrate that a 4-weight local linear autoregressive model per facility achieves superior accuracy (30-minute MAE: 0.0126; 14.5 bays), outperforming both centralized deep neural networks (0.0217; 27.0 bays) and federated models while requiring zero communication and preserving absolute data privacy. Under practical communication constraints (8 rounds, 2 local epochs), global FedAvg under-trains severely, achieving a 30-minute MAE of 0.0935 ± 0.0032 (118.5 macro bays in multi-seed evaluation, and 0.1007 / 127.1 bays in the primary single-seed benchmark). This degradation is primarily driven by compute starvation (~256 local Adam updates per client versus 14,370 centralized steps) rather than non-IID collapse: an IID-shuffled federated control provides an empirical decomposition attributing 35.8% of the performance gap to statistical heterogeneity, with the remaining 64.2% residual deficit being strongly consistent with compute constraints (~256 local Adam updates per client versus 14,370 centralized steps) rather than non-IID collapse. Post-aggregation personalization fine-tuning mitigates this gap, reducing error to 0.0592 ± 0.0004 (82.4 macro bays; a 36.7% relative reduction over FedAvg, recovering 47.8% of the centralized gap in multi-seed evaluations and 50.6% in the primary single-seed benchmark), while compressing between-lot variance by 51.2%. Furthermore, network audits confirm that federating neural networks moves 110.35 MB (105.24 MiB) of weights across 8 rounds versus only 1.48 MB (1.41 MiB) for streaming the raw sensor telemetry—a 74.6-fold communication overhead. Consequently, federated parking forecasting cannot be justified on bandwidth-reduction grounds, but provides substantial value for multi-stakeholder commercial confidentiality, institutional data sovereignty, and legal compliance when paired with local personalization.</w:t>
       </w:r>
     </w:p>
     <w:p>

</xml_diff>

<commit_message>
Reconcile numerical metrics with Table 2, clarify indexing convention, and calibrate governance claims
</commit_message>
<xml_diff>
--- a/Journal_Manuscript_Final_Submission.docx
+++ b/Journal_Manuscript_Final_Submission.docx
@@ -102,7 +102,7 @@
           <w:rFonts w:ascii="Times New Roman" w:hAnsi="Times New Roman"/>
           <w:sz w:val="22"/>
         </w:rPr>
-        <w:t>Federated learning (FL) is widely proposed as a privacy-preserving paradigm for multi-lot smart parking forecasting, enabling commercial operators to collaboratively train predictive models without centralizing proprietary occupancy logs. However, claims of federated performance gains frequently omit simple local baselines and misdiagnose the root causes of decentralized model performance. In this study, we conduct an exhaustive empirical benchmark on the Birmingham municipal smart parking IoT dataset (30 facilities, 35,717 raw readings, 21,868 temporal sequences) to rigorously evaluate when federation adds value over centralized, local-only, and heuristic alternatives. Our benchmark reveals that a zero-parameter persistence baseline achieves a 30-minute Mean Absolute Error (MAE) of 0.0257 (35.2 physical bays), while a 4-weight local-only linear autoregressive model per facility—requiring zero communication and zero cross-facility data sharing—achieves an MAE of 0.0126 (14.5 bays), outperforming both centralized deep recurrent models (Attention-LSTM MAE: 0.0217; 27.0 bays) and federated neural architectures. Under standard communication constraints (8 rounds, 2 local epochs), global Federated Averaging (FedAvg) exhibits severe under-training (MAE: 0.0935 ± 0.0032; 118.5 macro bays). Through an IID-shuffled federated control experiment (MAE: 0.0678 ± 0.0019), we demonstrate that compute starvation provides an empirical decomposition under our experimental protocol: eliminating statistical heterogeneity accounts for 35.8% of the gap, while the remaining 64.2% residual deficit is strongly consistent with optimization under-training under communication round constraints (~256 local Adam steps per client versus 14,370 for centralized models), though definitive causal proof would require exhaustive compute-parity experiments. While proximal regularization (FedProx, MAE: 0.1305) slows convergence and split-head architectures (FedPer, MAE: 0.0775) provide partial gains, localized post-aggregation fine-tuning (Personalized FedAvg) achieves the strongest federated performance with an MAE of 0.0592 ± 0.0004 (82.4 macro bays), representing a 36.7% relative error reduction over global FedAvg, recovering 47.8% of the centralized performance gap, and compressing cross-facility variance (sigma drops by 51.2% from 0.0498 to 0.0243). In a fixed single-seed primary benchmark run (Seed 42), error falls from 0.1007 to 0.0607, recovering 50.6% of the gap. Crucially, network audits confirm that federating a 57k-parameter neural network across 30 clients moves 110.35 MB (105.24 MiB) of weights versus only 1.48 MB (1.41 MiB) for transmitting the entire raw dataset—a 74.6-fold communication overhead. Consequently, we conclude that federation cannot be justified on bandwidth-reduction grounds, but provides substantial value for multi-stakeholder commercial confidentiality and institutional data sovereignty when paired with local personalization.</w:t>
+        <w:t>Federated learning (FL) is widely proposed as a privacy-preserving paradigm for multi-lot smart parking forecasting, enabling commercial operators to collaboratively train predictive models without centralizing proprietary occupancy logs. However, claims of federated performance gains frequently omit simple local baselines and misdiagnose the root causes of decentralized model performance. In this study, we conduct an exhaustive empirical benchmark on the Birmingham municipal smart parking IoT dataset (30 facilities, 35,717 raw readings, 21,868 temporal sequences) to rigorously evaluate when federation adds value over centralized, local-only, and heuristic alternatives. Our benchmark reveals that a zero-parameter persistence baseline achieves a 30-minute Mean Absolute Error (MAE) of 0.0256 (33.4 physical bays), while a 4-weight local-only linear autoregressive model per facility—requiring zero communication and zero cross-facility data sharing—achieves an MAE of 0.0126 (13.9 bays), outperforming both centralized deep recurrent models (Attention-LSTM MAE: 0.0217; 26.9 bays) and federated neural architectures. Under standard communication constraints (8 rounds, 2 local epochs), global Federated Averaging (FedAvg) exhibits severe under-training (MAE: 0.0935 ± 0.0032; 118.5 macro bays). Through an IID-shuffled federated control experiment (MAE: 0.0678 ± 0.0019), we demonstrate that compute starvation provides an empirical decomposition under our experimental protocol: eliminating statistical heterogeneity accounts for 35.8% of the gap, while the remaining 64.2% residual deficit is strongly consistent with optimization under-training under communication round constraints (~256 local Adam steps per client versus 14,370 for centralized models), though definitive causal proof would require exhaustive compute-parity experiments. While proximal regularization (FedProx, MAE: 0.1305) slows convergence and split-head architectures (FedPer, MAE: 0.0775) provide partial gains, localized post-aggregation fine-tuning (Personalized FedAvg) achieves the strongest federated performance with an MAE of 0.0592 ± 0.0004 (82.4 macro bays), representing a 36.7% relative error reduction over global FedAvg, recovering 47.8% of the centralized performance gap, and compressing cross-facility variance (sigma drops by 51.2% from 0.0498 to 0.0243). In a fixed single-seed primary benchmark run (Seed 42), error falls from 0.1006 (126.8 bays) to 0.0607 (73.2 bays), recovering 50.6% of the gap. Crucially, network audits confirm that federating a 57k-parameter neural network across 30 clients moves 110.35 MB (105.24 MiB) of weights versus only 1.48 MB (1.41 MiB) for transmitting the entire raw dataset—a 74.6-fold communication overhead. Consequently, we conclude that federation cannot be justified on bandwidth-reduction grounds, but provides substantial value for multi-stakeholder commercial confidentiality and institutional data sovereignty when paired with local personalization.</w:t>
       </w:r>
     </w:p>
     <w:p>
@@ -276,7 +276,7 @@
         <w:t xml:space="preserve">2. Uncovering the Dominance of Local Linear Baselines: </w:t>
       </w:r>
       <w:r>
-        <w:t>We demonstrate that a 4-parameter local-only linear AR model per facility achieves a 30-minute MAE of 0.0126 (14.5 bays), outperforming both centralized Attention-LSTM (0.0217; 27.0 bays) and federated models while requiring zero communication and providing complete data privacy.</w:t>
+        <w:t>We demonstrate that a 4-parameter local-only linear AR model per facility achieves a 30-minute MAE of 0.0126 (13.9 bays), outperforming both centralized Attention-LSTM (0.0217; 26.9 bays) and federated models while requiring zero communication, eliminating cross-facility data sharing, and preserving local data autonomy.</w:t>
       </w:r>
     </w:p>
     <w:p>
@@ -1870,7 +1870,7 @@
           <w:rFonts w:ascii="Times New Roman" w:hAnsi="Times New Roman"/>
           <w:sz w:val="22"/>
         </w:rPr>
-        <w:t>Crucially, to prevent target overlap across evaluation partitions, an embargo / purge gap of one sequence window (g = 1) was enforced at the train/validation and validation/test boundaries per facility along each facility's active operational timeline. For each facility i generating N_i sliding windows, training spans indices [0, floor(0.70 N_i)), followed by an embargo gap omitting window floor(0.70 N_i); validation spans [floor(0.70 N_i) + 1, floor(0.85 N_i)), followed by a second embargo gap omitting window floor(0.85 N_i); and testing spans [floor(0.85 N_i) + 1, N_i). This purge gap ensures that the latest forecast target of any partition (y_60 at offset +7) never equals or overlaps with the earliest target of the subsequent partition (y_30 at offset +7 of the subsequent window). Across all 30 clients, this produces exactly 15,299 training windows (70.15%), 3,246 validation windows (14.88%), and 3,263 unified test windows (14.96%), with exactly 60 boundary transition windows purged across the 21,868 total sliding sequences. The resulting test set exhibits a sample-weighted mean capacity of 1,396.8 bays.</w:t>
+        <w:t>Crucially, to prevent target overlap across evaluation partitions, an embargo / purge gap of one sequence window (g = 1) was enforced at the train/validation and validation/test boundaries per facility along each facility's active operational timeline. Formally, for a sequence window starting at time step t_k, the six input observations span [t_k, t_k+5], while the two forecast targets are located at relative indices y_30 = t_k+6 and y_60 = t_k+7. For each facility i generating N_i chronological sliding windows, the training partition spans indices [0, floor(0.70 N_i)), ending with window k = floor(0.70 N_i) - 1 whose final target is at t_k+7. The subsequent boundary transition window at index floor(0.70 N_i) (starting at t_{k+1}) is purged. Consequently, the first window of the subsequent validation partition begins at index floor(0.70 N_i) + 1 (starting at t_{k+2}), so its earliest forecast target y_30 occurs at relative index (t_k+2) + 6 = t_k+8. Because t_k+8 &gt; t_k+7, the latest target of the preceding partition strictly precedes the earliest target of the subsequent partition, mathematically eliminating label overlap between adjacent partitions. An identical purge gap is enforced at the validation/test boundary at index floor(0.85 N_i). Across all 30 clients, this produces exactly 15,299 training windows (70.15%), 3,246 validation windows (14.88%), and 3,263 unified test windows (14.96%), with exactly 60 boundary transition windows purged across the 21,868 total sliding sequences. The resulting test set exhibits a sample-weighted mean capacity of 1,396.8 bays.</w:t>
       </w:r>
     </w:p>
     <w:p>
@@ -2309,7 +2309,7 @@
         <w:t xml:space="preserve">2. Local-Only Linear AR(4) Baseline (Fully Private): </w:t>
       </w:r>
       <w:r>
-        <w:t>Each client independently fits an autoregressive linear ridge regression model on its own past 4 availability observations (a_{t-3}, ..., a_t). Employs strictly local data with zero cross-lot communication, providing 100% privacy and zero infrastructure overhead.</w:t>
+        <w:t>Each client independently fits an autoregressive linear ridge regression model on its own past 4 availability observations (a_{t-3}, ..., a_t). Employs strictly local data with zero cross-lot communication, eliminating cross-facility data sharing, avoiding centralized exposure of raw telemetry, and incurring zero infrastructure overhead.</w:t>
       </w:r>
     </w:p>
     <w:p>
@@ -6292,7 +6292,7 @@
         <w:t xml:space="preserve">4. Physical Space Error Scaling: </w:t>
       </w:r>
       <w:r>
-        <w:t>In the primary single-run benchmark (Table 2), Global FedAvg incurs an unweighted macro space error of 127.1 bays (130.6 sample-weighted micro bays), while Personalized FedAvg reduces this to 73.1 bays (75.0 micro bays), achieving a 42.5% reduction in physical parking allocation error. Across the three-seed evaluation (Table 3), Global FedAvg achieves an unweighted macro space error of 118.5 ± 2.6 bays (121.3 ± 2.8 micro bays), whereas Personalized FedAvg reduces space error to 82.4 ± 0.4 bays (84.0 ± 0.4 micro bays). In stark contrast, the zero-communication Local Linear AR(4) baseline incurs only 14.5 bays of space error, demonstrating that if municipal governance permits local-only processing, private linear models are overwhelmingly superior.</w:t>
+        <w:t>In the primary single-run benchmark (Table 2), Global FedAvg incurs an unweighted macro space error of 126.8 bays (130.6 sample-weighted micro bays), while Personalized FedAvg reduces this to 73.2 bays (75.0 micro bays), achieving a 42.3% reduction in physical parking allocation error. Across the three-seed evaluation (Table 3), Global FedAvg achieves an unweighted macro space error of 118.5 ± 2.6 bays (121.3 ± 2.8 micro bays), whereas Personalized FedAvg reduces space error to 82.4 ± 0.4 bays (84.0 ± 0.4 micro bays). In stark contrast, the zero-communication Local Linear AR(4) baseline incurs only 13.9 bays of unweighted macro space error (17.6 sample-weighted micro bays), demonstrating that if municipal governance permits local-only processing, private linear models are overwhelmingly superior.</w:t>
       </w:r>
     </w:p>
     <w:p>
@@ -7156,7 +7156,7 @@
           <w:rFonts w:ascii="Times New Roman" w:hAnsi="Times New Roman"/>
           <w:sz w:val="22"/>
         </w:rPr>
-        <w:t>Consequently, if a parking operator possesses private edge compute and is not required to coordinate with outside operators, the optimal engineering decision is to deploy a local linear autoregressive model. It achieves superior accuracy (14.5 bays mean error), incurs zero communication overhead, requires no GPU hardware, and maintains complete local data containment without cross-facility communication.</w:t>
+        <w:t>Consequently, if a parking operator possesses private edge compute and is not required to coordinate with outside operators, the optimal engineering decision is to deploy a local linear autoregressive model. It achieves superior accuracy (13.9 bays mean space error), incurs zero communication overhead, requires no GPU hardware, and avoids cross-facility data sharing without requiring external communication.</w:t>
       </w:r>
     </w:p>
     <w:p>
@@ -7184,7 +7184,7 @@
           <w:rFonts w:ascii="Times New Roman" w:hAnsi="Times New Roman"/>
           <w:sz w:val="22"/>
         </w:rPr>
-        <w:t>Prior studies frequently attribute FedAvg's poor performance to catastrophic 'non-IID spatial collapse'. Our empirical findings refute this simplistic explanation. While parking facilities vary in physical capacity and peak hours, the underlying functional relationship—namely, that future occupancy is a smooth autoregressive transformation of recent occupancy—is universal across all facilities. Heterogeneity alone cannot prevent a neural network from learning this common persistence mapping.</w:t>
+        <w:t>Prior studies frequently attribute FedAvg's poor performance to catastrophic 'non-IID spatial collapse'. However, our empirical findings challenge the assumption that non-IID spatial collapse is the sole driver of decentralized performance degradation. While parking facilities vary in physical capacity and peak hours, the underlying functional relationship—namely, that future occupancy is a smooth autoregressive transformation of recent occupancy—is universal across all facilities. Heterogeneity alone cannot prevent a neural network from learning this common persistence mapping.</w:t>
       </w:r>
     </w:p>
     <w:p>
@@ -7197,7 +7197,7 @@
           <w:rFonts w:ascii="Times New Roman" w:hAnsi="Times New Roman"/>
           <w:sz w:val="22"/>
         </w:rPr>
-        <w:t>Instead, the primary culprit is compute starvation under communication constraints. Federated clients in an 8-round protocol execute barely ~200 local gradient steps, compared to over 14,000 steps executed by the centralized model. Our IID-shuffled control experiment (Table 3) provides an empirical decomposition of this division under our benchmarking protocol: statistical heterogeneity accounts for 35.8% of the performance deficit, while the remaining 64.2% is an empirical residual deficit strongly consistent with compute constraints and optimization under-training. Local personalization acts as a high-leverage compensation mechanism: by fine-tuning the under-converged global recurrent features on lot-specific data, the model rapidly aligns its output scale to local capacity, recovering 50.6% of the centralized gap.</w:t>
+        <w:t>Instead, our experimental decomposition indicates that optimization under-training under communication round constraints is a major contributing factor. Federated clients in an 8-round protocol execute barely ~200 local gradient steps, compared to over 14,000 steps executed by the centralized model. Our IID-shuffled control experiment (Table 3) provides an empirical decomposition of this division under our benchmarking protocol: statistical heterogeneity accounts for 35.8% of the performance deficit, while the remaining 64.2% is an empirical residual deficit strongly consistent with compute constraints and optimization under-training. Local personalization acts as a high-leverage compensation mechanism: by fine-tuning the under-converged global recurrent features on lot-specific data, the model rapidly aligns its output scale to local capacity, recovering 50.6% of the centralized gap.</w:t>
       </w:r>
     </w:p>
     <w:p>
@@ -7717,7 +7717,7 @@
               <w:rPr>
                 <w:sz w:val="17"/>
               </w:rPr>
-              <w:t>Privacy &amp; Sovereignty</w:t>
+              <w:t>Privacy &amp; Governance</w:t>
             </w:r>
           </w:p>
         </w:tc>
@@ -7740,7 +7740,7 @@
               <w:rPr>
                 <w:sz w:val="17"/>
               </w:rPr>
-              <w:t>Zero (all data pooled in cloud)</w:t>
+              <w:t>Centralized exposure (all data pooled in cloud)</w:t>
             </w:r>
           </w:p>
         </w:tc>
@@ -7763,7 +7763,7 @@
               <w:rPr>
                 <w:sz w:val="17"/>
               </w:rPr>
-              <w:t>High (data stays on edge nodes)</w:t>
+              <w:t>Decentralized containment (data stays on edge nodes)</w:t>
             </w:r>
           </w:p>
         </w:tc>
@@ -7786,7 +7786,7 @@
               <w:rPr>
                 <w:sz w:val="17"/>
               </w:rPr>
-              <w:t>Absolute (100% private, no federation)</w:t>
+              <w:t>Local isolation (avoids cross-facility data sharing, no federation)</w:t>
             </w:r>
           </w:p>
         </w:tc>
@@ -7871,7 +7871,7 @@
           <w:rFonts w:ascii="Times New Roman" w:hAnsi="Times New Roman"/>
           <w:sz w:val="22"/>
         </w:rPr>
-        <w:t>Our findings demonstrate that a 4-weight local linear autoregressive model per facility achieves superior accuracy (30-minute MAE: 0.0126; 14.5 bays), outperforming both centralized deep neural networks (0.0217; 27.0 bays) and federated models while requiring zero communication and preserving absolute data privacy. Under practical communication constraints (8 rounds, 2 local epochs), global FedAvg under-trains severely, achieving a 30-minute MAE of 0.0935 ± 0.0032 (118.5 macro bays in multi-seed evaluation, and 0.1007 / 127.1 bays in the primary single-seed benchmark). This degradation is primarily driven by compute starvation (~256 local Adam updates per client versus 14,370 centralized steps) rather than non-IID collapse: an IID-shuffled federated control provides an empirical decomposition attributing 35.8% of the performance gap to statistical heterogeneity, with the remaining 64.2% residual deficit being strongly consistent with compute constraints (~256 local Adam updates per client versus 14,370 centralized steps) rather than non-IID collapse. Post-aggregation personalization fine-tuning mitigates this gap, reducing error to 0.0592 ± 0.0004 (82.4 macro bays; a 36.7% relative reduction over FedAvg, recovering 47.8% of the centralized gap in multi-seed evaluations and 50.6% in the primary single-seed benchmark), while compressing between-lot variance by 51.2%. Furthermore, network audits confirm that federating neural networks moves 110.35 MB (105.24 MiB) of weights across 8 rounds versus only 1.48 MB (1.41 MiB) for streaming the raw sensor telemetry—a 74.6-fold communication overhead. Consequently, federated parking forecasting cannot be justified on bandwidth-reduction grounds, but provides substantial value for multi-stakeholder commercial confidentiality, institutional data sovereignty, and legal compliance when paired with local personalization.</w:t>
+        <w:t>Our findings demonstrate that a 4-weight local linear autoregressive model per facility achieves superior accuracy (30-minute MAE: 0.0126; 13.9 bays), outperforming both centralized deep neural networks (0.0217; 26.9 bays) and federated models while requiring zero communication and avoiding cross-facility data sharing. Under practical communication constraints (8 rounds, 2 local epochs), global FedAvg under-trains severely, achieving a 30-minute MAE of 0.0935 ± 0.0032 (118.5 macro bays in multi-seed evaluation, and 0.1006 / 126.8 bays in the primary single-seed benchmark). Our experimental decomposition indicates that this degradation is strongly consistent with optimization under-training under communication round constraints (~256 local Adam updates per client versus 14,370 centralized steps) alongside statistical heterogeneity: an IID-shuffled federated control provides an empirical decomposition attributing 35.8% of the performance gap to statistical heterogeneity, with the remaining 64.2% residual deficit being strongly consistent with compute constraints (~256 local Adam updates per client versus 14,370 centralized steps) rather than non-IID collapse. Post-aggregation personalization fine-tuning mitigates this gap, reducing error to 0.0592 ± 0.0004 (82.4 macro bays; a 36.7% relative reduction over FedAvg, recovering 47.8% of the centralized gap in multi-seed evaluations and 50.6% in the primary single-seed benchmark), while compressing between-lot variance by 51.2%. Furthermore, network audits confirm that federating neural networks moves 110.35 MB (105.24 MiB) of weights across 8 rounds versus only 1.48 MB (1.41 MiB) for streaming the raw sensor telemetry—a 74.6-fold communication overhead. Consequently, federated parking forecasting cannot be justified on bandwidth-reduction grounds, but provides substantial value for multi-stakeholder commercial confidentiality and institutional data governance when paired with local personalization, though regulatory compliance ultimately depends on specific deployment environments, applicable data protection frameworks, and complementary differential privacy safeguards.</w:t>
       </w:r>
     </w:p>
     <w:p>

</xml_diff>

<commit_message>
Calibrate Section 5.3 governance justification, qualify 64.2% residual globally, and align table privacy terms
</commit_message>
<xml_diff>
--- a/Journal_Manuscript_Final_Submission.docx
+++ b/Journal_Manuscript_Final_Submission.docx
@@ -233,7 +233,7 @@
         <w:t xml:space="preserve">3. Bandwidth vs. Governance Justification: </w:t>
       </w:r>
       <w:r>
-        <w:t>Does federating neural networks save communication bandwidth on scalar IoT streams, or must FL be justified strictly on commercial data governance and institutional sovereignty grounds?</w:t>
+        <w:t>Does federating neural networks save communication bandwidth on scalar IoT streams, or should FL be justified primarily by commercial data governance and institutional data sovereignty considerations?</w:t>
       </w:r>
     </w:p>
     <w:p>
@@ -291,7 +291,7 @@
         <w:t xml:space="preserve">3. Disentangling Under-Training from Non-IID Drift: </w:t>
       </w:r>
       <w:r>
-        <w:t>Through compute step audits, round scaling (R in {4, 8, 12, 16}), batch size analysis, and an IID-shuffled federated control (MAE: 0.0678 ± 0.0019), we prove that FedAvg's performance deficit is strongly consistent with optimization under-training (~256 local Adam steps per client versus 14,370 centralized steps) under practical communication budgets rather than insurmountable spatial drift. Personalization fine-tuning resolves this under-training, achieving MAE 0.0592 ± 0.0004 (a 36.7% relative reduction over FedAvg, recovering 47.8% of the centralized gap in multi-seed evaluations and 50.6% in the primary single-seed benchmark).</w:t>
+        <w:t>Through compute step audits, round scaling (R in {4, 8, 12, 16}), batch size analysis, and an IID-shuffled federated control (MAE: 0.0678 ± 0.0019), our experimental decomposition indicates that 35.8% of the performance gap is attributable to statistical heterogeneity, while the remaining 64.2% residual deficit is strongly consistent with optimization under-training under communication round constraints (~256 local Adam steps per client versus 14,370 centralized steps), though definitive causal proof would require exhaustive compute-parity experiments across extended rounds. Personalization fine-tuning resolves this under-training, achieving MAE 0.0592 ± 0.0004 (a 36.7% relative reduction over FedAvg, recovering 47.8% of the centralized gap in multi-seed evaluations and 50.6% in the primary single-seed benchmark).</w:t>
       </w:r>
     </w:p>
     <w:p>
@@ -1645,7 +1645,7 @@
               <w:rPr>
                 <w:sz w:val="17"/>
               </w:rPr>
-              <w:t>Private / Multi-stakeholder</w:t>
+              <w:t>Decentralized containment / Multi-operator governance</w:t>
             </w:r>
           </w:p>
         </w:tc>
@@ -2937,7 +2937,7 @@
                 <w:b/>
                 <w:sz w:val="16"/>
               </w:rPr>
-              <w:t>Local-Only Linear AR(4) (Private)</w:t>
+              <w:t>Local-Only Linear AR(4) (Local isolation)</w:t>
             </w:r>
           </w:p>
         </w:tc>
@@ -4255,7 +4255,7 @@
                 <w:b/>
                 <w:sz w:val="16"/>
               </w:rPr>
-              <w:t>Local-Only Linear AR(4) (Private)</w:t>
+              <w:t>Local-Only Linear AR(4) (Local isolation)</w:t>
             </w:r>
           </w:p>
         </w:tc>
@@ -7197,7 +7197,7 @@
           <w:rFonts w:ascii="Times New Roman" w:hAnsi="Times New Roman"/>
           <w:sz w:val="22"/>
         </w:rPr>
-        <w:t>Instead, our experimental decomposition indicates that optimization under-training under communication round constraints is a major contributing factor. Federated clients in an 8-round protocol execute barely ~200 local gradient steps, compared to over 14,000 steps executed by the centralized model. Our IID-shuffled control experiment (Table 3) provides an empirical decomposition of this division under our benchmarking protocol: statistical heterogeneity accounts for 35.8% of the performance deficit, while the remaining 64.2% is an empirical residual deficit strongly consistent with compute constraints and optimization under-training. Local personalization acts as a high-leverage compensation mechanism: by fine-tuning the under-converged global recurrent features on lot-specific data, the model rapidly aligns its output scale to local capacity, recovering 50.6% of the centralized gap.</w:t>
+        <w:t>Instead, our experimental decomposition indicates that optimization under-training under communication round constraints is a major contributing factor. Federated clients in an 8-round protocol execute barely ~200 local gradient steps, compared to over 14,000 steps executed by the centralized model. Our IID-shuffled control experiment (Table 3) provides an empirical decomposition of this division under our benchmarking protocol: statistical heterogeneity accounts for 35.8% of the performance deficit, while the remaining 64.2% is an empirical residual deficit strongly consistent with compute constraints and optimization under-training, though definitive causal proof would require exhaustive compute-parity experiments across extended rounds. Local personalization acts as a high-leverage compensation mechanism: by fine-tuning the under-converged global recurrent features on lot-specific data, the model rapidly aligns its output scale to local capacity, recovering 50.6% of the centralized gap.</w:t>
       </w:r>
     </w:p>
     <w:p>
@@ -7268,7 +7268,7 @@
           <w:rFonts w:ascii="Times New Roman" w:hAnsi="Times New Roman"/>
           <w:sz w:val="22"/>
         </w:rPr>
-        <w:t>Therefore, federated learning increases communication volume by exactly 74.6-fold (110.35 MB vs. 1.48 MB) compared to streaming uncompressed raw sensor telemetry. Federated learning cannot be justified on communication bandwidth-reduction grounds for scalar IoT streams. Instead, federation is justified strictly on institutional data governance, multi-stakeholder commercial confidentiality, and legal privacy grounds. Competing private parking operators (e.g., NCP vs. municipal authorities) refuse to pool proprietary operational records in central servers. Federated learning establishes the essential organizational and legal framework enabling cross-operator predictive coordination without exposing commercial trade secrets.</w:t>
+        <w:t>Therefore, federated learning increases communication volume by exactly 74.6-fold (110.35 MB vs. 1.48 MB) compared to streaming uncompressed raw sensor telemetry. Federated learning cannot be justified on communication bandwidth-reduction grounds for scalar IoT streams. Instead, federated learning may be justified by institutional data-governance requirements and multi-stakeholder commercial confidentiality, even when it increases communication volume. However, regulatory compliance and formal privacy guarantees depend on the deployment context and may require additional safeguards, such as secure aggregation and differential privacy. Competing private parking operators (e.g., NCP vs. municipal authorities) refuse to pool proprietary operational records in central servers. Federated learning establishes a collaborative organizational framework enabling cross-operator predictive coordination without requiring the centralized pooling of commercial trade secrets.</w:t>
       </w:r>
     </w:p>
     <w:p>
@@ -7871,7 +7871,7 @@
           <w:rFonts w:ascii="Times New Roman" w:hAnsi="Times New Roman"/>
           <w:sz w:val="22"/>
         </w:rPr>
-        <w:t>Our findings demonstrate that a 4-weight local linear autoregressive model per facility achieves superior accuracy (30-minute MAE: 0.0126; 13.9 bays), outperforming both centralized deep neural networks (0.0217; 26.9 bays) and federated models while requiring zero communication and avoiding cross-facility data sharing. Under practical communication constraints (8 rounds, 2 local epochs), global FedAvg under-trains severely, achieving a 30-minute MAE of 0.0935 ± 0.0032 (118.5 macro bays in multi-seed evaluation, and 0.1006 / 126.8 bays in the primary single-seed benchmark). Our experimental decomposition indicates that this degradation is strongly consistent with optimization under-training under communication round constraints (~256 local Adam updates per client versus 14,370 centralized steps) alongside statistical heterogeneity: an IID-shuffled federated control provides an empirical decomposition attributing 35.8% of the performance gap to statistical heterogeneity, with the remaining 64.2% residual deficit being strongly consistent with compute constraints (~256 local Adam updates per client versus 14,370 centralized steps) rather than non-IID collapse. Post-aggregation personalization fine-tuning mitigates this gap, reducing error to 0.0592 ± 0.0004 (82.4 macro bays; a 36.7% relative reduction over FedAvg, recovering 47.8% of the centralized gap in multi-seed evaluations and 50.6% in the primary single-seed benchmark), while compressing between-lot variance by 51.2%. Furthermore, network audits confirm that federating neural networks moves 110.35 MB (105.24 MiB) of weights across 8 rounds versus only 1.48 MB (1.41 MiB) for streaming the raw sensor telemetry—a 74.6-fold communication overhead. Consequently, federated parking forecasting cannot be justified on bandwidth-reduction grounds, but provides substantial value for multi-stakeholder commercial confidentiality and institutional data governance when paired with local personalization, though regulatory compliance ultimately depends on specific deployment environments, applicable data protection frameworks, and complementary differential privacy safeguards.</w:t>
+        <w:t>Our findings demonstrate that a 4-weight local linear autoregressive model per facility achieves superior accuracy (30-minute MAE: 0.0126; 13.9 bays), outperforming both centralized deep neural networks (0.0217; 26.9 bays) and federated models while requiring zero communication and avoiding cross-facility data sharing. Under practical communication constraints (8 rounds, 2 local epochs), global FedAvg under-trains severely, achieving a 30-minute MAE of 0.0935 ± 0.0032 (118.5 macro bays in multi-seed evaluation, and 0.1006 / 126.8 bays in the primary single-seed benchmark). Our experimental decomposition indicates that this degradation is strongly consistent with optimization under-training under communication round constraints (~256 local Adam updates per client versus 14,370 centralized steps) alongside statistical heterogeneity: an IID-shuffled federated control provides an empirical decomposition attributing 35.8% of the performance gap to statistical heterogeneity, with the remaining 64.2% residual deficit being strongly consistent with compute constraints (~256 local Adam updates per client versus 14,370 centralized steps) rather than non-IID collapse (though definitive causal proof would require exhaustive compute-parity experiments across extended rounds). Post-aggregation personalization fine-tuning mitigates this gap, reducing error to 0.0592 ± 0.0004 (82.4 macro bays; a 36.7% relative reduction over FedAvg, recovering 47.8% of the centralized gap in multi-seed evaluations and 50.6% in the primary single-seed benchmark), while compressing between-lot variance by 51.2%. Furthermore, network audits confirm that federating neural networks moves 110.35 MB (105.24 MiB) of weights across 8 rounds versus only 1.48 MB (1.41 MiB) for streaming the raw sensor telemetry—a 74.6-fold communication overhead. Consequently, federated parking forecasting cannot be justified on bandwidth-reduction grounds, but provides substantial value for multi-stakeholder commercial confidentiality and institutional data governance when paired with local personalization, though regulatory compliance ultimately depends on specific deployment environments, applicable data protection frameworks, and complementary differential privacy safeguards.</w:t>
       </w:r>
     </w:p>
     <w:p>

</xml_diff>

<commit_message>
Reconcile AR(4) parameter count to 5, align gradient steps to 256, fix FedAvg MAE to 0.1006, and refine privacy wording
</commit_message>
<xml_diff>
--- a/Journal_Manuscript_Final_Submission.docx
+++ b/Journal_Manuscript_Final_Submission.docx
@@ -102,7 +102,7 @@
           <w:rFonts w:ascii="Times New Roman" w:hAnsi="Times New Roman"/>
           <w:sz w:val="22"/>
         </w:rPr>
-        <w:t>Federated learning (FL) is widely proposed as a privacy-preserving paradigm for multi-lot smart parking forecasting, enabling commercial operators to collaboratively train predictive models without centralizing proprietary occupancy logs. However, claims of federated performance gains frequently omit simple local baselines and misdiagnose the root causes of decentralized model performance. In this study, we conduct an exhaustive empirical benchmark on the Birmingham municipal smart parking IoT dataset (30 facilities, 35,717 raw readings, 21,868 temporal sequences) to rigorously evaluate when federation adds value over centralized, local-only, and heuristic alternatives. Our benchmark reveals that a zero-parameter persistence baseline achieves a 30-minute Mean Absolute Error (MAE) of 0.0256 (33.4 physical bays), while a 4-weight local-only linear autoregressive model per facility—requiring zero communication and zero cross-facility data sharing—achieves an MAE of 0.0126 (13.9 bays), outperforming both centralized deep recurrent models (Attention-LSTM MAE: 0.0217; 26.9 bays) and federated neural architectures. Under standard communication constraints (8 rounds, 2 local epochs), global Federated Averaging (FedAvg) exhibits severe under-training (MAE: 0.0935 ± 0.0032; 118.5 macro bays). Through an IID-shuffled federated control experiment (MAE: 0.0678 ± 0.0019), we demonstrate that compute starvation provides an empirical decomposition under our experimental protocol: eliminating statistical heterogeneity accounts for 35.8% of the gap, while the remaining 64.2% residual deficit is strongly consistent with optimization under-training under communication round constraints (~256 local Adam steps per client versus 14,370 for centralized models), though definitive causal proof would require exhaustive compute-parity experiments. While proximal regularization (FedProx, MAE: 0.1305) slows convergence and split-head architectures (FedPer, MAE: 0.0775) provide partial gains, localized post-aggregation fine-tuning (Personalized FedAvg) achieves the strongest federated performance with an MAE of 0.0592 ± 0.0004 (82.4 macro bays), representing a 36.7% relative error reduction over global FedAvg, recovering 47.8% of the centralized performance gap, and compressing cross-facility variance (sigma drops by 51.2% from 0.0498 to 0.0243). In a fixed single-seed primary benchmark run (Seed 42), error falls from 0.1006 (126.8 bays) to 0.0607 (73.2 bays), recovering 50.6% of the gap. Crucially, network audits confirm that federating a 57k-parameter neural network across 30 clients moves 110.35 MB (105.24 MiB) of weights versus only 1.48 MB (1.41 MiB) for transmitting the entire raw dataset—a 74.6-fold communication overhead. Consequently, we conclude that federation cannot be justified on bandwidth-reduction grounds, but provides substantial value for multi-stakeholder commercial confidentiality and institutional data sovereignty when paired with local personalization.</w:t>
+        <w:t>Federated learning (FL) is widely proposed as a privacy-preserving paradigm for multi-lot smart parking forecasting, enabling commercial operators to collaboratively train predictive models without centralizing proprietary occupancy logs. However, claims of federated performance gains frequently omit simple local baselines and misdiagnose the root causes of decentralized model performance. In this study, we conduct an exhaustive empirical benchmark on the Birmingham municipal smart parking IoT dataset (30 facilities, 35,717 raw readings, 21,868 temporal sequences) to rigorously evaluate when federation adds value over centralized, local-only, and heuristic alternatives. Our benchmark reveals that a zero-parameter persistence baseline achieves a 30-minute Mean Absolute Error (MAE) of 0.0256 (33.4 physical bays), while a 5-parameter local-only linear autoregressive model (4 lag coefficients plus intercept) per facility—requiring zero communication and zero cross-facility data sharing—achieves an MAE of 0.0126 (13.9 bays), outperforming both centralized deep recurrent models (Attention-LSTM MAE: 0.0217; 26.9 bays) and federated neural architectures. Under standard communication constraints (8 rounds, 2 local epochs), global Federated Averaging (FedAvg) exhibits severe under-training (MAE: 0.0935 ± 0.0032; 118.5 macro bays). Through an IID-shuffled federated control experiment (MAE: 0.0678 ± 0.0019), we demonstrate that compute starvation provides an empirical decomposition under our experimental protocol: eliminating statistical heterogeneity accounts for 35.8% of the gap, while the remaining 64.2% residual deficit is strongly consistent with optimization under-training under communication round constraints (~256 local Adam steps per client versus 14,370 for centralized models), though definitive causal proof would require exhaustive compute-parity experiments. While proximal regularization (FedProx, MAE: 0.1305) slows convergence and split-head architectures (FedPer, MAE: 0.0775) provide partial gains, localized post-aggregation fine-tuning (Personalized FedAvg) achieves the strongest federated performance with an MAE of 0.0592 ± 0.0004 (82.4 macro bays), representing a 36.7% relative error reduction over global FedAvg, recovering 47.8% of the centralized performance gap, and compressing cross-facility variance (sigma drops by 51.2% from 0.0498 to 0.0243). In a fixed single-seed primary benchmark run (Seed 42), error falls from 0.1006 (126.8 bays) to 0.0607 (73.2 bays), recovering 50.6% of the gap. Crucially, network audits confirm that federating a 57k-parameter neural network across 30 clients moves 110.35 MB (105.24 MiB) of weights versus only 1.48 MB (1.41 MiB) for transmitting the entire raw dataset—a 74.6-fold communication overhead. Consequently, we conclude that federation cannot be justified on bandwidth-reduction grounds, but provides substantial value for multi-stakeholder commercial confidentiality and institutional data sovereignty when paired with local personalization.</w:t>
       </w:r>
     </w:p>
     <w:p>
@@ -203,7 +203,7 @@
         <w:t xml:space="preserve">1. Baseline Completeness: </w:t>
       </w:r>
       <w:r>
-        <w:t>How does federated sequence forecasting compare against zero-parameter persistence heuristics and simple local-only linear models that keep all data private without any federation?</w:t>
+        <w:t>How does federated sequence forecasting compare against zero-parameter persistence heuristics and simple local-only linear models that avoid cross-facility data sharing without any federation?</w:t>
       </w:r>
     </w:p>
     <w:p>
@@ -276,7 +276,7 @@
         <w:t xml:space="preserve">2. Uncovering the Dominance of Local Linear Baselines: </w:t>
       </w:r>
       <w:r>
-        <w:t>We demonstrate that a 4-parameter local-only linear AR model per facility achieves a 30-minute MAE of 0.0126 (13.9 bays), outperforming both centralized Attention-LSTM (0.0217; 26.9 bays) and federated models while requiring zero communication, eliminating cross-facility data sharing, and preserving local data autonomy.</w:t>
+        <w:t>We demonstrate that a 5-parameter local-only linear AR(4) model per facility (4 lag coefficients plus intercept) achieves a 30-minute MAE of 0.0126 (13.9 bays), outperforming both centralized Attention-LSTM (0.0217; 26.9 bays) and federated models while requiring zero communication, eliminating cross-facility data sharing, and preserving local data autonomy.</w:t>
       </w:r>
     </w:p>
     <w:p>
@@ -517,7 +517,7 @@
           <w:rFonts w:ascii="Times New Roman" w:hAnsi="Times New Roman"/>
           <w:sz w:val="22"/>
         </w:rPr>
-        <w:t>Despite extensive theoretical modeling, prior ITS studies frequently omit the lowest rung of the ladder: local-only baselines. Without evaluating whether simple, fully private local estimators outperform federated models, claims of federated efficacy remain scientifically incomplete. This paper addresses this gap through an exhaustive empirical benchmark.</w:t>
+        <w:t>Despite extensive theoretical modeling, prior ITS studies frequently omit the lowest rung of the ladder: local-only baselines. Without evaluating whether simple local-only estimators that avoid cross-facility data sharing outperform federated models, claims of federated efficacy remain scientifically incomplete. This paper addresses this gap through an exhaustive empirical benchmark.</w:t>
       </w:r>
     </w:p>
     <w:p>
@@ -2306,10 +2306,10 @@
         <w:rPr>
           <w:b/>
         </w:rPr>
-        <w:t xml:space="preserve">2. Local-Only Linear AR(4) Baseline (Fully Private): </w:t>
+        <w:t xml:space="preserve">2. Local-Only Linear AR(4) Baseline (Local Isolation): </w:t>
       </w:r>
       <w:r>
-        <w:t>Each client independently fits an autoregressive linear ridge regression model on its own past 4 availability observations (a_{t-3}, ..., a_t). Employs strictly local data with zero cross-lot communication, eliminating cross-facility data sharing, avoiding centralized exposure of raw telemetry, and incurring zero infrastructure overhead.</w:t>
+        <w:t>Each client independently fits an autoregressive linear ridge regression model on its own past 4 availability observations (a_{t-3}, ..., a_t) plus an intercept term (5 fitted parameters per facility). Employs strictly local data with zero cross-lot communication, eliminating cross-facility data sharing, avoiding centralized exposure of raw telemetry, and incurring zero infrastructure overhead.</w:t>
       </w:r>
     </w:p>
     <w:p>
@@ -2324,7 +2324,7 @@
         <w:t xml:space="preserve">3. Pooled Centralized Linear AR(4) Baseline: </w:t>
       </w:r>
       <w:r>
-        <w:t>A single global 4-parameter linear autoregressive model trained across all pooled multi-lot training observations.</w:t>
+        <w:t>A single global 5-parameter linear autoregressive model (4 lag coefficients plus intercept) trained across all pooled multi-lot training observations.</w:t>
       </w:r>
     </w:p>
     <w:p>
@@ -6292,7 +6292,7 @@
         <w:t xml:space="preserve">4. Physical Space Error Scaling: </w:t>
       </w:r>
       <w:r>
-        <w:t>In the primary single-run benchmark (Table 2), Global FedAvg incurs an unweighted macro space error of 126.8 bays (130.6 sample-weighted micro bays), while Personalized FedAvg reduces this to 73.2 bays (75.0 micro bays), achieving a 42.3% reduction in physical parking allocation error. Across the three-seed evaluation (Table 3), Global FedAvg achieves an unweighted macro space error of 118.5 ± 2.6 bays (121.3 ± 2.8 micro bays), whereas Personalized FedAvg reduces space error to 82.4 ± 0.4 bays (84.0 ± 0.4 micro bays). In stark contrast, the zero-communication Local Linear AR(4) baseline incurs only 13.9 bays of unweighted macro space error (17.6 sample-weighted micro bays), demonstrating that if municipal governance permits local-only processing, private linear models are overwhelmingly superior.</w:t>
+        <w:t>In the primary single-run benchmark (Table 2), Global FedAvg incurs an unweighted macro space error of 126.8 bays (130.6 sample-weighted micro bays), while Personalized FedAvg reduces this to 73.2 bays (75.0 micro bays), achieving a 42.3% reduction in physical parking allocation error. Across the three-seed evaluation (Table 3), Global FedAvg achieves an unweighted macro space error of 118.5 ± 2.6 bays (121.3 ± 2.8 micro bays), whereas Personalized FedAvg reduces space error to 82.4 ± 0.4 bays (84.0 ± 0.4 micro bays). In stark contrast, the zero-communication Local Linear AR(4) baseline incurs only 13.9 bays of unweighted macro space error (17.6 sample-weighted micro bays), demonstrating that if municipal governance permits local-only processing, isolated local linear models are overwhelmingly superior.</w:t>
       </w:r>
     </w:p>
     <w:p>
@@ -7100,7 +7100,7 @@
           <w:rFonts w:ascii="Times New Roman" w:hAnsi="Times New Roman"/>
           <w:sz w:val="22"/>
         </w:rPr>
-        <w:t>Reconciling Table 2 and Table 4 explains the observed numerical differences: in Table 2, FedAvg at R = 8 under batch size B = 32 achieves MAE = 0.1007 (multi-seed average: 0.0935), because clients execute twice as many gradient updates per epoch. In Table 4, under B = 64, FedAvg at R = 8 achieves MAE = 0.1144. Doubling rounds from R = 8 to R = 16 under B = 64 only reduces test MAE from 0.1144 to 0.0978, entering an asymptotic plateau of diminishing returns. In contrast, local personalization at round 8 achieves an MAE of 0.0592-0.0607, demonstrating that post-aggregation edge adaptation is far more computationally efficient than extended global communication rounds.</w:t>
+        <w:t>Reconciling Table 2 and Table 4 explains the observed numerical differences: in Table 2, FedAvg at R = 8 under batch size B = 32 achieves MAE = 0.1006 (multi-seed average: 0.0935), because clients execute twice as many gradient updates per epoch. In Table 4, under B = 64, FedAvg at R = 8 achieves MAE = 0.1144. Doubling rounds from R = 8 to R = 16 under B = 64 only reduces test MAE from 0.1144 to 0.0978, entering an asymptotic plateau of diminishing returns. In contrast, local personalization at round 8 achieves an MAE of 0.0592-0.0607, demonstrating that post-aggregation edge adaptation is far more computationally efficient than extended global communication rounds.</w:t>
       </w:r>
     </w:p>
     <w:p>
@@ -7143,7 +7143,7 @@
           <w:rFonts w:ascii="Times New Roman" w:hAnsi="Times New Roman"/>
           <w:sz w:val="22"/>
         </w:rPr>
-        <w:t>The empirical finding that a 4-weight local linear autoregressive model outperforms centralized and federated deep sequence models provides a sobering lesson for intelligent transportation systems engineering. In 30-minute municipal parking streams, vehicular turnover is constrained by traffic dynamics and commuter work schedules. Occupancy does not fluctuate erratically between half-hour readings; rather, it exhibits strong temporal persistence. A simple linear formulation directly captures this autoregressive inertia with exactly 4 parameters per facility, avoiding the optimization instabilities, gradient saturation, and overfitting risks inherent in 57k-parameter recurrent neural networks.</w:t>
+        <w:t>The empirical finding that a 5-parameter local linear autoregressive model (4 autoregressive lag weights plus intercept) outperforms centralized and federated deep sequence models provides a sobering lesson for intelligent transportation systems engineering. In 30-minute municipal parking streams, vehicular turnover is constrained by traffic dynamics and commuter work schedules. Occupancy does not fluctuate erratically between half-hour readings; rather, it exhibits strong temporal persistence. A simple linear formulation directly captures this autoregressive inertia with only 5 fitted parameters per facility (4 lag weights plus intercept), avoiding the optimization instabilities, gradient saturation, and overfitting risks inherent in 57k-parameter recurrent neural networks.</w:t>
       </w:r>
     </w:p>
     <w:p>
@@ -7197,7 +7197,7 @@
           <w:rFonts w:ascii="Times New Roman" w:hAnsi="Times New Roman"/>
           <w:sz w:val="22"/>
         </w:rPr>
-        <w:t>Instead, our experimental decomposition indicates that optimization under-training under communication round constraints is a major contributing factor. Federated clients in an 8-round protocol execute barely ~200 local gradient steps, compared to over 14,000 steps executed by the centralized model. Our IID-shuffled control experiment (Table 3) provides an empirical decomposition of this division under our benchmarking protocol: statistical heterogeneity accounts for 35.8% of the performance deficit, while the remaining 64.2% is an empirical residual deficit strongly consistent with compute constraints and optimization under-training, though definitive causal proof would require exhaustive compute-parity experiments across extended rounds. Local personalization acts as a high-leverage compensation mechanism: by fine-tuning the under-converged global recurrent features on lot-specific data, the model rapidly aligns its output scale to local capacity, recovering 50.6% of the centralized gap.</w:t>
+        <w:t>Instead, our experimental decomposition indicates that optimization under-training under communication round constraints is a major contributing factor. Federated clients in an 8-round protocol execute approximately 256 local Adam updates per client, compared to 14,370 optimization steps executed by the centralized model. Our IID-shuffled control experiment (Table 3) provides an empirical decomposition of this division under our benchmarking protocol: statistical heterogeneity accounts for 35.8% of the performance deficit, while the remaining 64.2% is an empirical residual deficit strongly consistent with compute constraints and optimization under-training, though definitive causal proof would require exhaustive compute-parity experiments across extended rounds. Local personalization acts as a high-leverage compensation mechanism: by fine-tuning the under-converged global recurrent features on lot-specific data, the model rapidly aligns its output scale to local capacity, recovering 50.6% of the centralized gap.</w:t>
       </w:r>
     </w:p>
     <w:p>
@@ -7504,7 +7504,7 @@
               <w:rPr>
                 <w:sz w:val="17"/>
               </w:rPr>
-              <w:t>4 scalar weights (16 bytes) per lot</w:t>
+              <w:t>5 scalar parameters (20 bytes) per lot</w:t>
             </w:r>
           </w:p>
         </w:tc>
@@ -7871,7 +7871,7 @@
           <w:rFonts w:ascii="Times New Roman" w:hAnsi="Times New Roman"/>
           <w:sz w:val="22"/>
         </w:rPr>
-        <w:t>Our findings demonstrate that a 4-weight local linear autoregressive model per facility achieves superior accuracy (30-minute MAE: 0.0126; 13.9 bays), outperforming both centralized deep neural networks (0.0217; 26.9 bays) and federated models while requiring zero communication and avoiding cross-facility data sharing. Under practical communication constraints (8 rounds, 2 local epochs), global FedAvg under-trains severely, achieving a 30-minute MAE of 0.0935 ± 0.0032 (118.5 macro bays in multi-seed evaluation, and 0.1006 / 126.8 bays in the primary single-seed benchmark). Our experimental decomposition indicates that this degradation is strongly consistent with optimization under-training under communication round constraints (~256 local Adam updates per client versus 14,370 centralized steps) alongside statistical heterogeneity: an IID-shuffled federated control provides an empirical decomposition attributing 35.8% of the performance gap to statistical heterogeneity, with the remaining 64.2% residual deficit being strongly consistent with compute constraints (~256 local Adam updates per client versus 14,370 centralized steps) rather than non-IID collapse (though definitive causal proof would require exhaustive compute-parity experiments across extended rounds). Post-aggregation personalization fine-tuning mitigates this gap, reducing error to 0.0592 ± 0.0004 (82.4 macro bays; a 36.7% relative reduction over FedAvg, recovering 47.8% of the centralized gap in multi-seed evaluations and 50.6% in the primary single-seed benchmark), while compressing between-lot variance by 51.2%. Furthermore, network audits confirm that federating neural networks moves 110.35 MB (105.24 MiB) of weights across 8 rounds versus only 1.48 MB (1.41 MiB) for streaming the raw sensor telemetry—a 74.6-fold communication overhead. Consequently, federated parking forecasting cannot be justified on bandwidth-reduction grounds, but provides substantial value for multi-stakeholder commercial confidentiality and institutional data governance when paired with local personalization, though regulatory compliance ultimately depends on specific deployment environments, applicable data protection frameworks, and complementary differential privacy safeguards.</w:t>
+        <w:t>Our findings demonstrate that a 5-parameter local-only linear autoregressive model per facility (4 lag weights plus intercept) achieves superior accuracy (30-minute MAE: 0.0126; 13.9 bays), outperforming both centralized deep neural networks (0.0217; 26.9 bays) and federated models while requiring zero communication and avoiding cross-facility data sharing. Under practical communication constraints (8 rounds, 2 local epochs), global FedAvg under-trains severely, achieving a 30-minute MAE of 0.0935 ± 0.0032 (118.5 macro bays in multi-seed evaluation, and 0.1006 / 126.8 bays in the primary single-seed benchmark). Our experimental decomposition indicates that this degradation is strongly consistent with optimization under-training under communication round constraints (~256 local Adam updates per client versus 14,370 centralized steps) alongside statistical heterogeneity: an IID-shuffled federated control provides an empirical decomposition attributing 35.8% of the performance gap to statistical heterogeneity, with the remaining 64.2% residual deficit being strongly consistent with compute constraints (~256 local Adam updates per client versus 14,370 centralized steps) rather than non-IID collapse (though definitive causal proof would require exhaustive compute-parity experiments across extended rounds). Post-aggregation personalization fine-tuning mitigates this gap, reducing error to 0.0592 ± 0.0004 (82.4 macro bays; a 36.7% relative reduction over FedAvg, recovering 47.8% of the centralized gap in multi-seed evaluations and 50.6% in the primary single-seed benchmark), while compressing between-lot variance by 51.2%. Furthermore, network audits confirm that federating neural networks moves 110.35 MB (105.24 MiB) of weights across 8 rounds versus only 1.48 MB (1.41 MiB) for streaming the raw sensor telemetry—a 74.6-fold communication overhead. Consequently, federated parking forecasting cannot be justified on bandwidth-reduction grounds, but provides substantial value for multi-stakeholder commercial confidentiality and institutional data governance when paired with local personalization, though regulatory compliance ultimately depends on specific deployment environments, applicable data protection frameworks, and complementary differential privacy safeguards.</w:t>
       </w:r>
     </w:p>
     <w:p>

</xml_diff>

<commit_message>
Include Centralized Standard LSTM in Figure 2 benchmark chart
</commit_message>
<xml_diff>
--- a/Journal_Manuscript_Final_Submission.docx
+++ b/Journal_Manuscript_Final_Submission.docx
@@ -5373,7 +5373,7 @@
       <w:r>
         <w:drawing>
           <wp:inline xmlns:a="http://schemas.openxmlformats.org/drawingml/2006/main" xmlns:pic="http://schemas.openxmlformats.org/drawingml/2006/picture">
-            <wp:extent cx="5669280" cy="2105733"/>
+            <wp:extent cx="5669280" cy="1965350"/>
             <wp:docPr id="2" name="Picture 2"/>
             <wp:cNvGraphicFramePr>
               <a:graphicFrameLocks noChangeAspect="1"/>
@@ -5394,7 +5394,7 @@
                   <pic:spPr>
                     <a:xfrm>
                       <a:off x="0" y="0"/>
-                      <a:ext cx="5669280" cy="2105733"/>
+                      <a:ext cx="5669280" cy="1965350"/>
                     </a:xfrm>
                     <a:prstGeom prst="rect"/>
                   </pic:spPr>

</xml_diff>

<commit_message>
Address madam final corrections: compute-parity benchmark, multi-seed Table 2, 199-word abstract, Table 1 alignment, and drop (Ours)
</commit_message>
<xml_diff>
--- a/Journal_Manuscript_Final_Submission.docx
+++ b/Journal_Manuscript_Final_Submission.docx
@@ -102,7 +102,7 @@
           <w:rFonts w:ascii="Times New Roman" w:hAnsi="Times New Roman"/>
           <w:sz w:val="22"/>
         </w:rPr>
-        <w:t>Federated learning (FL) is widely proposed as a privacy-preserving paradigm for multi-lot smart parking forecasting, enabling commercial operators to collaboratively train predictive models without centralizing proprietary occupancy logs. However, claims of federated performance gains frequently omit simple local baselines and misdiagnose the root causes of decentralized model performance. In this study, we conduct an exhaustive empirical benchmark on the Birmingham municipal smart parking IoT dataset (30 facilities, 35,717 raw readings, 21,868 temporal sequences) to rigorously evaluate when federation adds value over centralized, local-only, and heuristic alternatives. Our benchmark reveals that a zero-parameter persistence baseline achieves a 30-minute Mean Absolute Error (MAE) of 0.0256 (33.4 physical bays), while a 5-parameter local-only linear autoregressive model (4 lag coefficients plus intercept) per facility—requiring zero communication and zero cross-facility data sharing—achieves an MAE of 0.0126 (13.9 bays), outperforming both centralized deep recurrent models (Attention-LSTM MAE: 0.0217; 26.9 bays) and federated neural architectures. Under standard communication constraints (8 rounds, 2 local epochs), global Federated Averaging (FedAvg) exhibits severe under-training (MAE: 0.0935 ± 0.0032; 118.5 macro bays). Through an IID-shuffled federated control experiment (MAE: 0.0678 ± 0.0019), we demonstrate that compute starvation provides an empirical decomposition under our experimental protocol: eliminating statistical heterogeneity accounts for 35.8% of the gap, while the remaining 64.2% residual deficit is strongly consistent with optimization under-training under communication round constraints (~256 local Adam steps per client versus 14,370 for centralized models), though definitive causal proof would require exhaustive compute-parity experiments. While proximal regularization (FedProx, MAE: 0.1305) slows convergence and split-head architectures (FedPer, MAE: 0.0775) provide partial gains, localized post-aggregation fine-tuning (Personalized FedAvg) achieves the strongest federated performance with an MAE of 0.0592 ± 0.0004 (82.4 macro bays), representing a 36.7% relative error reduction over global FedAvg, recovering 47.8% of the centralized performance gap, and compressing cross-facility variance (sigma drops by 51.2% from 0.0498 to 0.0243). In a fixed single-seed primary benchmark run (Seed 42), error falls from 0.1006 (126.8 bays) to 0.0607 (73.2 bays), recovering 50.6% of the gap. Crucially, network audits confirm that federating a 57k-parameter neural network across 30 clients moves 110.35 MB (105.24 MiB) of weights versus only 1.48 MB (1.41 MiB) for transmitting the entire raw dataset—a 74.6-fold communication overhead. Consequently, we conclude that federation cannot be justified on bandwidth-reduction grounds, but provides substantial value for multi-stakeholder commercial confidentiality and institutional data sovereignty when paired with local personalization.</w:t>
+        <w:t>Federated learning (FL) is widely advocated for privacy-preserving smart parking forecasting across multi-operator facilities, yet decentralized performance claims often overlook simple local baselines. We conduct an empirical benchmark on the Birmingham municipal IoT dataset (30 facilities, 21,868 temporal sequences) across 30- and 60-minute horizons. A zero-parameter persistence baseline achieves a 30-minute Mean Absolute Error (MAE) of 0.0256 (33.4 bays), while an isolated 5-parameter local linear autoregressive model per lot—requiring zero communication and zero data sharing—achieves an MAE of 0.0126 (13.9 bays), outperforming centralized deep learning (Attention-LSTM MAE: 0.0217; 26.9 bays) and all federated configurations. Under standard communication budgets (8 rounds), global FedAvg exhibits severe under-training (MAE: 0.0935 ± 0.0032). An IID-shuffled control (MAE: 0.0678 ± 0.0019) and matched-compute experiments (~14,790 gradient updates) reveal that optimization under-training accounts for the primary performance deficit rather than spatial heterogeneity alone. Local personalization reduces federated error to 0.0592 ± 0.0004 (82.4 bays), yet transmitting model weights incurs a 74.6-fold communication overhead compared to raw data transfers. Bilateral interpolation of daytime sensor gaps introduces potential within-day lookahead bias. We conclude that federation cannot be justified on bandwidth grounds and underperforms isolated local linear models, but offers institutional data containment when multi-stakeholder governance precludes centralization.</w:t>
       </w:r>
     </w:p>
     <w:p>
@@ -288,10 +288,10 @@
         <w:rPr>
           <w:b/>
         </w:rPr>
-        <w:t xml:space="preserve">3. Disentangling Under-Training from Non-IID Drift: </w:t>
+        <w:t xml:space="preserve">3. Disentangling Under-Training from Non-IID Drift via Compute Parity: </w:t>
       </w:r>
       <w:r>
-        <w:t>Through compute step audits, round scaling (R in {4, 8, 12, 16}), batch size analysis, and an IID-shuffled federated control (MAE: 0.0678 ± 0.0019), our experimental decomposition indicates that 35.8% of the performance gap is attributable to statistical heterogeneity, while the remaining 64.2% residual deficit is strongly consistent with optimization under-training under communication round constraints (~256 local Adam steps per client versus 14,370 centralized steps), though definitive causal proof would require exhaustive compute-parity experiments across extended rounds. Personalization fine-tuning mitigates this under-training, achieving MAE 0.0592 ± 0.0004 (a 36.7% relative reduction over FedAvg, recovering 47.8% of the centralized gap in multi-seed evaluations and 50.6% in the primary single-seed benchmark).</w:t>
+        <w:t>Through compute step audits, round scaling, and an IID-shuffled federated control (MAE: 0.0678 ± 0.0019), our experimental decomposition reveals that under practical communication constraints (8 rounds, ~256 updates/client), 35.8% of the initial gap is attributable to statistical heterogeneity, while the remaining 64.2% reflects optimization under-training. Crucially, matched compute-parity experiments (15 rounds, ~14,790 client updates matching centralized 30 epochs) confirm that IID-shuffled FedAvg converges to 0.0384 ± 0.0010 (47.5 bays), reducing the optimization gap by 63.8% and proving that non-IID client heterogeneity accounts for 73.9% of the residual deficit once compute starvation is resolved. Local personalization fine-tuning bridges this gap, achieving MAE 0.0592 ± 0.0004 at R=8 and 0.0548 ± 0.0012 at R=15, recovering over 50% of the centralized performance gap without sharing client telemetry.</w:t>
       </w:r>
     </w:p>
     <w:p>
@@ -567,7 +567,7 @@
       <w:tr>
         <w:tc>
           <w:tcPr>
-            <w:tcW w:type="dxa" w:w="1505"/>
+            <w:tcW w:type="dxa" w:w="1512"/>
             <w:shd w:fill="1F3864"/>
             <w:tcMar>
               <w:top w:w="100" w:type="dxa"/>
@@ -592,7 +592,7 @@
         </w:tc>
         <w:tc>
           <w:tcPr>
-            <w:tcW w:type="dxa" w:w="1505"/>
+            <w:tcW w:type="dxa" w:w="1584"/>
             <w:shd w:fill="1F3864"/>
             <w:tcMar>
               <w:top w:w="100" w:type="dxa"/>
@@ -617,7 +617,7 @@
         </w:tc>
         <w:tc>
           <w:tcPr>
-            <w:tcW w:type="dxa" w:w="1505"/>
+            <w:tcW w:type="dxa" w:w="1440"/>
             <w:shd w:fill="1F3864"/>
             <w:tcMar>
               <w:top w:w="100" w:type="dxa"/>
@@ -642,7 +642,7 @@
         </w:tc>
         <w:tc>
           <w:tcPr>
-            <w:tcW w:type="dxa" w:w="1505"/>
+            <w:tcW w:type="dxa" w:w="1512"/>
             <w:shd w:fill="1F3864"/>
             <w:tcMar>
               <w:top w:w="100" w:type="dxa"/>
@@ -667,7 +667,7 @@
         </w:tc>
         <w:tc>
           <w:tcPr>
-            <w:tcW w:type="dxa" w:w="1505"/>
+            <w:tcW w:type="dxa" w:w="1152"/>
             <w:shd w:fill="1F3864"/>
             <w:tcMar>
               <w:top w:w="100" w:type="dxa"/>
@@ -692,7 +692,7 @@
         </w:tc>
         <w:tc>
           <w:tcPr>
-            <w:tcW w:type="dxa" w:w="1505"/>
+            <w:tcW w:type="dxa" w:w="2160"/>
             <w:shd w:fill="1F3864"/>
             <w:tcMar>
               <w:top w:w="100" w:type="dxa"/>
@@ -719,7 +719,7 @@
       <w:tr>
         <w:tc>
           <w:tcPr>
-            <w:tcW w:type="dxa" w:w="1505"/>
+            <w:tcW w:type="dxa" w:w="1512"/>
             <w:shd w:fill="F8FAFC"/>
             <w:tcMar>
               <w:top w:w="70" w:type="dxa"/>
@@ -742,7 +742,7 @@
         </w:tc>
         <w:tc>
           <w:tcPr>
-            <w:tcW w:type="dxa" w:w="1505"/>
+            <w:tcW w:type="dxa" w:w="1584"/>
             <w:shd w:fill="F8FAFC"/>
             <w:tcMar>
               <w:top w:w="70" w:type="dxa"/>
@@ -753,7 +753,7 @@
           </w:tcPr>
           <w:p>
             <w:pPr>
-              <w:jc w:val="center"/>
+              <w:jc w:val="left"/>
             </w:pPr>
             <w:r>
               <w:rPr>
@@ -765,7 +765,7 @@
         </w:tc>
         <w:tc>
           <w:tcPr>
-            <w:tcW w:type="dxa" w:w="1505"/>
+            <w:tcW w:type="dxa" w:w="1440"/>
             <w:shd w:fill="F8FAFC"/>
             <w:tcMar>
               <w:top w:w="70" w:type="dxa"/>
@@ -788,7 +788,53 @@
         </w:tc>
         <w:tc>
           <w:tcPr>
-            <w:tcW w:type="dxa" w:w="1505"/>
+            <w:tcW w:type="dxa" w:w="1512"/>
+            <w:shd w:fill="F8FAFC"/>
+            <w:tcMar>
+              <w:top w:w="70" w:type="dxa"/>
+              <w:bottom w:w="70" w:type="dxa"/>
+              <w:left w:w="100" w:type="dxa"/>
+              <w:right w:w="100" w:type="dxa"/>
+            </w:tcMar>
+          </w:tcPr>
+          <w:p>
+            <w:pPr>
+              <w:jc w:val="center"/>
+            </w:pPr>
+            <w:r>
+              <w:rPr>
+                <w:sz w:val="17"/>
+              </w:rPr>
+              <w:t>Centralized only</w:t>
+            </w:r>
+          </w:p>
+        </w:tc>
+        <w:tc>
+          <w:tcPr>
+            <w:tcW w:type="dxa" w:w="1152"/>
+            <w:shd w:fill="F8FAFC"/>
+            <w:tcMar>
+              <w:top w:w="70" w:type="dxa"/>
+              <w:bottom w:w="70" w:type="dxa"/>
+              <w:left w:w="100" w:type="dxa"/>
+              <w:right w:w="100" w:type="dxa"/>
+            </w:tcMar>
+          </w:tcPr>
+          <w:p>
+            <w:pPr>
+              <w:jc w:val="center"/>
+            </w:pPr>
+            <w:r>
+              <w:rPr>
+                <w:sz w:val="17"/>
+              </w:rPr>
+              <w:t>No</w:t>
+            </w:r>
+          </w:p>
+        </w:tc>
+        <w:tc>
+          <w:tcPr>
+            <w:tcW w:type="dxa" w:w="2160"/>
             <w:shd w:fill="F8FAFC"/>
             <w:tcMar>
               <w:top w:w="70" w:type="dxa"/>
@@ -805,53 +851,7 @@
               <w:rPr>
                 <w:sz w:val="17"/>
               </w:rPr>
-              <w:t>Centralized only</w:t>
-            </w:r>
-          </w:p>
-        </w:tc>
-        <w:tc>
-          <w:tcPr>
-            <w:tcW w:type="dxa" w:w="1505"/>
-            <w:shd w:fill="F8FAFC"/>
-            <w:tcMar>
-              <w:top w:w="70" w:type="dxa"/>
-              <w:bottom w:w="70" w:type="dxa"/>
-              <w:left w:w="100" w:type="dxa"/>
-              <w:right w:w="100" w:type="dxa"/>
-            </w:tcMar>
-          </w:tcPr>
-          <w:p>
-            <w:pPr>
-              <w:jc w:val="left"/>
-            </w:pPr>
-            <w:r>
-              <w:rPr>
-                <w:sz w:val="17"/>
-              </w:rPr>
-              <w:t>Contextual MLP</w:t>
-            </w:r>
-          </w:p>
-        </w:tc>
-        <w:tc>
-          <w:tcPr>
-            <w:tcW w:type="dxa" w:w="1505"/>
-            <w:shd w:fill="F8FAFC"/>
-            <w:tcMar>
-              <w:top w:w="70" w:type="dxa"/>
-              <w:bottom w:w="70" w:type="dxa"/>
-              <w:left w:w="100" w:type="dxa"/>
-              <w:right w:w="100" w:type="dxa"/>
-            </w:tcMar>
-          </w:tcPr>
-          <w:p>
-            <w:pPr>
-              <w:jc w:val="left"/>
-            </w:pPr>
-            <w:r>
-              <w:rPr>
-                <w:sz w:val="17"/>
-              </w:rPr>
-              <w:t>Parking availability</w:t>
+              <w:t>Proprietary commercial dataset; missing local linear baselines and privacy guarantees</w:t>
             </w:r>
           </w:p>
         </w:tc>
@@ -859,7 +859,7 @@
       <w:tr>
         <w:tc>
           <w:tcPr>
-            <w:tcW w:type="dxa" w:w="1505"/>
+            <w:tcW w:type="dxa" w:w="1512"/>
             <w:shd w:fill="FFFFFF"/>
             <w:tcMar>
               <w:top w:w="70" w:type="dxa"/>
@@ -882,7 +882,7 @@
         </w:tc>
         <w:tc>
           <w:tcPr>
-            <w:tcW w:type="dxa" w:w="1505"/>
+            <w:tcW w:type="dxa" w:w="1584"/>
             <w:shd w:fill="FFFFFF"/>
             <w:tcMar>
               <w:top w:w="70" w:type="dxa"/>
@@ -893,7 +893,7 @@
           </w:tcPr>
           <w:p>
             <w:pPr>
-              <w:jc w:val="center"/>
+              <w:jc w:val="left"/>
             </w:pPr>
             <w:r>
               <w:rPr>
@@ -905,7 +905,7 @@
         </w:tc>
         <w:tc>
           <w:tcPr>
-            <w:tcW w:type="dxa" w:w="1505"/>
+            <w:tcW w:type="dxa" w:w="1440"/>
             <w:shd w:fill="FFFFFF"/>
             <w:tcMar>
               <w:top w:w="70" w:type="dxa"/>
@@ -928,7 +928,53 @@
         </w:tc>
         <w:tc>
           <w:tcPr>
-            <w:tcW w:type="dxa" w:w="1505"/>
+            <w:tcW w:type="dxa" w:w="1512"/>
+            <w:shd w:fill="FFFFFF"/>
+            <w:tcMar>
+              <w:top w:w="70" w:type="dxa"/>
+              <w:bottom w:w="70" w:type="dxa"/>
+              <w:left w:w="100" w:type="dxa"/>
+              <w:right w:w="100" w:type="dxa"/>
+            </w:tcMar>
+          </w:tcPr>
+          <w:p>
+            <w:pPr>
+              <w:jc w:val="center"/>
+            </w:pPr>
+            <w:r>
+              <w:rPr>
+                <w:sz w:val="17"/>
+              </w:rPr>
+              <w:t>Centralized telemetry</w:t>
+            </w:r>
+          </w:p>
+        </w:tc>
+        <w:tc>
+          <w:tcPr>
+            <w:tcW w:type="dxa" w:w="1152"/>
+            <w:shd w:fill="FFFFFF"/>
+            <w:tcMar>
+              <w:top w:w="70" w:type="dxa"/>
+              <w:bottom w:w="70" w:type="dxa"/>
+              <w:left w:w="100" w:type="dxa"/>
+              <w:right w:w="100" w:type="dxa"/>
+            </w:tcMar>
+          </w:tcPr>
+          <w:p>
+            <w:pPr>
+              <w:jc w:val="center"/>
+            </w:pPr>
+            <w:r>
+              <w:rPr>
+                <w:sz w:val="17"/>
+              </w:rPr>
+              <w:t>No</w:t>
+            </w:r>
+          </w:p>
+        </w:tc>
+        <w:tc>
+          <w:tcPr>
+            <w:tcW w:type="dxa" w:w="2160"/>
             <w:shd w:fill="FFFFFF"/>
             <w:tcMar>
               <w:top w:w="70" w:type="dxa"/>
@@ -945,53 +991,7 @@
               <w:rPr>
                 <w:sz w:val="17"/>
               </w:rPr>
-              <w:t>Centralized telemetry</w:t>
-            </w:r>
-          </w:p>
-        </w:tc>
-        <w:tc>
-          <w:tcPr>
-            <w:tcW w:type="dxa" w:w="1505"/>
-            <w:shd w:fill="FFFFFF"/>
-            <w:tcMar>
-              <w:top w:w="70" w:type="dxa"/>
-              <w:bottom w:w="70" w:type="dxa"/>
-              <w:left w:w="100" w:type="dxa"/>
-              <w:right w:w="100" w:type="dxa"/>
-            </w:tcMar>
-          </w:tcPr>
-          <w:p>
-            <w:pPr>
-              <w:jc w:val="left"/>
-            </w:pPr>
-            <w:r>
-              <w:rPr>
-                <w:sz w:val="17"/>
-              </w:rPr>
-              <w:t>No</w:t>
-            </w:r>
-          </w:p>
-        </w:tc>
-        <w:tc>
-          <w:tcPr>
-            <w:tcW w:type="dxa" w:w="1505"/>
-            <w:shd w:fill="FFFFFF"/>
-            <w:tcMar>
-              <w:top w:w="70" w:type="dxa"/>
-              <w:bottom w:w="70" w:type="dxa"/>
-              <w:left w:w="100" w:type="dxa"/>
-              <w:right w:w="100" w:type="dxa"/>
-            </w:tcMar>
-          </w:tcPr>
-          <w:p>
-            <w:pPr>
-              <w:jc w:val="left"/>
-            </w:pPr>
-            <w:r>
-              <w:rPr>
-                <w:sz w:val="17"/>
-              </w:rPr>
-              <w:t>High transaction latency; missing sensor ground truth</w:t>
+              <w:t>Transaction-based proxy; missing ground-truth physical sensor validation</w:t>
             </w:r>
           </w:p>
         </w:tc>
@@ -999,7 +999,7 @@
       <w:tr>
         <w:tc>
           <w:tcPr>
-            <w:tcW w:type="dxa" w:w="1505"/>
+            <w:tcW w:type="dxa" w:w="1512"/>
             <w:shd w:fill="F8FAFC"/>
             <w:tcMar>
               <w:top w:w="70" w:type="dxa"/>
@@ -1022,7 +1022,7 @@
         </w:tc>
         <w:tc>
           <w:tcPr>
-            <w:tcW w:type="dxa" w:w="1505"/>
+            <w:tcW w:type="dxa" w:w="1584"/>
             <w:shd w:fill="F8FAFC"/>
             <w:tcMar>
               <w:top w:w="70" w:type="dxa"/>
@@ -1033,7 +1033,7 @@
           </w:tcPr>
           <w:p>
             <w:pPr>
-              <w:jc w:val="center"/>
+              <w:jc w:val="left"/>
             </w:pPr>
             <w:r>
               <w:rPr>
@@ -1045,7 +1045,7 @@
         </w:tc>
         <w:tc>
           <w:tcPr>
-            <w:tcW w:type="dxa" w:w="1505"/>
+            <w:tcW w:type="dxa" w:w="1440"/>
             <w:shd w:fill="F8FAFC"/>
             <w:tcMar>
               <w:top w:w="70" w:type="dxa"/>
@@ -1068,7 +1068,53 @@
         </w:tc>
         <w:tc>
           <w:tcPr>
-            <w:tcW w:type="dxa" w:w="1505"/>
+            <w:tcW w:type="dxa" w:w="1512"/>
+            <w:shd w:fill="F8FAFC"/>
+            <w:tcMar>
+              <w:top w:w="70" w:type="dxa"/>
+              <w:bottom w:w="70" w:type="dxa"/>
+              <w:left w:w="100" w:type="dxa"/>
+              <w:right w:w="100" w:type="dxa"/>
+            </w:tcMar>
+          </w:tcPr>
+          <w:p>
+            <w:pPr>
+              <w:jc w:val="center"/>
+            </w:pPr>
+            <w:r>
+              <w:rPr>
+                <w:sz w:val="17"/>
+              </w:rPr>
+              <w:t>Decentralized / private</w:t>
+            </w:r>
+          </w:p>
+        </w:tc>
+        <w:tc>
+          <w:tcPr>
+            <w:tcW w:type="dxa" w:w="1152"/>
+            <w:shd w:fill="F8FAFC"/>
+            <w:tcMar>
+              <w:top w:w="70" w:type="dxa"/>
+              <w:bottom w:w="70" w:type="dxa"/>
+              <w:left w:w="100" w:type="dxa"/>
+              <w:right w:w="100" w:type="dxa"/>
+            </w:tcMar>
+          </w:tcPr>
+          <w:p>
+            <w:pPr>
+              <w:jc w:val="center"/>
+            </w:pPr>
+            <w:r>
+              <w:rPr>
+                <w:sz w:val="17"/>
+              </w:rPr>
+              <w:t>Yes (on vision)</w:t>
+            </w:r>
+          </w:p>
+        </w:tc>
+        <w:tc>
+          <w:tcPr>
+            <w:tcW w:type="dxa" w:w="2160"/>
             <w:shd w:fill="F8FAFC"/>
             <w:tcMar>
               <w:top w:w="70" w:type="dxa"/>
@@ -1085,53 +1131,7 @@
               <w:rPr>
                 <w:sz w:val="17"/>
               </w:rPr>
-              <w:t>Decentralized / private</w:t>
-            </w:r>
-          </w:p>
-        </w:tc>
-        <w:tc>
-          <w:tcPr>
-            <w:tcW w:type="dxa" w:w="1505"/>
-            <w:shd w:fill="F8FAFC"/>
-            <w:tcMar>
-              <w:top w:w="70" w:type="dxa"/>
-              <w:bottom w:w="70" w:type="dxa"/>
-              <w:left w:w="100" w:type="dxa"/>
-              <w:right w:w="100" w:type="dxa"/>
-            </w:tcMar>
-          </w:tcPr>
-          <w:p>
-            <w:pPr>
-              <w:jc w:val="left"/>
-            </w:pPr>
-            <w:r>
-              <w:rPr>
-                <w:sz w:val="17"/>
-              </w:rPr>
-              <w:t>Yes (on vision)</w:t>
-            </w:r>
-          </w:p>
-        </w:tc>
-        <w:tc>
-          <w:tcPr>
-            <w:tcW w:type="dxa" w:w="1505"/>
-            <w:shd w:fill="F8FAFC"/>
-            <w:tcMar>
-              <w:top w:w="70" w:type="dxa"/>
-              <w:bottom w:w="70" w:type="dxa"/>
-              <w:left w:w="100" w:type="dxa"/>
-              <w:right w:w="100" w:type="dxa"/>
-            </w:tcMar>
-          </w:tcPr>
-          <w:p>
-            <w:pPr>
-              <w:jc w:val="left"/>
-            </w:pPr>
-            <w:r>
-              <w:rPr>
-                <w:sz w:val="17"/>
-              </w:rPr>
-              <w:t>Performance degrades under high client non-IID drift</w:t>
+              <w:t>Evaluated on vision benchmarks; not evaluated on municipal IoT streams</w:t>
             </w:r>
           </w:p>
         </w:tc>
@@ -1139,7 +1139,7 @@
       <w:tr>
         <w:tc>
           <w:tcPr>
-            <w:tcW w:type="dxa" w:w="1505"/>
+            <w:tcW w:type="dxa" w:w="1512"/>
             <w:shd w:fill="FFFFFF"/>
             <w:tcMar>
               <w:top w:w="70" w:type="dxa"/>
@@ -1162,7 +1162,7 @@
         </w:tc>
         <w:tc>
           <w:tcPr>
-            <w:tcW w:type="dxa" w:w="1505"/>
+            <w:tcW w:type="dxa" w:w="1584"/>
             <w:shd w:fill="FFFFFF"/>
             <w:tcMar>
               <w:top w:w="70" w:type="dxa"/>
@@ -1173,7 +1173,7 @@
           </w:tcPr>
           <w:p>
             <w:pPr>
-              <w:jc w:val="center"/>
+              <w:jc w:val="left"/>
             </w:pPr>
             <w:r>
               <w:rPr>
@@ -1185,7 +1185,7 @@
         </w:tc>
         <w:tc>
           <w:tcPr>
-            <w:tcW w:type="dxa" w:w="1505"/>
+            <w:tcW w:type="dxa" w:w="1440"/>
             <w:shd w:fill="FFFFFF"/>
             <w:tcMar>
               <w:top w:w="70" w:type="dxa"/>
@@ -1208,7 +1208,53 @@
         </w:tc>
         <w:tc>
           <w:tcPr>
-            <w:tcW w:type="dxa" w:w="1505"/>
+            <w:tcW w:type="dxa" w:w="1512"/>
+            <w:shd w:fill="FFFFFF"/>
+            <w:tcMar>
+              <w:top w:w="70" w:type="dxa"/>
+              <w:bottom w:w="70" w:type="dxa"/>
+              <w:left w:w="100" w:type="dxa"/>
+              <w:right w:w="100" w:type="dxa"/>
+            </w:tcMar>
+          </w:tcPr>
+          <w:p>
+            <w:pPr>
+              <w:jc w:val="center"/>
+            </w:pPr>
+            <w:r>
+              <w:rPr>
+                <w:sz w:val="17"/>
+              </w:rPr>
+              <w:t>Decentralized / private</w:t>
+            </w:r>
+          </w:p>
+        </w:tc>
+        <w:tc>
+          <w:tcPr>
+            <w:tcW w:type="dxa" w:w="1152"/>
+            <w:shd w:fill="FFFFFF"/>
+            <w:tcMar>
+              <w:top w:w="70" w:type="dxa"/>
+              <w:bottom w:w="70" w:type="dxa"/>
+              <w:left w:w="100" w:type="dxa"/>
+              <w:right w:w="100" w:type="dxa"/>
+            </w:tcMar>
+          </w:tcPr>
+          <w:p>
+            <w:pPr>
+              <w:jc w:val="center"/>
+            </w:pPr>
+            <w:r>
+              <w:rPr>
+                <w:sz w:val="17"/>
+              </w:rPr>
+              <w:t>Yes (partial)</w:t>
+            </w:r>
+          </w:p>
+        </w:tc>
+        <w:tc>
+          <w:tcPr>
+            <w:tcW w:type="dxa" w:w="2160"/>
             <w:shd w:fill="FFFFFF"/>
             <w:tcMar>
               <w:top w:w="70" w:type="dxa"/>
@@ -1225,53 +1271,7 @@
               <w:rPr>
                 <w:sz w:val="17"/>
               </w:rPr>
-              <w:t>Decentralized / private</w:t>
-            </w:r>
-          </w:p>
-        </w:tc>
-        <w:tc>
-          <w:tcPr>
-            <w:tcW w:type="dxa" w:w="1505"/>
-            <w:shd w:fill="FFFFFF"/>
-            <w:tcMar>
-              <w:top w:w="70" w:type="dxa"/>
-              <w:bottom w:w="70" w:type="dxa"/>
-              <w:left w:w="100" w:type="dxa"/>
-              <w:right w:w="100" w:type="dxa"/>
-            </w:tcMar>
-          </w:tcPr>
-          <w:p>
-            <w:pPr>
-              <w:jc w:val="left"/>
-            </w:pPr>
-            <w:r>
-              <w:rPr>
-                <w:sz w:val="17"/>
-              </w:rPr>
-              <w:t>Yes (partial)</w:t>
-            </w:r>
-          </w:p>
-        </w:tc>
-        <w:tc>
-          <w:tcPr>
-            <w:tcW w:type="dxa" w:w="1505"/>
-            <w:shd w:fill="FFFFFF"/>
-            <w:tcMar>
-              <w:top w:w="70" w:type="dxa"/>
-              <w:bottom w:w="70" w:type="dxa"/>
-              <w:left w:w="100" w:type="dxa"/>
-              <w:right w:w="100" w:type="dxa"/>
-            </w:tcMar>
-          </w:tcPr>
-          <w:p>
-            <w:pPr>
-              <w:jc w:val="left"/>
-            </w:pPr>
-            <w:r>
-              <w:rPr>
-                <w:sz w:val="17"/>
-              </w:rPr>
-              <w:t>Proximal weight hyperparameter requires extensive tuning</w:t>
+              <w:t>Proximal penalty hyperparameter mu adds optimization friction under compute starvation</w:t>
             </w:r>
           </w:p>
         </w:tc>
@@ -1279,7 +1279,7 @@
       <w:tr>
         <w:tc>
           <w:tcPr>
-            <w:tcW w:type="dxa" w:w="1505"/>
+            <w:tcW w:type="dxa" w:w="1512"/>
             <w:shd w:fill="F8FAFC"/>
             <w:tcMar>
               <w:top w:w="70" w:type="dxa"/>
@@ -1302,7 +1302,7 @@
         </w:tc>
         <w:tc>
           <w:tcPr>
-            <w:tcW w:type="dxa" w:w="1505"/>
+            <w:tcW w:type="dxa" w:w="1584"/>
             <w:shd w:fill="F8FAFC"/>
             <w:tcMar>
               <w:top w:w="70" w:type="dxa"/>
@@ -1313,7 +1313,7 @@
           </w:tcPr>
           <w:p>
             <w:pPr>
-              <w:jc w:val="center"/>
+              <w:jc w:val="left"/>
             </w:pPr>
             <w:r>
               <w:rPr>
@@ -1325,7 +1325,7 @@
         </w:tc>
         <w:tc>
           <w:tcPr>
-            <w:tcW w:type="dxa" w:w="1505"/>
+            <w:tcW w:type="dxa" w:w="1440"/>
             <w:shd w:fill="F8FAFC"/>
             <w:tcMar>
               <w:top w:w="70" w:type="dxa"/>
@@ -1348,7 +1348,53 @@
         </w:tc>
         <w:tc>
           <w:tcPr>
-            <w:tcW w:type="dxa" w:w="1505"/>
+            <w:tcW w:type="dxa" w:w="1512"/>
+            <w:shd w:fill="F8FAFC"/>
+            <w:tcMar>
+              <w:top w:w="70" w:type="dxa"/>
+              <w:bottom w:w="70" w:type="dxa"/>
+              <w:left w:w="100" w:type="dxa"/>
+              <w:right w:w="100" w:type="dxa"/>
+            </w:tcMar>
+          </w:tcPr>
+          <w:p>
+            <w:pPr>
+              <w:jc w:val="center"/>
+            </w:pPr>
+            <w:r>
+              <w:rPr>
+                <w:sz w:val="17"/>
+              </w:rPr>
+              <w:t>Decentralized / private</w:t>
+            </w:r>
+          </w:p>
+        </w:tc>
+        <w:tc>
+          <w:tcPr>
+            <w:tcW w:type="dxa" w:w="1152"/>
+            <w:shd w:fill="F8FAFC"/>
+            <w:tcMar>
+              <w:top w:w="70" w:type="dxa"/>
+              <w:bottom w:w="70" w:type="dxa"/>
+              <w:left w:w="100" w:type="dxa"/>
+              <w:right w:w="100" w:type="dxa"/>
+            </w:tcMar>
+          </w:tcPr>
+          <w:p>
+            <w:pPr>
+              <w:jc w:val="center"/>
+            </w:pPr>
+            <w:r>
+              <w:rPr>
+                <w:sz w:val="17"/>
+              </w:rPr>
+              <w:t>No</w:t>
+            </w:r>
+          </w:p>
+        </w:tc>
+        <w:tc>
+          <w:tcPr>
+            <w:tcW w:type="dxa" w:w="2160"/>
             <w:shd w:fill="F8FAFC"/>
             <w:tcMar>
               <w:top w:w="70" w:type="dxa"/>
@@ -1365,53 +1411,7 @@
               <w:rPr>
                 <w:sz w:val="17"/>
               </w:rPr>
-              <w:t>Decentralized / private</w:t>
-            </w:r>
-          </w:p>
-        </w:tc>
-        <w:tc>
-          <w:tcPr>
-            <w:tcW w:type="dxa" w:w="1505"/>
-            <w:shd w:fill="F8FAFC"/>
-            <w:tcMar>
-              <w:top w:w="70" w:type="dxa"/>
-              <w:bottom w:w="70" w:type="dxa"/>
-              <w:left w:w="100" w:type="dxa"/>
-              <w:right w:w="100" w:type="dxa"/>
-            </w:tcMar>
-          </w:tcPr>
-          <w:p>
-            <w:pPr>
-              <w:jc w:val="left"/>
-            </w:pPr>
-            <w:r>
-              <w:rPr>
-                <w:sz w:val="17"/>
-              </w:rPr>
-              <w:t>No</w:t>
-            </w:r>
-          </w:p>
-        </w:tc>
-        <w:tc>
-          <w:tcPr>
-            <w:tcW w:type="dxa" w:w="1505"/>
-            <w:shd w:fill="F8FAFC"/>
-            <w:tcMar>
-              <w:top w:w="70" w:type="dxa"/>
-              <w:bottom w:w="70" w:type="dxa"/>
-              <w:left w:w="100" w:type="dxa"/>
-              <w:right w:w="100" w:type="dxa"/>
-            </w:tcMar>
-          </w:tcPr>
-          <w:p>
-            <w:pPr>
-              <w:jc w:val="left"/>
-            </w:pPr>
-            <w:r>
-              <w:rPr>
-                <w:sz w:val="17"/>
-              </w:rPr>
-              <w:t>Focuses on on-street crowdsensing; lacks local linear baselines</w:t>
+              <w:t>On-street crowdsensing focus; lacks simple persistence and linear baselines</w:t>
             </w:r>
           </w:p>
         </w:tc>
@@ -1419,7 +1419,7 @@
       <w:tr>
         <w:tc>
           <w:tcPr>
-            <w:tcW w:type="dxa" w:w="1505"/>
+            <w:tcW w:type="dxa" w:w="1512"/>
             <w:shd w:fill="FFFFFF"/>
             <w:tcMar>
               <w:top w:w="70" w:type="dxa"/>
@@ -1442,7 +1442,7 @@
         </w:tc>
         <w:tc>
           <w:tcPr>
-            <w:tcW w:type="dxa" w:w="1505"/>
+            <w:tcW w:type="dxa" w:w="1584"/>
             <w:shd w:fill="FFFFFF"/>
             <w:tcMar>
               <w:top w:w="70" w:type="dxa"/>
@@ -1453,7 +1453,7 @@
           </w:tcPr>
           <w:p>
             <w:pPr>
-              <w:jc w:val="center"/>
+              <w:jc w:val="left"/>
             </w:pPr>
             <w:r>
               <w:rPr>
@@ -1465,7 +1465,7 @@
         </w:tc>
         <w:tc>
           <w:tcPr>
-            <w:tcW w:type="dxa" w:w="1505"/>
+            <w:tcW w:type="dxa" w:w="1440"/>
             <w:shd w:fill="FFFFFF"/>
             <w:tcMar>
               <w:top w:w="70" w:type="dxa"/>
@@ -1488,7 +1488,53 @@
         </w:tc>
         <w:tc>
           <w:tcPr>
-            <w:tcW w:type="dxa" w:w="1505"/>
+            <w:tcW w:type="dxa" w:w="1512"/>
+            <w:shd w:fill="FFFFFF"/>
+            <w:tcMar>
+              <w:top w:w="70" w:type="dxa"/>
+              <w:bottom w:w="70" w:type="dxa"/>
+              <w:left w:w="100" w:type="dxa"/>
+              <w:right w:w="100" w:type="dxa"/>
+            </w:tcMar>
+          </w:tcPr>
+          <w:p>
+            <w:pPr>
+              <w:jc w:val="center"/>
+            </w:pPr>
+            <w:r>
+              <w:rPr>
+                <w:sz w:val="17"/>
+              </w:rPr>
+              <w:t>Decentralized / private</w:t>
+            </w:r>
+          </w:p>
+        </w:tc>
+        <w:tc>
+          <w:tcPr>
+            <w:tcW w:type="dxa" w:w="1152"/>
+            <w:shd w:fill="FFFFFF"/>
+            <w:tcMar>
+              <w:top w:w="70" w:type="dxa"/>
+              <w:bottom w:w="70" w:type="dxa"/>
+              <w:left w:w="100" w:type="dxa"/>
+              <w:right w:w="100" w:type="dxa"/>
+            </w:tcMar>
+          </w:tcPr>
+          <w:p>
+            <w:pPr>
+              <w:jc w:val="center"/>
+            </w:pPr>
+            <w:r>
+              <w:rPr>
+                <w:sz w:val="17"/>
+              </w:rPr>
+              <w:t>No</w:t>
+            </w:r>
+          </w:p>
+        </w:tc>
+        <w:tc>
+          <w:tcPr>
+            <w:tcW w:type="dxa" w:w="2160"/>
             <w:shd w:fill="FFFFFF"/>
             <w:tcMar>
               <w:top w:w="70" w:type="dxa"/>
@@ -1505,53 +1551,7 @@
               <w:rPr>
                 <w:sz w:val="17"/>
               </w:rPr>
-              <w:t>Decentralized / private</w:t>
-            </w:r>
-          </w:p>
-        </w:tc>
-        <w:tc>
-          <w:tcPr>
-            <w:tcW w:type="dxa" w:w="1505"/>
-            <w:shd w:fill="FFFFFF"/>
-            <w:tcMar>
-              <w:top w:w="70" w:type="dxa"/>
-              <w:bottom w:w="70" w:type="dxa"/>
-              <w:left w:w="100" w:type="dxa"/>
-              <w:right w:w="100" w:type="dxa"/>
-            </w:tcMar>
-          </w:tcPr>
-          <w:p>
-            <w:pPr>
-              <w:jc w:val="left"/>
-            </w:pPr>
-            <w:r>
-              <w:rPr>
-                <w:sz w:val="17"/>
-              </w:rPr>
-              <w:t>No</w:t>
-            </w:r>
-          </w:p>
-        </w:tc>
-        <w:tc>
-          <w:tcPr>
-            <w:tcW w:type="dxa" w:w="1505"/>
-            <w:shd w:fill="FFFFFF"/>
-            <w:tcMar>
-              <w:top w:w="70" w:type="dxa"/>
-              <w:bottom w:w="70" w:type="dxa"/>
-              <w:left w:w="100" w:type="dxa"/>
-              <w:right w:w="100" w:type="dxa"/>
-            </w:tcMar>
-          </w:tcPr>
-          <w:p>
-            <w:pPr>
-              <w:jc w:val="left"/>
-            </w:pPr>
-            <w:r>
-              <w:rPr>
-                <w:sz w:val="17"/>
-              </w:rPr>
-              <w:t>Does not evaluate smart parking or local linear baselines</w:t>
+              <w:t>Passenger flow domain; lacks smart parking and local baseline analysis</w:t>
             </w:r>
           </w:p>
         </w:tc>
@@ -1559,7 +1559,7 @@
       <w:tr>
         <w:tc>
           <w:tcPr>
-            <w:tcW w:type="dxa" w:w="1505"/>
+            <w:tcW w:type="dxa" w:w="1512"/>
             <w:shd w:fill="F8FAFC"/>
             <w:tcMar>
               <w:top w:w="70" w:type="dxa"/>
@@ -1582,7 +1582,7 @@
         </w:tc>
         <w:tc>
           <w:tcPr>
-            <w:tcW w:type="dxa" w:w="1505"/>
+            <w:tcW w:type="dxa" w:w="1584"/>
             <w:shd w:fill="F8FAFC"/>
             <w:tcMar>
               <w:top w:w="70" w:type="dxa"/>
@@ -1593,19 +1593,19 @@
           </w:tcPr>
           <w:p>
             <w:pPr>
-              <w:jc w:val="center"/>
+              <w:jc w:val="left"/>
             </w:pPr>
             <w:r>
               <w:rPr>
                 <w:sz w:val="17"/>
               </w:rPr>
-              <w:t>Personalized Fed-Attention-LSTM</w:t>
+              <w:t>Empirical FL &amp; Local Baselines</w:t>
             </w:r>
           </w:p>
         </w:tc>
         <w:tc>
           <w:tcPr>
-            <w:tcW w:type="dxa" w:w="1505"/>
+            <w:tcW w:type="dxa" w:w="1440"/>
             <w:shd w:fill="F8FAFC"/>
             <w:tcMar>
               <w:top w:w="70" w:type="dxa"/>
@@ -1628,7 +1628,53 @@
         </w:tc>
         <w:tc>
           <w:tcPr>
-            <w:tcW w:type="dxa" w:w="1505"/>
+            <w:tcW w:type="dxa" w:w="1512"/>
+            <w:shd w:fill="F8FAFC"/>
+            <w:tcMar>
+              <w:top w:w="70" w:type="dxa"/>
+              <w:bottom w:w="70" w:type="dxa"/>
+              <w:left w:w="100" w:type="dxa"/>
+              <w:right w:w="100" w:type="dxa"/>
+            </w:tcMar>
+          </w:tcPr>
+          <w:p>
+            <w:pPr>
+              <w:jc w:val="center"/>
+            </w:pPr>
+            <w:r>
+              <w:rPr>
+                <w:sz w:val="17"/>
+              </w:rPr>
+              <w:t>Decentralized containment / Multi-operator governance</w:t>
+            </w:r>
+          </w:p>
+        </w:tc>
+        <w:tc>
+          <w:tcPr>
+            <w:tcW w:type="dxa" w:w="1152"/>
+            <w:shd w:fill="F8FAFC"/>
+            <w:tcMar>
+              <w:top w:w="70" w:type="dxa"/>
+              <w:bottom w:w="70" w:type="dxa"/>
+              <w:left w:w="100" w:type="dxa"/>
+              <w:right w:w="100" w:type="dxa"/>
+            </w:tcMar>
+          </w:tcPr>
+          <w:p>
+            <w:pPr>
+              <w:jc w:val="center"/>
+            </w:pPr>
+            <w:r>
+              <w:rPr>
+                <w:sz w:val="17"/>
+              </w:rPr>
+              <w:t>Yes (Persistence + Local Linear)</w:t>
+            </w:r>
+          </w:p>
+        </w:tc>
+        <w:tc>
+          <w:tcPr>
+            <w:tcW w:type="dxa" w:w="2160"/>
             <w:shd w:fill="F8FAFC"/>
             <w:tcMar>
               <w:top w:w="70" w:type="dxa"/>
@@ -1645,53 +1691,7 @@
               <w:rPr>
                 <w:sz w:val="17"/>
               </w:rPr>
-              <w:t>Decentralized containment / Multi-operator governance</w:t>
-            </w:r>
-          </w:p>
-        </w:tc>
-        <w:tc>
-          <w:tcPr>
-            <w:tcW w:type="dxa" w:w="1505"/>
-            <w:shd w:fill="F8FAFC"/>
-            <w:tcMar>
-              <w:top w:w="70" w:type="dxa"/>
-              <w:bottom w:w="70" w:type="dxa"/>
-              <w:left w:w="100" w:type="dxa"/>
-              <w:right w:w="100" w:type="dxa"/>
-            </w:tcMar>
-          </w:tcPr>
-          <w:p>
-            <w:pPr>
-              <w:jc w:val="left"/>
-            </w:pPr>
-            <w:r>
-              <w:rPr>
-                <w:sz w:val="17"/>
-              </w:rPr>
-              <w:t>Yes (Persistence + Local Linear)</w:t>
-            </w:r>
-          </w:p>
-        </w:tc>
-        <w:tc>
-          <w:tcPr>
-            <w:tcW w:type="dxa" w:w="1505"/>
-            <w:shd w:fill="F8FAFC"/>
-            <w:tcMar>
-              <w:top w:w="70" w:type="dxa"/>
-              <w:bottom w:w="70" w:type="dxa"/>
-              <w:left w:w="100" w:type="dxa"/>
-              <w:right w:w="100" w:type="dxa"/>
-            </w:tcMar>
-          </w:tcPr>
-          <w:p>
-            <w:pPr>
-              <w:jc w:val="left"/>
-            </w:pPr>
-            <w:r>
-              <w:rPr>
-                <w:sz w:val="17"/>
-              </w:rPr>
-              <w:t>Evaluated on single municipal stream; 73-day span</w:t>
+              <w:t>Single municipal dataset; within-day bilateral interpolation</w:t>
             </w:r>
           </w:p>
         </w:tc>
@@ -2520,7 +2520,7 @@
           <w:i w:val="0"/>
           <w:sz w:val="19"/>
         </w:rPr>
-        <w:t>2. Comprehensive Multi-Horizon Smart Parking Benchmark across 30 Heterogeneous Facilities (3,263 Unified Test Windows with Embargo Purge Gaps; Evaluated under Primary Benchmark Protocol, Seed = 42, B = 32).</w:t>
+        <w:t>2. Comprehensive Multi-Horizon Smart Parking Benchmark across 30 Heterogeneous Facilities (3,263 Unified Test Windows with Embargo Purge Gaps; Multi-Seed Mean ± Std across Seeds {42, 101, 2024}, B = 32).</w:t>
       </w:r>
     </w:p>
     <w:tbl>
@@ -2792,7 +2792,7 @@
                 <w:b/>
                 <w:sz w:val="16"/>
               </w:rPr>
-              <w:t>0.0256</w:t>
+              <w:t>0.0256 ± 0.0000</w:t>
             </w:r>
           </w:p>
         </w:tc>
@@ -2816,7 +2816,7 @@
                 <w:b/>
                 <w:sz w:val="16"/>
               </w:rPr>
-              <w:t>0.0386</w:t>
+              <w:t>0.0387 ± 0.0000</w:t>
             </w:r>
           </w:p>
         </w:tc>
@@ -2840,7 +2840,7 @@
                 <w:b/>
                 <w:sz w:val="16"/>
               </w:rPr>
-              <w:t>0.0249</w:t>
+              <w:t>0.0247 ± 0.0000</w:t>
             </w:r>
           </w:p>
         </w:tc>
@@ -2864,7 +2864,7 @@
                 <w:b/>
                 <w:sz w:val="16"/>
               </w:rPr>
-              <w:t>0.0134</w:t>
+              <w:t>0.0135 ± 0.0000</w:t>
             </w:r>
           </w:p>
         </w:tc>
@@ -2888,7 +2888,7 @@
                 <w:b/>
                 <w:sz w:val="16"/>
               </w:rPr>
-              <w:t>33.4</w:t>
+              <w:t>33.3 ± 0.0</w:t>
             </w:r>
           </w:p>
         </w:tc>
@@ -2961,7 +2961,7 @@
                 <w:b/>
                 <w:sz w:val="16"/>
               </w:rPr>
-              <w:t>0.0126</w:t>
+              <w:t>0.0126 ± 0.0000</w:t>
             </w:r>
           </w:p>
         </w:tc>
@@ -2985,7 +2985,7 @@
                 <w:b/>
                 <w:sz w:val="16"/>
               </w:rPr>
-              <w:t>0.0179</w:t>
+              <w:t>0.0179 ± 0.0000</w:t>
             </w:r>
           </w:p>
         </w:tc>
@@ -3009,7 +3009,7 @@
                 <w:b/>
                 <w:sz w:val="16"/>
               </w:rPr>
-              <w:t>0.0125</w:t>
+              <w:t>0.0124 ± 0.0000</w:t>
             </w:r>
           </w:p>
         </w:tc>
@@ -3033,7 +3033,7 @@
                 <w:b/>
                 <w:sz w:val="16"/>
               </w:rPr>
-              <w:t>0.0049</w:t>
+              <w:t>0.0049 ± 0.0000</w:t>
             </w:r>
           </w:p>
         </w:tc>
@@ -3057,7 +3057,7 @@
                 <w:b/>
                 <w:sz w:val="16"/>
               </w:rPr>
-              <w:t>13.9</w:t>
+              <w:t>13.9 ± 0.0</w:t>
             </w:r>
           </w:p>
         </w:tc>
@@ -3127,7 +3127,7 @@
               <w:rPr>
                 <w:sz w:val="16"/>
               </w:rPr>
-              <w:t>0.0129</w:t>
+              <w:t>0.0129 ± 0.0000</w:t>
             </w:r>
           </w:p>
         </w:tc>
@@ -3150,7 +3150,7 @@
               <w:rPr>
                 <w:sz w:val="16"/>
               </w:rPr>
-              <w:t>0.0189</w:t>
+              <w:t>0.0190 ± 0.0000</w:t>
             </w:r>
           </w:p>
         </w:tc>
@@ -3173,7 +3173,7 @@
               <w:rPr>
                 <w:sz w:val="16"/>
               </w:rPr>
-              <w:t>0.0130</w:t>
+              <w:t>0.0132 ± 0.0000</w:t>
             </w:r>
           </w:p>
         </w:tc>
@@ -3196,7 +3196,7 @@
               <w:rPr>
                 <w:sz w:val="16"/>
               </w:rPr>
-              <w:t>0.0049</w:t>
+              <w:t>0.0050 ± 0.0000</w:t>
             </w:r>
           </w:p>
         </w:tc>
@@ -3219,7 +3219,7 @@
               <w:rPr>
                 <w:sz w:val="16"/>
               </w:rPr>
-              <w:t>14.7</w:t>
+              <w:t>14.8 ± 0.0</w:t>
             </w:r>
           </w:p>
         </w:tc>
@@ -3289,7 +3289,7 @@
               <w:rPr>
                 <w:sz w:val="16"/>
               </w:rPr>
-              <w:t>0.0145</w:t>
+              <w:t>0.0133 ± 0.0000</w:t>
             </w:r>
           </w:p>
         </w:tc>
@@ -3312,7 +3312,7 @@
               <w:rPr>
                 <w:sz w:val="16"/>
               </w:rPr>
-              <w:t>0.0201</w:t>
+              <w:t>0.0187 ± 0.0000</w:t>
             </w:r>
           </w:p>
         </w:tc>
@@ -3335,7 +3335,7 @@
               <w:rPr>
                 <w:sz w:val="16"/>
               </w:rPr>
-              <w:t>0.0152</w:t>
+              <w:t>0.0141 ± 0.0000</w:t>
             </w:r>
           </w:p>
         </w:tc>
@@ -3358,7 +3358,7 @@
               <w:rPr>
                 <w:sz w:val="16"/>
               </w:rPr>
-              <w:t>0.0057</w:t>
+              <w:t>0.0056 ± 0.0000</w:t>
             </w:r>
           </w:p>
         </w:tc>
@@ -3381,7 +3381,7 @@
               <w:rPr>
                 <w:sz w:val="16"/>
               </w:rPr>
-              <w:t>17.5</w:t>
+              <w:t>15.8 ± 0.0</w:t>
             </w:r>
           </w:p>
         </w:tc>
@@ -3451,7 +3451,7 @@
               <w:rPr>
                 <w:sz w:val="16"/>
               </w:rPr>
-              <w:t>0.0218</w:t>
+              <w:t>0.0218 ± 0.0005</w:t>
             </w:r>
           </w:p>
         </w:tc>
@@ -3474,7 +3474,7 @@
               <w:rPr>
                 <w:sz w:val="16"/>
               </w:rPr>
-              <w:t>0.0300</w:t>
+              <w:t>0.0300 ± 0.0004</w:t>
             </w:r>
           </w:p>
         </w:tc>
@@ -3497,7 +3497,7 @@
               <w:rPr>
                 <w:sz w:val="16"/>
               </w:rPr>
-              <w:t>0.0232</w:t>
+              <w:t>0.0233 ± 0.0004</w:t>
             </w:r>
           </w:p>
         </w:tc>
@@ -3520,7 +3520,7 @@
               <w:rPr>
                 <w:sz w:val="16"/>
               </w:rPr>
-              <w:t>0.0129</w:t>
+              <w:t>0.0131 ± 0.0003</w:t>
             </w:r>
           </w:p>
         </w:tc>
@@ -3543,7 +3543,7 @@
               <w:rPr>
                 <w:sz w:val="16"/>
               </w:rPr>
-              <w:t>25.2</w:t>
+              <w:t>25.2 ± 0.4</w:t>
             </w:r>
           </w:p>
         </w:tc>
@@ -3613,7 +3613,7 @@
               <w:rPr>
                 <w:sz w:val="16"/>
               </w:rPr>
-              <w:t>0.0217</w:t>
+              <w:t>0.0217 ± 0.0004</w:t>
             </w:r>
           </w:p>
         </w:tc>
@@ -3636,7 +3636,7 @@
               <w:rPr>
                 <w:sz w:val="16"/>
               </w:rPr>
-              <w:t>0.0285</w:t>
+              <w:t>0.0285 ± 0.0003</w:t>
             </w:r>
           </w:p>
         </w:tc>
@@ -3659,7 +3659,7 @@
               <w:rPr>
                 <w:sz w:val="16"/>
               </w:rPr>
-              <w:t>0.0230</w:t>
+              <w:t>0.0230 ± 0.0003</w:t>
             </w:r>
           </w:p>
         </w:tc>
@@ -3682,7 +3682,7 @@
               <w:rPr>
                 <w:sz w:val="16"/>
               </w:rPr>
-              <w:t>0.0109</w:t>
+              <w:t>0.0113 ± 0.0002</w:t>
             </w:r>
           </w:p>
         </w:tc>
@@ -3705,7 +3705,7 @@
               <w:rPr>
                 <w:sz w:val="16"/>
               </w:rPr>
-              <w:t>26.9</w:t>
+              <w:t>26.9 ± 0.3</w:t>
             </w:r>
           </w:p>
         </w:tc>
@@ -3775,7 +3775,7 @@
               <w:rPr>
                 <w:sz w:val="16"/>
               </w:rPr>
-              <w:t>0.1006</w:t>
+              <w:t>0.0935 ± 0.0032</w:t>
             </w:r>
           </w:p>
         </w:tc>
@@ -3798,7 +3798,7 @@
               <w:rPr>
                 <w:sz w:val="16"/>
               </w:rPr>
-              <w:t>0.1309</w:t>
+              <w:t>0.1230 ± 0.0030</w:t>
             </w:r>
           </w:p>
         </w:tc>
@@ -3821,7 +3821,7 @@
               <w:rPr>
                 <w:sz w:val="16"/>
               </w:rPr>
-              <w:t>0.1030</w:t>
+              <w:t>0.0963 ± 0.0029</w:t>
             </w:r>
           </w:p>
         </w:tc>
@@ -3844,7 +3844,7 @@
               <w:rPr>
                 <w:sz w:val="16"/>
               </w:rPr>
-              <w:t>0.0534</w:t>
+              <w:t>0.0498 ± 0.0013</w:t>
             </w:r>
           </w:p>
         </w:tc>
@@ -3867,7 +3867,7 @@
               <w:rPr>
                 <w:sz w:val="16"/>
               </w:rPr>
-              <w:t>126.8</w:t>
+              <w:t>118.5 ± 2.6</w:t>
             </w:r>
           </w:p>
         </w:tc>
@@ -3916,7 +3916,7 @@
                 <w:b/>
                 <w:sz w:val="16"/>
               </w:rPr>
-              <w:t>Personalized FedAvg (Ours)</w:t>
+              <w:t>Personalized FedAvg (Local Adaptation)</w:t>
             </w:r>
           </w:p>
         </w:tc>
@@ -3940,7 +3940,7 @@
                 <w:b/>
                 <w:sz w:val="16"/>
               </w:rPr>
-              <w:t>0.0607</w:t>
+              <w:t>0.0592 ± 0.0004</w:t>
             </w:r>
           </w:p>
         </w:tc>
@@ -3964,7 +3964,7 @@
                 <w:b/>
                 <w:sz w:val="16"/>
               </w:rPr>
-              <w:t>0.0818</w:t>
+              <w:t>0.0786 ± 0.0001</w:t>
             </w:r>
           </w:p>
         </w:tc>
@@ -3988,7 +3988,7 @@
                 <w:b/>
                 <w:sz w:val="16"/>
               </w:rPr>
-              <w:t>0.0627</w:t>
+              <w:t>0.0612 ± 0.0001</w:t>
             </w:r>
           </w:p>
         </w:tc>
@@ -4012,7 +4012,7 @@
                 <w:b/>
                 <w:sz w:val="16"/>
               </w:rPr>
-              <w:t>0.0279</w:t>
+              <w:t>0.0243 ± 0.0014</w:t>
             </w:r>
           </w:p>
         </w:tc>
@@ -4036,7 +4036,7 @@
                 <w:b/>
                 <w:sz w:val="16"/>
               </w:rPr>
-              <w:t>73.2</w:t>
+              <w:t>82.4 ± 0.4</w:t>
             </w:r>
           </w:p>
         </w:tc>
@@ -4110,7 +4110,7 @@
                 <w:b/>
                 <w:sz w:val="16"/>
               </w:rPr>
-              <w:t>0.0492</w:t>
+              <w:t>0.0493 ± 0.0000</w:t>
             </w:r>
           </w:p>
         </w:tc>
@@ -4134,7 +4134,7 @@
                 <w:b/>
                 <w:sz w:val="16"/>
               </w:rPr>
-              <w:t>0.0715</w:t>
+              <w:t>0.0716 ± 0.0000</w:t>
             </w:r>
           </w:p>
         </w:tc>
@@ -4158,7 +4158,7 @@
                 <w:b/>
                 <w:sz w:val="16"/>
               </w:rPr>
-              <w:t>0.0477</w:t>
+              <w:t>0.0476 ± 0.0000</w:t>
             </w:r>
           </w:p>
         </w:tc>
@@ -4182,7 +4182,7 @@
                 <w:b/>
                 <w:sz w:val="16"/>
               </w:rPr>
-              <w:t>0.0250</w:t>
+              <w:t>0.0252 ± 0.0000</w:t>
             </w:r>
           </w:p>
         </w:tc>
@@ -4206,7 +4206,7 @@
                 <w:b/>
                 <w:sz w:val="16"/>
               </w:rPr>
-              <w:t>64.2</w:t>
+              <w:t>64.2 ± 0.0</w:t>
             </w:r>
           </w:p>
         </w:tc>
@@ -4279,7 +4279,7 @@
                 <w:b/>
                 <w:sz w:val="16"/>
               </w:rPr>
-              <w:t>0.0248</w:t>
+              <w:t>0.0248 ± 0.0000</w:t>
             </w:r>
           </w:p>
         </w:tc>
@@ -4303,7 +4303,7 @@
                 <w:b/>
                 <w:sz w:val="16"/>
               </w:rPr>
-              <w:t>0.0350</w:t>
+              <w:t>0.0350 ± 0.0000</w:t>
             </w:r>
           </w:p>
         </w:tc>
@@ -4327,7 +4327,7 @@
                 <w:b/>
                 <w:sz w:val="16"/>
               </w:rPr>
-              <w:t>0.0243</w:t>
+              <w:t>0.0242 ± 0.0000</w:t>
             </w:r>
           </w:p>
         </w:tc>
@@ -4351,7 +4351,7 @@
                 <w:b/>
                 <w:sz w:val="16"/>
               </w:rPr>
-              <w:t>0.0094</w:t>
+              <w:t>0.0096 ± 0.0000</w:t>
             </w:r>
           </w:p>
         </w:tc>
@@ -4375,7 +4375,7 @@
                 <w:b/>
                 <w:sz w:val="16"/>
               </w:rPr>
-              <w:t>28.4</w:t>
+              <w:t>28.4 ± 0.0</w:t>
             </w:r>
           </w:p>
         </w:tc>
@@ -4445,7 +4445,7 @@
               <w:rPr>
                 <w:sz w:val="16"/>
               </w:rPr>
-              <w:t>0.0259</w:t>
+              <w:t>0.0260 ± 0.0000</w:t>
             </w:r>
           </w:p>
         </w:tc>
@@ -4468,7 +4468,7 @@
               <w:rPr>
                 <w:sz w:val="16"/>
               </w:rPr>
-              <w:t>0.0375</w:t>
+              <w:t>0.0376 ± 0.0000</w:t>
             </w:r>
           </w:p>
         </w:tc>
@@ -4491,7 +4491,7 @@
               <w:rPr>
                 <w:sz w:val="16"/>
               </w:rPr>
-              <w:t>0.0266</w:t>
+              <w:t>0.0267 ± 0.0000</w:t>
             </w:r>
           </w:p>
         </w:tc>
@@ -4514,7 +4514,7 @@
               <w:rPr>
                 <w:sz w:val="16"/>
               </w:rPr>
-              <w:t>0.0095</w:t>
+              <w:t>0.0096 ± 0.0000</w:t>
             </w:r>
           </w:p>
         </w:tc>
@@ -4537,7 +4537,7 @@
               <w:rPr>
                 <w:sz w:val="16"/>
               </w:rPr>
-              <w:t>30.4</w:t>
+              <w:t>30.6 ± 0.0</w:t>
             </w:r>
           </w:p>
         </w:tc>
@@ -4607,7 +4607,7 @@
               <w:rPr>
                 <w:sz w:val="16"/>
               </w:rPr>
-              <w:t>0.0245</w:t>
+              <w:t>0.0233 ± 0.0000</w:t>
             </w:r>
           </w:p>
         </w:tc>
@@ -4630,7 +4630,7 @@
               <w:rPr>
                 <w:sz w:val="16"/>
               </w:rPr>
-              <w:t>0.0343</w:t>
+              <w:t>0.0325 ± 0.0000</w:t>
             </w:r>
           </w:p>
         </w:tc>
@@ -4653,7 +4653,7 @@
               <w:rPr>
                 <w:sz w:val="16"/>
               </w:rPr>
-              <w:t>0.0264</w:t>
+              <w:t>0.0254 ± 0.0000</w:t>
             </w:r>
           </w:p>
         </w:tc>
@@ -4676,7 +4676,7 @@
               <w:rPr>
                 <w:sz w:val="16"/>
               </w:rPr>
-              <w:t>0.0112</w:t>
+              <w:t>0.0116 ± 0.0000</w:t>
             </w:r>
           </w:p>
         </w:tc>
@@ -4699,7 +4699,7 @@
               <w:rPr>
                 <w:sz w:val="16"/>
               </w:rPr>
-              <w:t>30.1</w:t>
+              <w:t>28.4 ± 0.0</w:t>
             </w:r>
           </w:p>
         </w:tc>
@@ -4769,7 +4769,7 @@
               <w:rPr>
                 <w:sz w:val="16"/>
               </w:rPr>
-              <w:t>0.0291</w:t>
+              <w:t>0.0291 ± 0.0006</w:t>
             </w:r>
           </w:p>
         </w:tc>
@@ -4792,7 +4792,7 @@
               <w:rPr>
                 <w:sz w:val="16"/>
               </w:rPr>
-              <w:t>0.0402</w:t>
+              <w:t>0.0402 ± 0.0005</w:t>
             </w:r>
           </w:p>
         </w:tc>
@@ -4815,7 +4815,7 @@
               <w:rPr>
                 <w:sz w:val="16"/>
               </w:rPr>
-              <w:t>0.0305</w:t>
+              <w:t>0.0304 ± 0.0005</w:t>
             </w:r>
           </w:p>
         </w:tc>
@@ -4838,7 +4838,7 @@
               <w:rPr>
                 <w:sz w:val="16"/>
               </w:rPr>
-              <w:t>0.0117</w:t>
+              <w:t>0.0118 ± 0.0004</w:t>
             </w:r>
           </w:p>
         </w:tc>
@@ -4861,7 +4861,7 @@
               <w:rPr>
                 <w:sz w:val="16"/>
               </w:rPr>
-              <w:t>35.5</w:t>
+              <w:t>35.5 ± 0.5</w:t>
             </w:r>
           </w:p>
         </w:tc>
@@ -4931,7 +4931,7 @@
               <w:rPr>
                 <w:sz w:val="16"/>
               </w:rPr>
-              <w:t>0.0304</w:t>
+              <w:t>0.0305 ± 0.0005</w:t>
             </w:r>
           </w:p>
         </w:tc>
@@ -4954,7 +4954,7 @@
               <w:rPr>
                 <w:sz w:val="16"/>
               </w:rPr>
-              <w:t>0.0415</w:t>
+              <w:t>0.0416 ± 0.0004</w:t>
             </w:r>
           </w:p>
         </w:tc>
@@ -4977,7 +4977,7 @@
               <w:rPr>
                 <w:sz w:val="16"/>
               </w:rPr>
-              <w:t>0.0316</w:t>
+              <w:t>0.0318 ± 0.0004</w:t>
             </w:r>
           </w:p>
         </w:tc>
@@ -5000,7 +5000,7 @@
               <w:rPr>
                 <w:sz w:val="16"/>
               </w:rPr>
-              <w:t>0.0118</w:t>
+              <w:t>0.0120 ± 0.0003</w:t>
             </w:r>
           </w:p>
         </w:tc>
@@ -5023,7 +5023,7 @@
               <w:rPr>
                 <w:sz w:val="16"/>
               </w:rPr>
-              <w:t>37.2</w:t>
+              <w:t>37.4 ± 0.4</w:t>
             </w:r>
           </w:p>
         </w:tc>
@@ -5093,7 +5093,7 @@
               <w:rPr>
                 <w:sz w:val="16"/>
               </w:rPr>
-              <w:t>0.1078</w:t>
+              <w:t>0.1078 ± 0.0035</w:t>
             </w:r>
           </w:p>
         </w:tc>
@@ -5116,7 +5116,7 @@
               <w:rPr>
                 <w:sz w:val="16"/>
               </w:rPr>
-              <w:t>0.1416</w:t>
+              <w:t>0.1415 ± 0.0032</w:t>
             </w:r>
           </w:p>
         </w:tc>
@@ -5139,7 +5139,7 @@
               <w:rPr>
                 <w:sz w:val="16"/>
               </w:rPr>
-              <w:t>0.1106</w:t>
+              <w:t>0.1109 ± 0.0031</w:t>
             </w:r>
           </w:p>
         </w:tc>
@@ -5162,7 +5162,7 @@
               <w:rPr>
                 <w:sz w:val="16"/>
               </w:rPr>
-              <w:t>0.0552</w:t>
+              <w:t>0.0560 ± 0.0015</w:t>
             </w:r>
           </w:p>
         </w:tc>
@@ -5185,7 +5185,7 @@
               <w:rPr>
                 <w:sz w:val="16"/>
               </w:rPr>
-              <w:t>137.1</w:t>
+              <w:t>137.1 ± 3.1</w:t>
             </w:r>
           </w:p>
         </w:tc>
@@ -5234,7 +5234,7 @@
                 <w:b/>
                 <w:sz w:val="16"/>
               </w:rPr>
-              <w:t>Personalized FedAvg (Ours)</w:t>
+              <w:t>Personalized FedAvg (Local Adaptation)</w:t>
             </w:r>
           </w:p>
         </w:tc>
@@ -5258,7 +5258,7 @@
                 <w:b/>
                 <w:sz w:val="16"/>
               </w:rPr>
-              <w:t>0.0732</w:t>
+              <w:t>0.0732 ± 0.0005</w:t>
             </w:r>
           </w:p>
         </w:tc>
@@ -5282,7 +5282,7 @@
                 <w:b/>
                 <w:sz w:val="16"/>
               </w:rPr>
-              <w:t>0.0962</w:t>
+              <w:t>0.0962 ± 0.0003</w:t>
             </w:r>
           </w:p>
         </w:tc>
@@ -5306,7 +5306,7 @@
                 <w:b/>
                 <w:sz w:val="16"/>
               </w:rPr>
-              <w:t>0.0750</w:t>
+              <w:t>0.0750 ± 0.0003</w:t>
             </w:r>
           </w:p>
         </w:tc>
@@ -5330,7 +5330,7 @@
                 <w:b/>
                 <w:sz w:val="16"/>
               </w:rPr>
-              <w:t>0.0263</w:t>
+              <w:t>0.0263 ± 0.0012</w:t>
             </w:r>
           </w:p>
         </w:tc>
@@ -5354,12 +5354,26 @@
                 <w:b/>
                 <w:sz w:val="16"/>
               </w:rPr>
-              <w:t>92.3</w:t>
+              <w:t>92.3 ± 0.6</w:t>
             </w:r>
           </w:p>
         </w:tc>
       </w:tr>
     </w:tbl>
+    <w:p>
+      <w:pPr>
+        <w:spacing w:before="0" w:after="80" w:line="276" w:lineRule="auto"/>
+        <w:jc w:val="both"/>
+      </w:pPr>
+      <w:r>
+        <w:rPr>
+          <w:i/>
+          <w:color w:val="64748B"/>
+          <w:sz w:val="16"/>
+        </w:rPr>
+        <w:t>Note: Baseline models (Persistence, Local Linear, Pooled Linear, and XGBoost) are deterministic and seed-invariant (± 0.0000). For archival reference, the primary single-seed benchmark (Seed = 42) reports: Local Linear MAE = 0.0126 (13.9 bays), Centralized Attention-LSTM MAE = 0.0217 (26.9 bays), Global FedAvg MAE = 0.1006 (126.8 bays), and Personalized FedAvg MAE = 0.0607 (73.2 bays).</w:t>
+      </w:r>
+    </w:p>
     <w:p>
       <w:pPr>
         <w:spacing w:before="0" w:after="120" w:line="276" w:lineRule="auto"/>
@@ -5474,7 +5488,7 @@
           <w:i w:val="0"/>
           <w:sz w:val="19"/>
         </w:rPr>
-        <w:t>3. Empirical Comparison of Decentralized &amp; Federated Personalization Paradigms (30-Minute Horizon, Mean +/- Std across 3 Seeds).</w:t>
+        <w:t>3. Empirical Comparison of Decentralized &amp; Federated Personalization Paradigms across Communication-Constrained (R=8) and Compute-Parity (R=15) Regimes (30-Minute Horizon, Mean ± Std across Seeds {42, 101, 2024}).</w:t>
       </w:r>
     </w:p>
     <w:tbl>
@@ -5492,16 +5506,42 @@
         </w:tblBorders>
       </w:tblPr>
       <w:tblGrid>
-        <w:gridCol w:w="1806"/>
-        <w:gridCol w:w="1806"/>
-        <w:gridCol w:w="1806"/>
-        <w:gridCol w:w="1806"/>
-        <w:gridCol w:w="1806"/>
+        <w:gridCol w:w="1505"/>
+        <w:gridCol w:w="1505"/>
+        <w:gridCol w:w="1505"/>
+        <w:gridCol w:w="1505"/>
+        <w:gridCol w:w="1505"/>
+        <w:gridCol w:w="1505"/>
       </w:tblGrid>
       <w:tr>
         <w:tc>
           <w:tcPr>
-            <w:tcW w:type="dxa" w:w="1806"/>
+            <w:tcW w:type="dxa" w:w="1505"/>
+            <w:shd w:fill="1F3864"/>
+            <w:tcMar>
+              <w:top w:w="100" w:type="dxa"/>
+              <w:bottom w:w="100" w:type="dxa"/>
+              <w:left w:w="100" w:type="dxa"/>
+              <w:right w:w="100" w:type="dxa"/>
+            </w:tcMar>
+          </w:tcPr>
+          <w:p>
+            <w:pPr>
+              <w:jc w:val="center"/>
+            </w:pPr>
+            <w:r>
+              <w:rPr>
+                <w:b/>
+                <w:color w:val="FFFFFF"/>
+                <w:sz w:val="17"/>
+              </w:rPr>
+              <w:t>Regime &amp; Budget</w:t>
+            </w:r>
+          </w:p>
+        </w:tc>
+        <w:tc>
+          <w:tcPr>
+            <w:tcW w:type="dxa" w:w="1505"/>
             <w:shd w:fill="1F3864"/>
             <w:tcMar>
               <w:top w:w="100" w:type="dxa"/>
@@ -5526,7 +5566,7 @@
         </w:tc>
         <w:tc>
           <w:tcPr>
-            <w:tcW w:type="dxa" w:w="1806"/>
+            <w:tcW w:type="dxa" w:w="1505"/>
             <w:shd w:fill="1F3864"/>
             <w:tcMar>
               <w:top w:w="100" w:type="dxa"/>
@@ -5551,7 +5591,7 @@
         </w:tc>
         <w:tc>
           <w:tcPr>
-            <w:tcW w:type="dxa" w:w="1806"/>
+            <w:tcW w:type="dxa" w:w="1505"/>
             <w:shd w:fill="1F3864"/>
             <w:tcMar>
               <w:top w:w="100" w:type="dxa"/>
@@ -5576,7 +5616,7 @@
         </w:tc>
         <w:tc>
           <w:tcPr>
-            <w:tcW w:type="dxa" w:w="1806"/>
+            <w:tcW w:type="dxa" w:w="1505"/>
             <w:shd w:fill="1F3864"/>
             <w:tcMar>
               <w:top w:w="100" w:type="dxa"/>
@@ -5601,7 +5641,7 @@
         </w:tc>
         <w:tc>
           <w:tcPr>
-            <w:tcW w:type="dxa" w:w="1806"/>
+            <w:tcW w:type="dxa" w:w="1505"/>
             <w:shd w:fill="1F3864"/>
             <w:tcMar>
               <w:top w:w="100" w:type="dxa"/>
@@ -5628,7 +5668,7 @@
       <w:tr>
         <w:tc>
           <w:tcPr>
-            <w:tcW w:type="dxa" w:w="1806"/>
+            <w:tcW w:type="dxa" w:w="1505"/>
             <w:shd w:fill="FFFFFF"/>
             <w:tcMar>
               <w:top w:w="60" w:type="dxa"/>
@@ -5643,15 +5683,38 @@
             </w:pPr>
             <w:r>
               <w:rPr>
-                <w:sz w:val="17"/>
+                <w:sz w:val="16"/>
               </w:rPr>
-              <w:t>Global FedAvg (R=8, E=2, B=32) [7]</w:t>
+              <w:t>Communication-Constrained (R=8, E=2, ~7,888 steps)</w:t>
             </w:r>
           </w:p>
         </w:tc>
         <w:tc>
           <w:tcPr>
-            <w:tcW w:type="dxa" w:w="1806"/>
+            <w:tcW w:type="dxa" w:w="1505"/>
+            <w:shd w:fill="FFFFFF"/>
+            <w:tcMar>
+              <w:top w:w="60" w:type="dxa"/>
+              <w:bottom w:w="60" w:type="dxa"/>
+              <w:left w:w="80" w:type="dxa"/>
+              <w:right w:w="80" w:type="dxa"/>
+            </w:tcMar>
+          </w:tcPr>
+          <w:p>
+            <w:pPr>
+              <w:jc w:val="left"/>
+            </w:pPr>
+            <w:r>
+              <w:rPr>
+                <w:sz w:val="16"/>
+              </w:rPr>
+              <w:t>Global FedAvg (R=8, B=32) [7]</w:t>
+            </w:r>
+          </w:p>
+        </w:tc>
+        <w:tc>
+          <w:tcPr>
+            <w:tcW w:type="dxa" w:w="1505"/>
             <w:shd w:fill="FFFFFF"/>
             <w:tcMar>
               <w:top w:w="60" w:type="dxa"/>
@@ -5666,15 +5729,15 @@
             </w:pPr>
             <w:r>
               <w:rPr>
-                <w:sz w:val="17"/>
+                <w:sz w:val="16"/>
               </w:rPr>
-              <w:t>0.0935 +/- 0.0032</w:t>
+              <w:t>0.0935 ± 0.0032</w:t>
             </w:r>
           </w:p>
         </w:tc>
         <w:tc>
           <w:tcPr>
-            <w:tcW w:type="dxa" w:w="1806"/>
+            <w:tcW w:type="dxa" w:w="1505"/>
             <w:shd w:fill="FFFFFF"/>
             <w:tcMar>
               <w:top w:w="60" w:type="dxa"/>
@@ -5689,15 +5752,15 @@
             </w:pPr>
             <w:r>
               <w:rPr>
-                <w:sz w:val="17"/>
+                <w:sz w:val="16"/>
               </w:rPr>
-              <w:t>0.1230 +/- 0.0030</w:t>
+              <w:t>0.1230 ± 0.0030</w:t>
             </w:r>
           </w:p>
         </w:tc>
         <w:tc>
           <w:tcPr>
-            <w:tcW w:type="dxa" w:w="1806"/>
+            <w:tcW w:type="dxa" w:w="1505"/>
             <w:shd w:fill="FFFFFF"/>
             <w:tcMar>
               <w:top w:w="60" w:type="dxa"/>
@@ -5712,15 +5775,15 @@
             </w:pPr>
             <w:r>
               <w:rPr>
-                <w:sz w:val="17"/>
+                <w:sz w:val="16"/>
               </w:rPr>
-              <w:t>0.0963 +/- 0.0029</w:t>
+              <w:t>0.0963 ± 0.0029</w:t>
             </w:r>
           </w:p>
         </w:tc>
         <w:tc>
           <w:tcPr>
-            <w:tcW w:type="dxa" w:w="1806"/>
+            <w:tcW w:type="dxa" w:w="1505"/>
             <w:shd w:fill="FFFFFF"/>
             <w:tcMar>
               <w:top w:w="60" w:type="dxa"/>
@@ -5735,9 +5798,9 @@
             </w:pPr>
             <w:r>
               <w:rPr>
-                <w:sz w:val="17"/>
+                <w:sz w:val="16"/>
               </w:rPr>
-              <w:t>0.0498 +/- 0.0013</w:t>
+              <w:t>0.0498 ± 0.0013</w:t>
             </w:r>
           </w:p>
         </w:tc>
@@ -5745,7 +5808,7 @@
       <w:tr>
         <w:tc>
           <w:tcPr>
-            <w:tcW w:type="dxa" w:w="1806"/>
+            <w:tcW w:type="dxa" w:w="1505"/>
             <w:shd w:fill="F1F5F9"/>
             <w:tcMar>
               <w:top w:w="60" w:type="dxa"/>
@@ -5760,7 +5823,30 @@
             </w:pPr>
             <w:r>
               <w:rPr>
-                <w:sz w:val="17"/>
+                <w:sz w:val="16"/>
+              </w:rPr>
+              <w:t>Communication-Constrained (R=8, E=2, ~7,888 steps)</w:t>
+            </w:r>
+          </w:p>
+        </w:tc>
+        <w:tc>
+          <w:tcPr>
+            <w:tcW w:type="dxa" w:w="1505"/>
+            <w:shd w:fill="F1F5F9"/>
+            <w:tcMar>
+              <w:top w:w="60" w:type="dxa"/>
+              <w:bottom w:w="60" w:type="dxa"/>
+              <w:left w:w="80" w:type="dxa"/>
+              <w:right w:w="80" w:type="dxa"/>
+            </w:tcMar>
+          </w:tcPr>
+          <w:p>
+            <w:pPr>
+              <w:jc w:val="left"/>
+            </w:pPr>
+            <w:r>
+              <w:rPr>
+                <w:sz w:val="16"/>
               </w:rPr>
               <w:t>IID-Shuffled FedAvg Control</w:t>
             </w:r>
@@ -5768,7 +5854,7 @@
         </w:tc>
         <w:tc>
           <w:tcPr>
-            <w:tcW w:type="dxa" w:w="1806"/>
+            <w:tcW w:type="dxa" w:w="1505"/>
             <w:shd w:fill="F1F5F9"/>
             <w:tcMar>
               <w:top w:w="60" w:type="dxa"/>
@@ -5783,15 +5869,15 @@
             </w:pPr>
             <w:r>
               <w:rPr>
-                <w:sz w:val="17"/>
+                <w:sz w:val="16"/>
               </w:rPr>
-              <w:t>0.0678 +/- 0.0019</w:t>
+              <w:t>0.0678 ± 0.0019</w:t>
             </w:r>
           </w:p>
         </w:tc>
         <w:tc>
           <w:tcPr>
-            <w:tcW w:type="dxa" w:w="1806"/>
+            <w:tcW w:type="dxa" w:w="1505"/>
             <w:shd w:fill="F1F5F9"/>
             <w:tcMar>
               <w:top w:w="60" w:type="dxa"/>
@@ -5806,15 +5892,15 @@
             </w:pPr>
             <w:r>
               <w:rPr>
-                <w:sz w:val="17"/>
+                <w:sz w:val="16"/>
               </w:rPr>
-              <w:t>0.0956 +/- 0.0023</w:t>
+              <w:t>0.0956 ± 0.0023</w:t>
             </w:r>
           </w:p>
         </w:tc>
         <w:tc>
           <w:tcPr>
-            <w:tcW w:type="dxa" w:w="1806"/>
+            <w:tcW w:type="dxa" w:w="1505"/>
             <w:shd w:fill="F1F5F9"/>
             <w:tcMar>
               <w:top w:w="60" w:type="dxa"/>
@@ -5829,15 +5915,15 @@
             </w:pPr>
             <w:r>
               <w:rPr>
-                <w:sz w:val="17"/>
+                <w:sz w:val="16"/>
               </w:rPr>
-              <w:t>0.0711 +/- 0.0019</w:t>
+              <w:t>0.0711 ± 0.0019</w:t>
             </w:r>
           </w:p>
         </w:tc>
         <w:tc>
           <w:tcPr>
-            <w:tcW w:type="dxa" w:w="1806"/>
+            <w:tcW w:type="dxa" w:w="1505"/>
             <w:shd w:fill="F1F5F9"/>
             <w:tcMar>
               <w:top w:w="60" w:type="dxa"/>
@@ -5852,9 +5938,9 @@
             </w:pPr>
             <w:r>
               <w:rPr>
-                <w:sz w:val="17"/>
+                <w:sz w:val="16"/>
               </w:rPr>
-              <w:t>0.0361 +/- 0.0012</w:t>
+              <w:t>0.0361 ± 0.0012</w:t>
             </w:r>
           </w:p>
         </w:tc>
@@ -5862,7 +5948,7 @@
       <w:tr>
         <w:tc>
           <w:tcPr>
-            <w:tcW w:type="dxa" w:w="1806"/>
+            <w:tcW w:type="dxa" w:w="1505"/>
             <w:shd w:fill="FFFFFF"/>
             <w:tcMar>
               <w:top w:w="60" w:type="dxa"/>
@@ -5877,7 +5963,30 @@
             </w:pPr>
             <w:r>
               <w:rPr>
-                <w:sz w:val="17"/>
+                <w:sz w:val="16"/>
+              </w:rPr>
+              <w:t>Communication-Constrained (R=8, E=2, ~7,888 steps)</w:t>
+            </w:r>
+          </w:p>
+        </w:tc>
+        <w:tc>
+          <w:tcPr>
+            <w:tcW w:type="dxa" w:w="1505"/>
+            <w:shd w:fill="FFFFFF"/>
+            <w:tcMar>
+              <w:top w:w="60" w:type="dxa"/>
+              <w:bottom w:w="60" w:type="dxa"/>
+              <w:left w:w="80" w:type="dxa"/>
+              <w:right w:w="80" w:type="dxa"/>
+            </w:tcMar>
+          </w:tcPr>
+          <w:p>
+            <w:pPr>
+              <w:jc w:val="left"/>
+            </w:pPr>
+            <w:r>
+              <w:rPr>
+                <w:sz w:val="16"/>
               </w:rPr>
               <w:t>FedProx (mu = 0.01) [19]</w:t>
             </w:r>
@@ -5885,7 +5994,7 @@
         </w:tc>
         <w:tc>
           <w:tcPr>
-            <w:tcW w:type="dxa" w:w="1806"/>
+            <w:tcW w:type="dxa" w:w="1505"/>
             <w:shd w:fill="FFFFFF"/>
             <w:tcMar>
               <w:top w:w="60" w:type="dxa"/>
@@ -5900,15 +6009,15 @@
             </w:pPr>
             <w:r>
               <w:rPr>
-                <w:sz w:val="17"/>
+                <w:sz w:val="16"/>
               </w:rPr>
-              <w:t>0.1305 +/- 0.0162</w:t>
+              <w:t>0.1305 ± 0.0162</w:t>
             </w:r>
           </w:p>
         </w:tc>
         <w:tc>
           <w:tcPr>
-            <w:tcW w:type="dxa" w:w="1806"/>
+            <w:tcW w:type="dxa" w:w="1505"/>
             <w:shd w:fill="FFFFFF"/>
             <w:tcMar>
               <w:top w:w="60" w:type="dxa"/>
@@ -5923,15 +6032,15 @@
             </w:pPr>
             <w:r>
               <w:rPr>
-                <w:sz w:val="17"/>
+                <w:sz w:val="16"/>
               </w:rPr>
-              <w:t>0.1607 +/- 0.0157</w:t>
+              <w:t>0.1607 ± 0.0157</w:t>
             </w:r>
           </w:p>
         </w:tc>
         <w:tc>
           <w:tcPr>
-            <w:tcW w:type="dxa" w:w="1806"/>
+            <w:tcW w:type="dxa" w:w="1505"/>
             <w:shd w:fill="FFFFFF"/>
             <w:tcMar>
               <w:top w:w="60" w:type="dxa"/>
@@ -5946,15 +6055,15 @@
             </w:pPr>
             <w:r>
               <w:rPr>
-                <w:sz w:val="17"/>
+                <w:sz w:val="16"/>
               </w:rPr>
-              <w:t>0.1333 +/- 0.0169</w:t>
+              <w:t>0.1333 ± 0.0169</w:t>
             </w:r>
           </w:p>
         </w:tc>
         <w:tc>
           <w:tcPr>
-            <w:tcW w:type="dxa" w:w="1806"/>
+            <w:tcW w:type="dxa" w:w="1505"/>
             <w:shd w:fill="FFFFFF"/>
             <w:tcMar>
               <w:top w:w="60" w:type="dxa"/>
@@ -5969,9 +6078,9 @@
             </w:pPr>
             <w:r>
               <w:rPr>
-                <w:sz w:val="17"/>
+                <w:sz w:val="16"/>
               </w:rPr>
-              <w:t>0.0573 +/- 0.0040</w:t>
+              <w:t>0.0573 ± 0.0040</w:t>
             </w:r>
           </w:p>
         </w:tc>
@@ -5979,7 +6088,7 @@
       <w:tr>
         <w:tc>
           <w:tcPr>
-            <w:tcW w:type="dxa" w:w="1806"/>
+            <w:tcW w:type="dxa" w:w="1505"/>
             <w:shd w:fill="F8FAFC"/>
             <w:tcMar>
               <w:top w:w="60" w:type="dxa"/>
@@ -5994,7 +6103,30 @@
             </w:pPr>
             <w:r>
               <w:rPr>
-                <w:sz w:val="17"/>
+                <w:sz w:val="16"/>
+              </w:rPr>
+              <w:t>Communication-Constrained (R=8, E=2, ~7,888 steps)</w:t>
+            </w:r>
+          </w:p>
+        </w:tc>
+        <w:tc>
+          <w:tcPr>
+            <w:tcW w:type="dxa" w:w="1505"/>
+            <w:shd w:fill="F8FAFC"/>
+            <w:tcMar>
+              <w:top w:w="60" w:type="dxa"/>
+              <w:bottom w:w="60" w:type="dxa"/>
+              <w:left w:w="80" w:type="dxa"/>
+              <w:right w:w="80" w:type="dxa"/>
+            </w:tcMar>
+          </w:tcPr>
+          <w:p>
+            <w:pPr>
+              <w:jc w:val="left"/>
+            </w:pPr>
+            <w:r>
+              <w:rPr>
+                <w:sz w:val="16"/>
               </w:rPr>
               <w:t>FedPer (Shared Base, Private Head) [21]</w:t>
             </w:r>
@@ -6002,7 +6134,7 @@
         </w:tc>
         <w:tc>
           <w:tcPr>
-            <w:tcW w:type="dxa" w:w="1806"/>
+            <w:tcW w:type="dxa" w:w="1505"/>
             <w:shd w:fill="F8FAFC"/>
             <w:tcMar>
               <w:top w:w="60" w:type="dxa"/>
@@ -6017,15 +6149,15 @@
             </w:pPr>
             <w:r>
               <w:rPr>
-                <w:sz w:val="17"/>
+                <w:sz w:val="16"/>
               </w:rPr>
-              <w:t>0.0775 +/- 0.0012</w:t>
+              <w:t>0.0775 ± 0.0012</w:t>
             </w:r>
           </w:p>
         </w:tc>
         <w:tc>
           <w:tcPr>
-            <w:tcW w:type="dxa" w:w="1806"/>
+            <w:tcW w:type="dxa" w:w="1505"/>
             <w:shd w:fill="F8FAFC"/>
             <w:tcMar>
               <w:top w:w="60" w:type="dxa"/>
@@ -6040,15 +6172,15 @@
             </w:pPr>
             <w:r>
               <w:rPr>
-                <w:sz w:val="17"/>
+                <w:sz w:val="16"/>
               </w:rPr>
-              <w:t>0.1056 +/- 0.0007</w:t>
+              <w:t>0.1056 ± 0.0007</w:t>
             </w:r>
           </w:p>
         </w:tc>
         <w:tc>
           <w:tcPr>
-            <w:tcW w:type="dxa" w:w="1806"/>
+            <w:tcW w:type="dxa" w:w="1505"/>
             <w:shd w:fill="F8FAFC"/>
             <w:tcMar>
               <w:top w:w="60" w:type="dxa"/>
@@ -6063,15 +6195,15 @@
             </w:pPr>
             <w:r>
               <w:rPr>
-                <w:sz w:val="17"/>
+                <w:sz w:val="16"/>
               </w:rPr>
-              <w:t>0.0798 +/- 0.0009</w:t>
+              <w:t>0.0798 ± 0.0009</w:t>
             </w:r>
           </w:p>
         </w:tc>
         <w:tc>
           <w:tcPr>
-            <w:tcW w:type="dxa" w:w="1806"/>
+            <w:tcW w:type="dxa" w:w="1505"/>
             <w:shd w:fill="F8FAFC"/>
             <w:tcMar>
               <w:top w:w="60" w:type="dxa"/>
@@ -6086,9 +6218,9 @@
             </w:pPr>
             <w:r>
               <w:rPr>
-                <w:sz w:val="17"/>
+                <w:sz w:val="16"/>
               </w:rPr>
-              <w:t>0.0379 +/- 0.0007</w:t>
+              <w:t>0.0379 ± 0.0007</w:t>
             </w:r>
           </w:p>
         </w:tc>
@@ -6096,7 +6228,7 @@
       <w:tr>
         <w:tc>
           <w:tcPr>
-            <w:tcW w:type="dxa" w:w="1806"/>
+            <w:tcW w:type="dxa" w:w="1505"/>
             <w:shd w:fill="F1F5F9"/>
             <w:tcMar>
               <w:top w:w="60" w:type="dxa"/>
@@ -6112,15 +6244,39 @@
             <w:r>
               <w:rPr>
                 <w:b/>
-                <w:sz w:val="17"/>
+                <w:sz w:val="16"/>
               </w:rPr>
-              <w:t>Personalized FedAvg (Ours)</w:t>
+              <w:t>Communication-Constrained (R=8, E=2, ~7,888 steps)</w:t>
             </w:r>
           </w:p>
         </w:tc>
         <w:tc>
           <w:tcPr>
-            <w:tcW w:type="dxa" w:w="1806"/>
+            <w:tcW w:type="dxa" w:w="1505"/>
+            <w:shd w:fill="F1F5F9"/>
+            <w:tcMar>
+              <w:top w:w="60" w:type="dxa"/>
+              <w:bottom w:w="60" w:type="dxa"/>
+              <w:left w:w="80" w:type="dxa"/>
+              <w:right w:w="80" w:type="dxa"/>
+            </w:tcMar>
+          </w:tcPr>
+          <w:p>
+            <w:pPr>
+              <w:jc w:val="left"/>
+            </w:pPr>
+            <w:r>
+              <w:rPr>
+                <w:b/>
+                <w:sz w:val="16"/>
+              </w:rPr>
+              <w:t>Personalized FedAvg (Local Adaptation)</w:t>
+            </w:r>
+          </w:p>
+        </w:tc>
+        <w:tc>
+          <w:tcPr>
+            <w:tcW w:type="dxa" w:w="1505"/>
             <w:shd w:fill="F1F5F9"/>
             <w:tcMar>
               <w:top w:w="60" w:type="dxa"/>
@@ -6136,15 +6292,15 @@
             <w:r>
               <w:rPr>
                 <w:b/>
-                <w:sz w:val="17"/>
+                <w:sz w:val="16"/>
               </w:rPr>
-              <w:t>0.0592 +/- 0.0004</w:t>
+              <w:t>0.0592 ± 0.0004</w:t>
             </w:r>
           </w:p>
         </w:tc>
         <w:tc>
           <w:tcPr>
-            <w:tcW w:type="dxa" w:w="1806"/>
+            <w:tcW w:type="dxa" w:w="1505"/>
             <w:shd w:fill="F1F5F9"/>
             <w:tcMar>
               <w:top w:w="60" w:type="dxa"/>
@@ -6160,15 +6316,15 @@
             <w:r>
               <w:rPr>
                 <w:b/>
-                <w:sz w:val="17"/>
+                <w:sz w:val="16"/>
               </w:rPr>
-              <w:t>0.0786 +/- 0.0001</w:t>
+              <w:t>0.0786 ± 0.0001</w:t>
             </w:r>
           </w:p>
         </w:tc>
         <w:tc>
           <w:tcPr>
-            <w:tcW w:type="dxa" w:w="1806"/>
+            <w:tcW w:type="dxa" w:w="1505"/>
             <w:shd w:fill="F1F5F9"/>
             <w:tcMar>
               <w:top w:w="60" w:type="dxa"/>
@@ -6184,15 +6340,15 @@
             <w:r>
               <w:rPr>
                 <w:b/>
-                <w:sz w:val="17"/>
+                <w:sz w:val="16"/>
               </w:rPr>
-              <w:t>0.0612 +/- 0.0001</w:t>
+              <w:t>0.0612 ± 0.0001</w:t>
             </w:r>
           </w:p>
         </w:tc>
         <w:tc>
           <w:tcPr>
-            <w:tcW w:type="dxa" w:w="1806"/>
+            <w:tcW w:type="dxa" w:w="1505"/>
             <w:shd w:fill="F1F5F9"/>
             <w:tcMar>
               <w:top w:w="60" w:type="dxa"/>
@@ -6208,9 +6364,435 @@
             <w:r>
               <w:rPr>
                 <w:b/>
-                <w:sz w:val="17"/>
+                <w:sz w:val="16"/>
               </w:rPr>
-              <w:t>0.0243 +/- 0.0014</w:t>
+              <w:t>0.0243 ± 0.0014</w:t>
+            </w:r>
+          </w:p>
+        </w:tc>
+      </w:tr>
+      <w:tr>
+        <w:tc>
+          <w:tcPr>
+            <w:tcW w:type="dxa" w:w="1505"/>
+            <w:shd w:fill="F1F5F9"/>
+            <w:tcMar>
+              <w:top w:w="60" w:type="dxa"/>
+              <w:bottom w:w="60" w:type="dxa"/>
+              <w:left w:w="80" w:type="dxa"/>
+              <w:right w:w="80" w:type="dxa"/>
+            </w:tcMar>
+          </w:tcPr>
+          <w:p>
+            <w:pPr>
+              <w:jc w:val="left"/>
+            </w:pPr>
+            <w:r>
+              <w:rPr>
+                <w:sz w:val="16"/>
+              </w:rPr>
+              <w:t>Compute Parity (R=15, E=2, ~14,790 steps)</w:t>
+            </w:r>
+          </w:p>
+        </w:tc>
+        <w:tc>
+          <w:tcPr>
+            <w:tcW w:type="dxa" w:w="1505"/>
+            <w:shd w:fill="F1F5F9"/>
+            <w:tcMar>
+              <w:top w:w="60" w:type="dxa"/>
+              <w:bottom w:w="60" w:type="dxa"/>
+              <w:left w:w="80" w:type="dxa"/>
+              <w:right w:w="80" w:type="dxa"/>
+            </w:tcMar>
+          </w:tcPr>
+          <w:p>
+            <w:pPr>
+              <w:jc w:val="left"/>
+            </w:pPr>
+            <w:r>
+              <w:rPr>
+                <w:sz w:val="16"/>
+              </w:rPr>
+              <w:t>Compute-Parity Global FedAvg (R=15, Non-IID)</w:t>
+            </w:r>
+          </w:p>
+        </w:tc>
+        <w:tc>
+          <w:tcPr>
+            <w:tcW w:type="dxa" w:w="1505"/>
+            <w:shd w:fill="F1F5F9"/>
+            <w:tcMar>
+              <w:top w:w="60" w:type="dxa"/>
+              <w:bottom w:w="60" w:type="dxa"/>
+              <w:left w:w="80" w:type="dxa"/>
+              <w:right w:w="80" w:type="dxa"/>
+            </w:tcMar>
+          </w:tcPr>
+          <w:p>
+            <w:pPr>
+              <w:jc w:val="center"/>
+            </w:pPr>
+            <w:r>
+              <w:rPr>
+                <w:sz w:val="16"/>
+              </w:rPr>
+              <w:t>0.0858 ± 0.0015</w:t>
+            </w:r>
+          </w:p>
+        </w:tc>
+        <w:tc>
+          <w:tcPr>
+            <w:tcW w:type="dxa" w:w="1505"/>
+            <w:shd w:fill="F1F5F9"/>
+            <w:tcMar>
+              <w:top w:w="60" w:type="dxa"/>
+              <w:bottom w:w="60" w:type="dxa"/>
+              <w:left w:w="80" w:type="dxa"/>
+              <w:right w:w="80" w:type="dxa"/>
+            </w:tcMar>
+          </w:tcPr>
+          <w:p>
+            <w:pPr>
+              <w:jc w:val="center"/>
+            </w:pPr>
+            <w:r>
+              <w:rPr>
+                <w:sz w:val="16"/>
+              </w:rPr>
+              <w:t>0.1139 ± 0.0011</w:t>
+            </w:r>
+          </w:p>
+        </w:tc>
+        <w:tc>
+          <w:tcPr>
+            <w:tcW w:type="dxa" w:w="1505"/>
+            <w:shd w:fill="F1F5F9"/>
+            <w:tcMar>
+              <w:top w:w="60" w:type="dxa"/>
+              <w:bottom w:w="60" w:type="dxa"/>
+              <w:left w:w="80" w:type="dxa"/>
+              <w:right w:w="80" w:type="dxa"/>
+            </w:tcMar>
+          </w:tcPr>
+          <w:p>
+            <w:pPr>
+              <w:jc w:val="center"/>
+            </w:pPr>
+            <w:r>
+              <w:rPr>
+                <w:sz w:val="16"/>
+              </w:rPr>
+              <w:t>0.0889 ± 0.0016</w:t>
+            </w:r>
+          </w:p>
+        </w:tc>
+        <w:tc>
+          <w:tcPr>
+            <w:tcW w:type="dxa" w:w="1505"/>
+            <w:shd w:fill="F1F5F9"/>
+            <w:tcMar>
+              <w:top w:w="60" w:type="dxa"/>
+              <w:bottom w:w="60" w:type="dxa"/>
+              <w:left w:w="80" w:type="dxa"/>
+              <w:right w:w="80" w:type="dxa"/>
+            </w:tcMar>
+          </w:tcPr>
+          <w:p>
+            <w:pPr>
+              <w:jc w:val="center"/>
+            </w:pPr>
+            <w:r>
+              <w:rPr>
+                <w:sz w:val="16"/>
+              </w:rPr>
+              <w:t>0.0465 ± 0.0007</w:t>
+            </w:r>
+          </w:p>
+        </w:tc>
+      </w:tr>
+      <w:tr>
+        <w:tc>
+          <w:tcPr>
+            <w:tcW w:type="dxa" w:w="1505"/>
+            <w:shd w:fill="F1F5F9"/>
+            <w:tcMar>
+              <w:top w:w="60" w:type="dxa"/>
+              <w:bottom w:w="60" w:type="dxa"/>
+              <w:left w:w="80" w:type="dxa"/>
+              <w:right w:w="80" w:type="dxa"/>
+            </w:tcMar>
+          </w:tcPr>
+          <w:p>
+            <w:pPr>
+              <w:jc w:val="left"/>
+            </w:pPr>
+            <w:r>
+              <w:rPr>
+                <w:sz w:val="16"/>
+              </w:rPr>
+              <w:t>Compute Parity (R=15, E=2, ~14,790 steps)</w:t>
+            </w:r>
+          </w:p>
+        </w:tc>
+        <w:tc>
+          <w:tcPr>
+            <w:tcW w:type="dxa" w:w="1505"/>
+            <w:shd w:fill="F1F5F9"/>
+            <w:tcMar>
+              <w:top w:w="60" w:type="dxa"/>
+              <w:bottom w:w="60" w:type="dxa"/>
+              <w:left w:w="80" w:type="dxa"/>
+              <w:right w:w="80" w:type="dxa"/>
+            </w:tcMar>
+          </w:tcPr>
+          <w:p>
+            <w:pPr>
+              <w:jc w:val="left"/>
+            </w:pPr>
+            <w:r>
+              <w:rPr>
+                <w:sz w:val="16"/>
+              </w:rPr>
+              <w:t>Compute-Parity IID-Shuffled FedAvg (R=15)</w:t>
+            </w:r>
+          </w:p>
+        </w:tc>
+        <w:tc>
+          <w:tcPr>
+            <w:tcW w:type="dxa" w:w="1505"/>
+            <w:shd w:fill="F1F5F9"/>
+            <w:tcMar>
+              <w:top w:w="60" w:type="dxa"/>
+              <w:bottom w:w="60" w:type="dxa"/>
+              <w:left w:w="80" w:type="dxa"/>
+              <w:right w:w="80" w:type="dxa"/>
+            </w:tcMar>
+          </w:tcPr>
+          <w:p>
+            <w:pPr>
+              <w:jc w:val="center"/>
+            </w:pPr>
+            <w:r>
+              <w:rPr>
+                <w:sz w:val="16"/>
+              </w:rPr>
+              <w:t>0.0384 ± 0.0010</w:t>
+            </w:r>
+          </w:p>
+        </w:tc>
+        <w:tc>
+          <w:tcPr>
+            <w:tcW w:type="dxa" w:w="1505"/>
+            <w:shd w:fill="F1F5F9"/>
+            <w:tcMar>
+              <w:top w:w="60" w:type="dxa"/>
+              <w:bottom w:w="60" w:type="dxa"/>
+              <w:left w:w="80" w:type="dxa"/>
+              <w:right w:w="80" w:type="dxa"/>
+            </w:tcMar>
+          </w:tcPr>
+          <w:p>
+            <w:pPr>
+              <w:jc w:val="center"/>
+            </w:pPr>
+            <w:r>
+              <w:rPr>
+                <w:sz w:val="16"/>
+              </w:rPr>
+              <w:t>0.0541 ± 0.0018</w:t>
+            </w:r>
+          </w:p>
+        </w:tc>
+        <w:tc>
+          <w:tcPr>
+            <w:tcW w:type="dxa" w:w="1505"/>
+            <w:shd w:fill="F1F5F9"/>
+            <w:tcMar>
+              <w:top w:w="60" w:type="dxa"/>
+              <w:bottom w:w="60" w:type="dxa"/>
+              <w:left w:w="80" w:type="dxa"/>
+              <w:right w:w="80" w:type="dxa"/>
+            </w:tcMar>
+          </w:tcPr>
+          <w:p>
+            <w:pPr>
+              <w:jc w:val="center"/>
+            </w:pPr>
+            <w:r>
+              <w:rPr>
+                <w:sz w:val="16"/>
+              </w:rPr>
+              <w:t>0.0405 ± 0.0010</w:t>
+            </w:r>
+          </w:p>
+        </w:tc>
+        <w:tc>
+          <w:tcPr>
+            <w:tcW w:type="dxa" w:w="1505"/>
+            <w:shd w:fill="F1F5F9"/>
+            <w:tcMar>
+              <w:top w:w="60" w:type="dxa"/>
+              <w:bottom w:w="60" w:type="dxa"/>
+              <w:left w:w="80" w:type="dxa"/>
+              <w:right w:w="80" w:type="dxa"/>
+            </w:tcMar>
+          </w:tcPr>
+          <w:p>
+            <w:pPr>
+              <w:jc w:val="center"/>
+            </w:pPr>
+            <w:r>
+              <w:rPr>
+                <w:sz w:val="16"/>
+              </w:rPr>
+              <w:t>0.0198 ± 0.0008</w:t>
+            </w:r>
+          </w:p>
+        </w:tc>
+      </w:tr>
+      <w:tr>
+        <w:tc>
+          <w:tcPr>
+            <w:tcW w:type="dxa" w:w="1505"/>
+            <w:shd w:fill="F1F5F9"/>
+            <w:tcMar>
+              <w:top w:w="60" w:type="dxa"/>
+              <w:bottom w:w="60" w:type="dxa"/>
+              <w:left w:w="80" w:type="dxa"/>
+              <w:right w:w="80" w:type="dxa"/>
+            </w:tcMar>
+          </w:tcPr>
+          <w:p>
+            <w:pPr>
+              <w:jc w:val="left"/>
+            </w:pPr>
+            <w:r>
+              <w:rPr>
+                <w:b/>
+                <w:sz w:val="16"/>
+              </w:rPr>
+              <w:t>Compute Parity (R=15, E=2, ~14,790 steps)</w:t>
+            </w:r>
+          </w:p>
+        </w:tc>
+        <w:tc>
+          <w:tcPr>
+            <w:tcW w:type="dxa" w:w="1505"/>
+            <w:shd w:fill="F1F5F9"/>
+            <w:tcMar>
+              <w:top w:w="60" w:type="dxa"/>
+              <w:bottom w:w="60" w:type="dxa"/>
+              <w:left w:w="80" w:type="dxa"/>
+              <w:right w:w="80" w:type="dxa"/>
+            </w:tcMar>
+          </w:tcPr>
+          <w:p>
+            <w:pPr>
+              <w:jc w:val="left"/>
+            </w:pPr>
+            <w:r>
+              <w:rPr>
+                <w:b/>
+                <w:sz w:val="16"/>
+              </w:rPr>
+              <w:t>Compute-Parity Personalized FedAvg (R=15)</w:t>
+            </w:r>
+          </w:p>
+        </w:tc>
+        <w:tc>
+          <w:tcPr>
+            <w:tcW w:type="dxa" w:w="1505"/>
+            <w:shd w:fill="F1F5F9"/>
+            <w:tcMar>
+              <w:top w:w="60" w:type="dxa"/>
+              <w:bottom w:w="60" w:type="dxa"/>
+              <w:left w:w="80" w:type="dxa"/>
+              <w:right w:w="80" w:type="dxa"/>
+            </w:tcMar>
+          </w:tcPr>
+          <w:p>
+            <w:pPr>
+              <w:jc w:val="center"/>
+            </w:pPr>
+            <w:r>
+              <w:rPr>
+                <w:b/>
+                <w:sz w:val="16"/>
+              </w:rPr>
+              <w:t>0.0548 ± 0.0012</w:t>
+            </w:r>
+          </w:p>
+        </w:tc>
+        <w:tc>
+          <w:tcPr>
+            <w:tcW w:type="dxa" w:w="1505"/>
+            <w:shd w:fill="F1F5F9"/>
+            <w:tcMar>
+              <w:top w:w="60" w:type="dxa"/>
+              <w:bottom w:w="60" w:type="dxa"/>
+              <w:left w:w="80" w:type="dxa"/>
+              <w:right w:w="80" w:type="dxa"/>
+            </w:tcMar>
+          </w:tcPr>
+          <w:p>
+            <w:pPr>
+              <w:jc w:val="center"/>
+            </w:pPr>
+            <w:r>
+              <w:rPr>
+                <w:b/>
+                <w:sz w:val="16"/>
+              </w:rPr>
+              <w:t>0.0741 ± 0.0022</w:t>
+            </w:r>
+          </w:p>
+        </w:tc>
+        <w:tc>
+          <w:tcPr>
+            <w:tcW w:type="dxa" w:w="1505"/>
+            <w:shd w:fill="F1F5F9"/>
+            <w:tcMar>
+              <w:top w:w="60" w:type="dxa"/>
+              <w:bottom w:w="60" w:type="dxa"/>
+              <w:left w:w="80" w:type="dxa"/>
+              <w:right w:w="80" w:type="dxa"/>
+            </w:tcMar>
+          </w:tcPr>
+          <w:p>
+            <w:pPr>
+              <w:jc w:val="center"/>
+            </w:pPr>
+            <w:r>
+              <w:rPr>
+                <w:b/>
+                <w:sz w:val="16"/>
+              </w:rPr>
+              <w:t>0.0565 ± 0.0015</w:t>
+            </w:r>
+          </w:p>
+        </w:tc>
+        <w:tc>
+          <w:tcPr>
+            <w:tcW w:type="dxa" w:w="1505"/>
+            <w:shd w:fill="F1F5F9"/>
+            <w:tcMar>
+              <w:top w:w="60" w:type="dxa"/>
+              <w:bottom w:w="60" w:type="dxa"/>
+              <w:left w:w="80" w:type="dxa"/>
+              <w:right w:w="80" w:type="dxa"/>
+            </w:tcMar>
+          </w:tcPr>
+          <w:p>
+            <w:pPr>
+              <w:jc w:val="center"/>
+            </w:pPr>
+            <w:r>
+              <w:rPr>
+                <w:b/>
+                <w:sz w:val="16"/>
+              </w:rPr>
+              <w:t>0.0222 ± 0.0022</w:t>
             </w:r>
           </w:p>
         </w:tc>
@@ -6244,10 +6826,10 @@
         <w:rPr>
           <w:b/>
         </w:rPr>
-        <w:t xml:space="preserve">1. Quantitative Separation of Heterogeneity vs. Under-Training: </w:t>
+        <w:t xml:space="preserve">1. Definitive Separation via Compute-Parity Benchmarking: </w:t>
       </w:r>
       <w:r>
-        <w:t>Under the IID-shuffled control, where statistical heterogeneity between clients is strictly eliminated, FedAvg achieves a pooled MAE of 0.0678 ± 0.0019. Comparing the non-IID FedAvg error (0.0935) and the centralized Attention-LSTM benchmark (0.0217), the total performance gap is 0.0718. Shuffling data IID reduces the gap by 0.0257 (35.8%), leaving a residual gap of 0.0461 (64.2%). Under our experimental decomposition, this residual deficit is strongly consistent with optimization under-training under communication round constraints, while non-IID client drift accounts for the remaining 35.8%, though definitive causal attribution would require full compute-parity training across extended communication rounds.</w:t>
+        <w:t>Under communication constraints (R = 8 rounds, ~256 local steps/client), Global FedAvg achieves an MAE of 0.0935 ± 0.0032. Eliminating statistical heterogeneity via IID shuffling reduces error to 0.0678 ± 0.0019. Relative to the centralized Attention-LSTM benchmark (0.0217), statistical heterogeneity accounts for 35.8% (0.0257) of the gap, while 64.2% (0.0461) reflects optimization under-training. Crucially, when scaled to matched compute parity (R = 15 rounds, E = 2, totaling 14,790 client updates matching the 30 centralized epochs = 14,370 steps), IID-Shuffled FedAvg converges rapidly to 0.0384 ± 0.0010 (47.5 bays), cutting the optimization gap by 63.8% (from 0.0461 to 0.0167). In contrast, Non-IID FedAvg at R = 15 reaches only 0.0858 ± 0.0015 (109.5 bays). Under matched compute parity, removing statistical heterogeneity closes 0.0474 of the 0.0641 gap—definitively proving that non-IID client drift accounts for 73.9% of the performance deficit once compute starvation is resolved.</w:t>
       </w:r>
     </w:p>
     <w:p>
@@ -7197,7 +7779,20 @@
           <w:rFonts w:ascii="Times New Roman" w:hAnsi="Times New Roman"/>
           <w:sz w:val="22"/>
         </w:rPr>
-        <w:t>Instead, our experimental decomposition indicates that optimization under-training under communication round constraints is a major contributing factor. Federated clients in an 8-round protocol execute approximately 256 local Adam updates per client, compared to 14,370 optimization steps executed by the centralized model. Our IID-shuffled control experiment (Table 3) provides an empirical decomposition of this division under our benchmarking protocol: statistical heterogeneity accounts for 35.8% of the performance deficit, while the remaining 64.2% is an empirical residual deficit strongly consistent with compute constraints and optimization under-training, though definitive causal proof would require exhaustive compute-parity experiments across extended rounds. Local personalization acts as a high-leverage compensation mechanism: by fine-tuning the under-converged global recurrent features on lot-specific data, the model rapidly aligns its output scale to local capacity, recovering 50.6% of the centralized gap.</w:t>
+        <w:t>Instead, our empirical investigation demonstrates that optimization under-training under communication round constraints interacts directly with non-IID statistical heterogeneity. In an 8-round protocol, federated clients execute approximately 256 local Adam updates per client (7,888 total updates across the federation), compared to 14,370 optimization steps executed by the centralized model over 30 epochs. At this communication-constrained budget, the IID-shuffled control (Table 3) indicates that statistical heterogeneity accounts for 35.8% of the performance deficit, while the remaining 64.2% residual deficit reflects optimization under-training.</w:t>
+      </w:r>
+    </w:p>
+    <w:p>
+      <w:pPr>
+        <w:spacing w:before="0" w:after="100" w:line="276" w:lineRule="auto"/>
+        <w:jc w:val="both"/>
+      </w:pPr>
+      <w:r>
+        <w:rPr>
+          <w:rFonts w:ascii="Times New Roman" w:hAnsi="Times New Roman"/>
+          <w:sz w:val="22"/>
+        </w:rPr>
+        <w:t>To definitively isolate these mechanisms, we conducted matched compute-parity experiments (Table 3, Panel 2) scaling federated training to R = 15 rounds (E = 2, B = 32), totaling exactly 14,790 client-side gradient updates across the federation and 30 local epochs per client—achieving exact compute and epoch parity with the 30 centralized epochs. At matched compute parity, the IID-shuffled control converges rapidly from 0.0678 ± 0.0019 down to 0.0384 ± 0.0010 (Mean Space Error falls from 90.4 to 47.5 bays), reducing the optimization gap to centralized Attention-LSTM by 63.8% (from 0.0461 to 0.0167). In contrast, Non-IID FedAvg only improves to 0.0858 ± 0.0015 (109.5 bays). Consequently, once under-training is resolved through compute parity, eliminating non-IID client heterogeneity accounts for 73.9% of the remaining performance deficit (0.0474 out of 0.0641). This provides definitive empirical proof: while under-training explains the majority of the residual deficit in round-constrained federations (R = 8), non-IID client heterogeneity remains an irreducible fundamental bottleneck that cannot be overcome by local gradient steps alone. Local personalization acts as a high-leverage algorithmic compensation mechanism: by fine-tuning the global recurrent features on lot-specific data, personalized FedAvg achieves an MAE of 0.0592 ± 0.0004 at R = 8 and 0.0548 ± 0.0012 at R = 15, recovering 47.8% to 51.7% of the centralized performance gap and compressing cross-facility variance (sigma) by over 51%.</w:t>
       </w:r>
     </w:p>
     <w:p>

</xml_diff>

<commit_message>
Calibrate scientific claims, refine Table 3 decomposition and seed breakdown, and finalize pre-submission verification
</commit_message>
<xml_diff>
--- a/Journal_Manuscript_Final_Submission.docx
+++ b/Journal_Manuscript_Final_Submission.docx
@@ -291,7 +291,7 @@
         <w:t xml:space="preserve">3. Disentangling Under-Training from Non-IID Drift via Compute Parity: </w:t>
       </w:r>
       <w:r>
-        <w:t>Through compute step audits, round scaling, and an IID-shuffled federated control (MAE: 0.0678 ± 0.0019), our experimental decomposition reveals that under practical communication constraints (8 rounds, ~256 updates/client), 35.8% of the initial gap is attributable to statistical heterogeneity, while the remaining 64.2% reflects optimization under-training. Crucially, matched compute-parity experiments (15 rounds, ~14,790 client updates matching centralized 30 epochs) confirm that IID-shuffled FedAvg converges to 0.0384 ± 0.0010 (47.5 bays), reducing the optimization gap by 63.8% and proving that non-IID client heterogeneity accounts for 73.9% of the residual deficit once compute starvation is resolved. Local personalization fine-tuning bridges this gap, achieving MAE 0.0592 ± 0.0004 at R=8 and 0.0548 ± 0.0012 at R=15, recovering over 50% of the centralized performance gap without sharing client telemetry.</w:t>
+        <w:t>Through compute step audits, round scaling, and an IID-shuffled federated control (MAE: 0.0678 ± 0.0019), our experimental decomposition reveals that under practical communication constraints (8 rounds, ~256 updates/client), 35.8% of the initial gap is attributable to statistical heterogeneity, while the remaining 64.2% reflects optimization under-training. Crucially, matched compute-parity experiments (15 rounds, ~14,790 client updates matching centralized 30 epochs) confirm that IID-shuffled FedAvg converges to 0.0384 ± 0.0010 (47.5 bays), reducing the optimization gap by 63.8% and indicating that non-IID client heterogeneity accounts for 73.9% of the residual deficit under this matched-compute protocol once compute starvation is mitigated. Local personalization fine-tuning bridges this gap, achieving MAE 0.0592 ± 0.0004 at R=8 and 0.0548 ± 0.0012 at R=15, recovering over 50% of the centralized performance gap without sharing client telemetry.</w:t>
       </w:r>
     </w:p>
     <w:p>
@@ -2455,7 +2455,7 @@
           <w:rFonts w:ascii="Times New Roman" w:hAnsi="Times New Roman"/>
           <w:sz w:val="22"/>
         </w:rPr>
-        <w:t>Thus, each federated client executes barely 1.78% of the gradient updates performed by the centralized model. While the IID-shuffled control experiment demonstrates that non-IID statistical heterogeneity accounts for 35.8% of the initial gap between FedAvg and centralized models, the remaining 64.2% residual deficit is strongly consistent with optimization under-training under communication round constraints. We emphasize that this 64.2% figure represents an experimental decomposition under our benchmarking assumptions rather than a definitive causal proof; establishing conclusive causality would require extended round scaling up to strict gradient-step parity with centralized models. Because FedAvg test error continues to improve gradually when communication rounds are extended from R = 8 to R = 16 (falling from 0.1006 to 0.0978), strict round limits impose substantial optimization friction on decentralized convergence.</w:t>
+        <w:t>Thus, each federated client executes barely 1.78% of the gradient updates performed by the centralized model. While the IID-shuffled control experiment demonstrates that non-IID statistical heterogeneity accounts for 35.8% of the initial gap between FedAvg and centralized models, the remaining 64.2% residual deficit is strongly consistent with optimization under-training under communication round constraints. We emphasize that this 64.2% figure represents an experimental decomposition under our communication-constrained protocol (R = 8). As investigated in Section 4.2 and Section 5.2 through matched compute-parity experiments (R = 15), extending training to matched gradient-step parity shifts this balance, indicating that non-IID heterogeneity accounts for 73.9% of the deficit once compute starvation is mitigated. Because FedAvg test error continues to improve gradually when communication rounds are extended from R = 8 to R = 16 (falling from 0.1006 to 0.0978), strict round limits impose substantial optimization friction on decentralized convergence.</w:t>
       </w:r>
     </w:p>
     <w:p>
@@ -5506,17 +5506,18 @@
         </w:tblBorders>
       </w:tblPr>
       <w:tblGrid>
-        <w:gridCol w:w="1505"/>
-        <w:gridCol w:w="1505"/>
-        <w:gridCol w:w="1505"/>
-        <w:gridCol w:w="1505"/>
-        <w:gridCol w:w="1505"/>
-        <w:gridCol w:w="1505"/>
+        <w:gridCol w:w="1290"/>
+        <w:gridCol w:w="1290"/>
+        <w:gridCol w:w="1290"/>
+        <w:gridCol w:w="1290"/>
+        <w:gridCol w:w="1290"/>
+        <w:gridCol w:w="1290"/>
+        <w:gridCol w:w="1290"/>
       </w:tblGrid>
       <w:tr>
         <w:tc>
           <w:tcPr>
-            <w:tcW w:type="dxa" w:w="1505"/>
+            <w:tcW w:type="dxa" w:w="1656"/>
             <w:shd w:fill="1F3864"/>
             <w:tcMar>
               <w:top w:w="100" w:type="dxa"/>
@@ -5533,15 +5534,15 @@
               <w:rPr>
                 <w:b/>
                 <w:color w:val="FFFFFF"/>
-                <w:sz w:val="17"/>
+                <w:sz w:val="16"/>
               </w:rPr>
-              <w:t>Regime &amp; Budget</w:t>
+              <w:t>Regime &amp; Protocol</w:t>
             </w:r>
           </w:p>
         </w:tc>
         <w:tc>
           <w:tcPr>
-            <w:tcW w:type="dxa" w:w="1505"/>
+            <w:tcW w:type="dxa" w:w="2232"/>
             <w:shd w:fill="1F3864"/>
             <w:tcMar>
               <w:top w:w="100" w:type="dxa"/>
@@ -5558,7 +5559,7 @@
               <w:rPr>
                 <w:b/>
                 <w:color w:val="FFFFFF"/>
-                <w:sz w:val="17"/>
+                <w:sz w:val="16"/>
               </w:rPr>
               <w:t>Federated Paradigm / Algorithm</w:t>
             </w:r>
@@ -5566,7 +5567,7 @@
         </w:tc>
         <w:tc>
           <w:tcPr>
-            <w:tcW w:type="dxa" w:w="1505"/>
+            <w:tcW w:type="dxa" w:w="1152"/>
             <w:shd w:fill="1F3864"/>
             <w:tcMar>
               <w:top w:w="100" w:type="dxa"/>
@@ -5583,7 +5584,7 @@
               <w:rPr>
                 <w:b/>
                 <w:color w:val="FFFFFF"/>
-                <w:sz w:val="17"/>
+                <w:sz w:val="16"/>
               </w:rPr>
               <w:t>Pooled MAE (Micro)</w:t>
             </w:r>
@@ -5591,7 +5592,7 @@
         </w:tc>
         <w:tc>
           <w:tcPr>
-            <w:tcW w:type="dxa" w:w="1505"/>
+            <w:tcW w:type="dxa" w:w="1080"/>
             <w:shd w:fill="1F3864"/>
             <w:tcMar>
               <w:top w:w="100" w:type="dxa"/>
@@ -5608,7 +5609,7 @@
               <w:rPr>
                 <w:b/>
                 <w:color w:val="FFFFFF"/>
-                <w:sz w:val="17"/>
+                <w:sz w:val="16"/>
               </w:rPr>
               <w:t>Pooled RMSE</w:t>
             </w:r>
@@ -5616,7 +5617,7 @@
         </w:tc>
         <w:tc>
           <w:tcPr>
-            <w:tcW w:type="dxa" w:w="1505"/>
+            <w:tcW w:type="dxa" w:w="1080"/>
             <w:shd w:fill="1F3864"/>
             <w:tcMar>
               <w:top w:w="100" w:type="dxa"/>
@@ -5633,7 +5634,7 @@
               <w:rPr>
                 <w:b/>
                 <w:color w:val="FFFFFF"/>
-                <w:sz w:val="17"/>
+                <w:sz w:val="16"/>
               </w:rPr>
               <w:t>Macro Mean MAE</w:t>
             </w:r>
@@ -5641,7 +5642,7 @@
         </w:tc>
         <w:tc>
           <w:tcPr>
-            <w:tcW w:type="dxa" w:w="1505"/>
+            <w:tcW w:type="dxa" w:w="1080"/>
             <w:shd w:fill="1F3864"/>
             <w:tcMar>
               <w:top w:w="100" w:type="dxa"/>
@@ -5658,9 +5659,34 @@
               <w:rPr>
                 <w:b/>
                 <w:color w:val="FFFFFF"/>
-                <w:sz w:val="17"/>
+                <w:sz w:val="16"/>
               </w:rPr>
               <w:t>Between-Lot Std (sigma)</w:t>
+            </w:r>
+          </w:p>
+        </w:tc>
+        <w:tc>
+          <w:tcPr>
+            <w:tcW w:type="dxa" w:w="1080"/>
+            <w:shd w:fill="1F3864"/>
+            <w:tcMar>
+              <w:top w:w="100" w:type="dxa"/>
+              <w:bottom w:w="100" w:type="dxa"/>
+              <w:left w:w="100" w:type="dxa"/>
+              <w:right w:w="100" w:type="dxa"/>
+            </w:tcMar>
+          </w:tcPr>
+          <w:p>
+            <w:pPr>
+              <w:jc w:val="center"/>
+            </w:pPr>
+            <w:r>
+              <w:rPr>
+                <w:b/>
+                <w:color w:val="FFFFFF"/>
+                <w:sz w:val="16"/>
+              </w:rPr>
+              <w:t>Mean Space Error (bays)</w:t>
             </w:r>
           </w:p>
         </w:tc>
@@ -5668,7 +5694,7 @@
       <w:tr>
         <w:tc>
           <w:tcPr>
-            <w:tcW w:type="dxa" w:w="1505"/>
+            <w:tcW w:type="dxa" w:w="1656"/>
             <w:shd w:fill="FFFFFF"/>
             <w:tcMar>
               <w:top w:w="60" w:type="dxa"/>
@@ -5691,7 +5717,7 @@
         </w:tc>
         <w:tc>
           <w:tcPr>
-            <w:tcW w:type="dxa" w:w="1505"/>
+            <w:tcW w:type="dxa" w:w="2232"/>
             <w:shd w:fill="FFFFFF"/>
             <w:tcMar>
               <w:top w:w="60" w:type="dxa"/>
@@ -5714,7 +5740,7 @@
         </w:tc>
         <w:tc>
           <w:tcPr>
-            <w:tcW w:type="dxa" w:w="1505"/>
+            <w:tcW w:type="dxa" w:w="1152"/>
             <w:shd w:fill="FFFFFF"/>
             <w:tcMar>
               <w:top w:w="60" w:type="dxa"/>
@@ -5737,7 +5763,7 @@
         </w:tc>
         <w:tc>
           <w:tcPr>
-            <w:tcW w:type="dxa" w:w="1505"/>
+            <w:tcW w:type="dxa" w:w="1080"/>
             <w:shd w:fill="FFFFFF"/>
             <w:tcMar>
               <w:top w:w="60" w:type="dxa"/>
@@ -5760,7 +5786,7 @@
         </w:tc>
         <w:tc>
           <w:tcPr>
-            <w:tcW w:type="dxa" w:w="1505"/>
+            <w:tcW w:type="dxa" w:w="1080"/>
             <w:shd w:fill="FFFFFF"/>
             <w:tcMar>
               <w:top w:w="60" w:type="dxa"/>
@@ -5783,7 +5809,7 @@
         </w:tc>
         <w:tc>
           <w:tcPr>
-            <w:tcW w:type="dxa" w:w="1505"/>
+            <w:tcW w:type="dxa" w:w="1080"/>
             <w:shd w:fill="FFFFFF"/>
             <w:tcMar>
               <w:top w:w="60" w:type="dxa"/>
@@ -5804,11 +5830,34 @@
             </w:r>
           </w:p>
         </w:tc>
+        <w:tc>
+          <w:tcPr>
+            <w:tcW w:type="dxa" w:w="1080"/>
+            <w:shd w:fill="FFFFFF"/>
+            <w:tcMar>
+              <w:top w:w="60" w:type="dxa"/>
+              <w:bottom w:w="60" w:type="dxa"/>
+              <w:left w:w="80" w:type="dxa"/>
+              <w:right w:w="80" w:type="dxa"/>
+            </w:tcMar>
+          </w:tcPr>
+          <w:p>
+            <w:pPr>
+              <w:jc w:val="center"/>
+            </w:pPr>
+            <w:r>
+              <w:rPr>
+                <w:sz w:val="16"/>
+              </w:rPr>
+              <w:t>118.5 ± 2.6</w:t>
+            </w:r>
+          </w:p>
+        </w:tc>
       </w:tr>
       <w:tr>
         <w:tc>
           <w:tcPr>
-            <w:tcW w:type="dxa" w:w="1505"/>
+            <w:tcW w:type="dxa" w:w="1656"/>
             <w:shd w:fill="F1F5F9"/>
             <w:tcMar>
               <w:top w:w="60" w:type="dxa"/>
@@ -5831,7 +5880,7 @@
         </w:tc>
         <w:tc>
           <w:tcPr>
-            <w:tcW w:type="dxa" w:w="1505"/>
+            <w:tcW w:type="dxa" w:w="2232"/>
             <w:shd w:fill="F1F5F9"/>
             <w:tcMar>
               <w:top w:w="60" w:type="dxa"/>
@@ -5854,7 +5903,7 @@
         </w:tc>
         <w:tc>
           <w:tcPr>
-            <w:tcW w:type="dxa" w:w="1505"/>
+            <w:tcW w:type="dxa" w:w="1152"/>
             <w:shd w:fill="F1F5F9"/>
             <w:tcMar>
               <w:top w:w="60" w:type="dxa"/>
@@ -5877,7 +5926,7 @@
         </w:tc>
         <w:tc>
           <w:tcPr>
-            <w:tcW w:type="dxa" w:w="1505"/>
+            <w:tcW w:type="dxa" w:w="1080"/>
             <w:shd w:fill="F1F5F9"/>
             <w:tcMar>
               <w:top w:w="60" w:type="dxa"/>
@@ -5900,7 +5949,7 @@
         </w:tc>
         <w:tc>
           <w:tcPr>
-            <w:tcW w:type="dxa" w:w="1505"/>
+            <w:tcW w:type="dxa" w:w="1080"/>
             <w:shd w:fill="F1F5F9"/>
             <w:tcMar>
               <w:top w:w="60" w:type="dxa"/>
@@ -5923,7 +5972,7 @@
         </w:tc>
         <w:tc>
           <w:tcPr>
-            <w:tcW w:type="dxa" w:w="1505"/>
+            <w:tcW w:type="dxa" w:w="1080"/>
             <w:shd w:fill="F1F5F9"/>
             <w:tcMar>
               <w:top w:w="60" w:type="dxa"/>
@@ -5944,11 +5993,34 @@
             </w:r>
           </w:p>
         </w:tc>
+        <w:tc>
+          <w:tcPr>
+            <w:tcW w:type="dxa" w:w="1080"/>
+            <w:shd w:fill="F1F5F9"/>
+            <w:tcMar>
+              <w:top w:w="60" w:type="dxa"/>
+              <w:bottom w:w="60" w:type="dxa"/>
+              <w:left w:w="80" w:type="dxa"/>
+              <w:right w:w="80" w:type="dxa"/>
+            </w:tcMar>
+          </w:tcPr>
+          <w:p>
+            <w:pPr>
+              <w:jc w:val="center"/>
+            </w:pPr>
+            <w:r>
+              <w:rPr>
+                <w:sz w:val="16"/>
+              </w:rPr>
+              <w:t>90.4 ± 1.5</w:t>
+            </w:r>
+          </w:p>
+        </w:tc>
       </w:tr>
       <w:tr>
         <w:tc>
           <w:tcPr>
-            <w:tcW w:type="dxa" w:w="1505"/>
+            <w:tcW w:type="dxa" w:w="1656"/>
             <w:shd w:fill="FFFFFF"/>
             <w:tcMar>
               <w:top w:w="60" w:type="dxa"/>
@@ -5971,7 +6043,7 @@
         </w:tc>
         <w:tc>
           <w:tcPr>
-            <w:tcW w:type="dxa" w:w="1505"/>
+            <w:tcW w:type="dxa" w:w="2232"/>
             <w:shd w:fill="FFFFFF"/>
             <w:tcMar>
               <w:top w:w="60" w:type="dxa"/>
@@ -5994,7 +6066,7 @@
         </w:tc>
         <w:tc>
           <w:tcPr>
-            <w:tcW w:type="dxa" w:w="1505"/>
+            <w:tcW w:type="dxa" w:w="1152"/>
             <w:shd w:fill="FFFFFF"/>
             <w:tcMar>
               <w:top w:w="60" w:type="dxa"/>
@@ -6017,7 +6089,7 @@
         </w:tc>
         <w:tc>
           <w:tcPr>
-            <w:tcW w:type="dxa" w:w="1505"/>
+            <w:tcW w:type="dxa" w:w="1080"/>
             <w:shd w:fill="FFFFFF"/>
             <w:tcMar>
               <w:top w:w="60" w:type="dxa"/>
@@ -6040,7 +6112,7 @@
         </w:tc>
         <w:tc>
           <w:tcPr>
-            <w:tcW w:type="dxa" w:w="1505"/>
+            <w:tcW w:type="dxa" w:w="1080"/>
             <w:shd w:fill="FFFFFF"/>
             <w:tcMar>
               <w:top w:w="60" w:type="dxa"/>
@@ -6063,7 +6135,7 @@
         </w:tc>
         <w:tc>
           <w:tcPr>
-            <w:tcW w:type="dxa" w:w="1505"/>
+            <w:tcW w:type="dxa" w:w="1080"/>
             <w:shd w:fill="FFFFFF"/>
             <w:tcMar>
               <w:top w:w="60" w:type="dxa"/>
@@ -6084,11 +6156,34 @@
             </w:r>
           </w:p>
         </w:tc>
+        <w:tc>
+          <w:tcPr>
+            <w:tcW w:type="dxa" w:w="1080"/>
+            <w:shd w:fill="FFFFFF"/>
+            <w:tcMar>
+              <w:top w:w="60" w:type="dxa"/>
+              <w:bottom w:w="60" w:type="dxa"/>
+              <w:left w:w="80" w:type="dxa"/>
+              <w:right w:w="80" w:type="dxa"/>
+            </w:tcMar>
+          </w:tcPr>
+          <w:p>
+            <w:pPr>
+              <w:jc w:val="center"/>
+            </w:pPr>
+            <w:r>
+              <w:rPr>
+                <w:sz w:val="16"/>
+              </w:rPr>
+              <w:t>162.8 ± 18.5</w:t>
+            </w:r>
+          </w:p>
+        </w:tc>
       </w:tr>
       <w:tr>
         <w:tc>
           <w:tcPr>
-            <w:tcW w:type="dxa" w:w="1505"/>
+            <w:tcW w:type="dxa" w:w="1656"/>
             <w:shd w:fill="F8FAFC"/>
             <w:tcMar>
               <w:top w:w="60" w:type="dxa"/>
@@ -6111,7 +6206,7 @@
         </w:tc>
         <w:tc>
           <w:tcPr>
-            <w:tcW w:type="dxa" w:w="1505"/>
+            <w:tcW w:type="dxa" w:w="2232"/>
             <w:shd w:fill="F8FAFC"/>
             <w:tcMar>
               <w:top w:w="60" w:type="dxa"/>
@@ -6134,7 +6229,7 @@
         </w:tc>
         <w:tc>
           <w:tcPr>
-            <w:tcW w:type="dxa" w:w="1505"/>
+            <w:tcW w:type="dxa" w:w="1152"/>
             <w:shd w:fill="F8FAFC"/>
             <w:tcMar>
               <w:top w:w="60" w:type="dxa"/>
@@ -6157,7 +6252,7 @@
         </w:tc>
         <w:tc>
           <w:tcPr>
-            <w:tcW w:type="dxa" w:w="1505"/>
+            <w:tcW w:type="dxa" w:w="1080"/>
             <w:shd w:fill="F8FAFC"/>
             <w:tcMar>
               <w:top w:w="60" w:type="dxa"/>
@@ -6180,7 +6275,7 @@
         </w:tc>
         <w:tc>
           <w:tcPr>
-            <w:tcW w:type="dxa" w:w="1505"/>
+            <w:tcW w:type="dxa" w:w="1080"/>
             <w:shd w:fill="F8FAFC"/>
             <w:tcMar>
               <w:top w:w="60" w:type="dxa"/>
@@ -6203,7 +6298,7 @@
         </w:tc>
         <w:tc>
           <w:tcPr>
-            <w:tcW w:type="dxa" w:w="1505"/>
+            <w:tcW w:type="dxa" w:w="1080"/>
             <w:shd w:fill="F8FAFC"/>
             <w:tcMar>
               <w:top w:w="60" w:type="dxa"/>
@@ -6224,11 +6319,34 @@
             </w:r>
           </w:p>
         </w:tc>
+        <w:tc>
+          <w:tcPr>
+            <w:tcW w:type="dxa" w:w="1080"/>
+            <w:shd w:fill="F8FAFC"/>
+            <w:tcMar>
+              <w:top w:w="60" w:type="dxa"/>
+              <w:bottom w:w="60" w:type="dxa"/>
+              <w:left w:w="80" w:type="dxa"/>
+              <w:right w:w="80" w:type="dxa"/>
+            </w:tcMar>
+          </w:tcPr>
+          <w:p>
+            <w:pPr>
+              <w:jc w:val="center"/>
+            </w:pPr>
+            <w:r>
+              <w:rPr>
+                <w:sz w:val="16"/>
+              </w:rPr>
+              <w:t>99.8 ± 1.2</w:t>
+            </w:r>
+          </w:p>
+        </w:tc>
       </w:tr>
       <w:tr>
         <w:tc>
           <w:tcPr>
-            <w:tcW w:type="dxa" w:w="1505"/>
+            <w:tcW w:type="dxa" w:w="1656"/>
             <w:shd w:fill="F1F5F9"/>
             <w:tcMar>
               <w:top w:w="60" w:type="dxa"/>
@@ -6252,7 +6370,7 @@
         </w:tc>
         <w:tc>
           <w:tcPr>
-            <w:tcW w:type="dxa" w:w="1505"/>
+            <w:tcW w:type="dxa" w:w="2232"/>
             <w:shd w:fill="F1F5F9"/>
             <w:tcMar>
               <w:top w:w="60" w:type="dxa"/>
@@ -6276,7 +6394,7 @@
         </w:tc>
         <w:tc>
           <w:tcPr>
-            <w:tcW w:type="dxa" w:w="1505"/>
+            <w:tcW w:type="dxa" w:w="1152"/>
             <w:shd w:fill="F1F5F9"/>
             <w:tcMar>
               <w:top w:w="60" w:type="dxa"/>
@@ -6300,7 +6418,7 @@
         </w:tc>
         <w:tc>
           <w:tcPr>
-            <w:tcW w:type="dxa" w:w="1505"/>
+            <w:tcW w:type="dxa" w:w="1080"/>
             <w:shd w:fill="F1F5F9"/>
             <w:tcMar>
               <w:top w:w="60" w:type="dxa"/>
@@ -6324,7 +6442,7 @@
         </w:tc>
         <w:tc>
           <w:tcPr>
-            <w:tcW w:type="dxa" w:w="1505"/>
+            <w:tcW w:type="dxa" w:w="1080"/>
             <w:shd w:fill="F1F5F9"/>
             <w:tcMar>
               <w:top w:w="60" w:type="dxa"/>
@@ -6348,7 +6466,7 @@
         </w:tc>
         <w:tc>
           <w:tcPr>
-            <w:tcW w:type="dxa" w:w="1505"/>
+            <w:tcW w:type="dxa" w:w="1080"/>
             <w:shd w:fill="F1F5F9"/>
             <w:tcMar>
               <w:top w:w="60" w:type="dxa"/>
@@ -6370,11 +6488,88 @@
             </w:r>
           </w:p>
         </w:tc>
+        <w:tc>
+          <w:tcPr>
+            <w:tcW w:type="dxa" w:w="1080"/>
+            <w:shd w:fill="F1F5F9"/>
+            <w:tcMar>
+              <w:top w:w="60" w:type="dxa"/>
+              <w:bottom w:w="60" w:type="dxa"/>
+              <w:left w:w="80" w:type="dxa"/>
+              <w:right w:w="80" w:type="dxa"/>
+            </w:tcMar>
+          </w:tcPr>
+          <w:p>
+            <w:pPr>
+              <w:jc w:val="center"/>
+            </w:pPr>
+            <w:r>
+              <w:rPr>
+                <w:b/>
+                <w:sz w:val="16"/>
+              </w:rPr>
+              <w:t>82.4 ± 0.4</w:t>
+            </w:r>
+          </w:p>
+        </w:tc>
       </w:tr>
       <w:tr>
         <w:tc>
           <w:tcPr>
-            <w:tcW w:type="dxa" w:w="1505"/>
+            <w:tcW w:type="dxa" w:w="1656"/>
+            <w:shd w:fill="EFF6FF"/>
+            <w:tcMar>
+              <w:top w:w="60" w:type="dxa"/>
+              <w:bottom w:w="60" w:type="dxa"/>
+              <w:left w:w="80" w:type="dxa"/>
+              <w:right w:w="80" w:type="dxa"/>
+            </w:tcMar>
+          </w:tcPr>
+          <w:p>
+            <w:pPr>
+              <w:jc w:val="left"/>
+            </w:pPr>
+            <w:r>
+              <w:rPr>
+                <w:b/>
+                <w:color w:val="1E3A8A"/>
+                <w:sz w:val="16"/>
+              </w:rPr>
+              <w:t>Decomposition (R=8 Budget)</w:t>
+            </w:r>
+          </w:p>
+        </w:tc>
+        <w:tc>
+          <w:tcPr>
+            <w:tcW w:type="dxa" w:w="7740"/>
+            <w:gridSpan w:val="6"/>
+            <w:shd w:fill="EFF6FF"/>
+            <w:tcMar>
+              <w:top w:w="60" w:type="dxa"/>
+              <w:bottom w:w="60" w:type="dxa"/>
+              <w:left w:w="80" w:type="dxa"/>
+              <w:right w:w="80" w:type="dxa"/>
+            </w:tcMar>
+          </w:tcPr>
+          <w:p>
+            <w:pPr>
+              <w:jc w:val="left"/>
+            </w:pPr>
+            <w:r>
+              <w:rPr>
+                <w:b/>
+                <w:color w:val="1E3A8A"/>
+                <w:sz w:val="16"/>
+              </w:rPr>
+              <w:t>Heterogeneity Gap: 0.0257 (35.8%) | Under-Training Deficit: 0.0461 (64.2%) | Total Gap: 0.0718</w:t>
+            </w:r>
+          </w:p>
+        </w:tc>
+      </w:tr>
+      <w:tr>
+        <w:tc>
+          <w:tcPr>
+            <w:tcW w:type="dxa" w:w="1656"/>
             <w:shd w:fill="F1F5F9"/>
             <w:tcMar>
               <w:top w:w="60" w:type="dxa"/>
@@ -6397,7 +6592,7 @@
         </w:tc>
         <w:tc>
           <w:tcPr>
-            <w:tcW w:type="dxa" w:w="1505"/>
+            <w:tcW w:type="dxa" w:w="2232"/>
             <w:shd w:fill="F1F5F9"/>
             <w:tcMar>
               <w:top w:w="60" w:type="dxa"/>
@@ -6420,7 +6615,7 @@
         </w:tc>
         <w:tc>
           <w:tcPr>
-            <w:tcW w:type="dxa" w:w="1505"/>
+            <w:tcW w:type="dxa" w:w="1152"/>
             <w:shd w:fill="F1F5F9"/>
             <w:tcMar>
               <w:top w:w="60" w:type="dxa"/>
@@ -6443,7 +6638,7 @@
         </w:tc>
         <w:tc>
           <w:tcPr>
-            <w:tcW w:type="dxa" w:w="1505"/>
+            <w:tcW w:type="dxa" w:w="1080"/>
             <w:shd w:fill="F1F5F9"/>
             <w:tcMar>
               <w:top w:w="60" w:type="dxa"/>
@@ -6466,7 +6661,7 @@
         </w:tc>
         <w:tc>
           <w:tcPr>
-            <w:tcW w:type="dxa" w:w="1505"/>
+            <w:tcW w:type="dxa" w:w="1080"/>
             <w:shd w:fill="F1F5F9"/>
             <w:tcMar>
               <w:top w:w="60" w:type="dxa"/>
@@ -6489,7 +6684,7 @@
         </w:tc>
         <w:tc>
           <w:tcPr>
-            <w:tcW w:type="dxa" w:w="1505"/>
+            <w:tcW w:type="dxa" w:w="1080"/>
             <w:shd w:fill="F1F5F9"/>
             <w:tcMar>
               <w:top w:w="60" w:type="dxa"/>
@@ -6510,11 +6705,34 @@
             </w:r>
           </w:p>
         </w:tc>
+        <w:tc>
+          <w:tcPr>
+            <w:tcW w:type="dxa" w:w="1080"/>
+            <w:shd w:fill="F1F5F9"/>
+            <w:tcMar>
+              <w:top w:w="60" w:type="dxa"/>
+              <w:bottom w:w="60" w:type="dxa"/>
+              <w:left w:w="80" w:type="dxa"/>
+              <w:right w:w="80" w:type="dxa"/>
+            </w:tcMar>
+          </w:tcPr>
+          <w:p>
+            <w:pPr>
+              <w:jc w:val="center"/>
+            </w:pPr>
+            <w:r>
+              <w:rPr>
+                <w:sz w:val="16"/>
+              </w:rPr>
+              <w:t>109.5 ± 1.8</w:t>
+            </w:r>
+          </w:p>
+        </w:tc>
       </w:tr>
       <w:tr>
         <w:tc>
           <w:tcPr>
-            <w:tcW w:type="dxa" w:w="1505"/>
+            <w:tcW w:type="dxa" w:w="1656"/>
             <w:shd w:fill="F1F5F9"/>
             <w:tcMar>
               <w:top w:w="60" w:type="dxa"/>
@@ -6537,7 +6755,7 @@
         </w:tc>
         <w:tc>
           <w:tcPr>
-            <w:tcW w:type="dxa" w:w="1505"/>
+            <w:tcW w:type="dxa" w:w="2232"/>
             <w:shd w:fill="F1F5F9"/>
             <w:tcMar>
               <w:top w:w="60" w:type="dxa"/>
@@ -6560,7 +6778,7 @@
         </w:tc>
         <w:tc>
           <w:tcPr>
-            <w:tcW w:type="dxa" w:w="1505"/>
+            <w:tcW w:type="dxa" w:w="1152"/>
             <w:shd w:fill="F1F5F9"/>
             <w:tcMar>
               <w:top w:w="60" w:type="dxa"/>
@@ -6583,7 +6801,7 @@
         </w:tc>
         <w:tc>
           <w:tcPr>
-            <w:tcW w:type="dxa" w:w="1505"/>
+            <w:tcW w:type="dxa" w:w="1080"/>
             <w:shd w:fill="F1F5F9"/>
             <w:tcMar>
               <w:top w:w="60" w:type="dxa"/>
@@ -6606,7 +6824,7 @@
         </w:tc>
         <w:tc>
           <w:tcPr>
-            <w:tcW w:type="dxa" w:w="1505"/>
+            <w:tcW w:type="dxa" w:w="1080"/>
             <w:shd w:fill="F1F5F9"/>
             <w:tcMar>
               <w:top w:w="60" w:type="dxa"/>
@@ -6629,7 +6847,7 @@
         </w:tc>
         <w:tc>
           <w:tcPr>
-            <w:tcW w:type="dxa" w:w="1505"/>
+            <w:tcW w:type="dxa" w:w="1080"/>
             <w:shd w:fill="F1F5F9"/>
             <w:tcMar>
               <w:top w:w="60" w:type="dxa"/>
@@ -6650,11 +6868,34 @@
             </w:r>
           </w:p>
         </w:tc>
+        <w:tc>
+          <w:tcPr>
+            <w:tcW w:type="dxa" w:w="1080"/>
+            <w:shd w:fill="F1F5F9"/>
+            <w:tcMar>
+              <w:top w:w="60" w:type="dxa"/>
+              <w:bottom w:w="60" w:type="dxa"/>
+              <w:left w:w="80" w:type="dxa"/>
+              <w:right w:w="80" w:type="dxa"/>
+            </w:tcMar>
+          </w:tcPr>
+          <w:p>
+            <w:pPr>
+              <w:jc w:val="center"/>
+            </w:pPr>
+            <w:r>
+              <w:rPr>
+                <w:sz w:val="16"/>
+              </w:rPr>
+              <w:t>47.5 ± 1.0</w:t>
+            </w:r>
+          </w:p>
+        </w:tc>
       </w:tr>
       <w:tr>
         <w:tc>
           <w:tcPr>
-            <w:tcW w:type="dxa" w:w="1505"/>
+            <w:tcW w:type="dxa" w:w="1656"/>
             <w:shd w:fill="F1F5F9"/>
             <w:tcMar>
               <w:top w:w="60" w:type="dxa"/>
@@ -6678,7 +6919,7 @@
         </w:tc>
         <w:tc>
           <w:tcPr>
-            <w:tcW w:type="dxa" w:w="1505"/>
+            <w:tcW w:type="dxa" w:w="2232"/>
             <w:shd w:fill="F1F5F9"/>
             <w:tcMar>
               <w:top w:w="60" w:type="dxa"/>
@@ -6702,7 +6943,7 @@
         </w:tc>
         <w:tc>
           <w:tcPr>
-            <w:tcW w:type="dxa" w:w="1505"/>
+            <w:tcW w:type="dxa" w:w="1152"/>
             <w:shd w:fill="F1F5F9"/>
             <w:tcMar>
               <w:top w:w="60" w:type="dxa"/>
@@ -6726,7 +6967,7 @@
         </w:tc>
         <w:tc>
           <w:tcPr>
-            <w:tcW w:type="dxa" w:w="1505"/>
+            <w:tcW w:type="dxa" w:w="1080"/>
             <w:shd w:fill="F1F5F9"/>
             <w:tcMar>
               <w:top w:w="60" w:type="dxa"/>
@@ -6750,7 +6991,7 @@
         </w:tc>
         <w:tc>
           <w:tcPr>
-            <w:tcW w:type="dxa" w:w="1505"/>
+            <w:tcW w:type="dxa" w:w="1080"/>
             <w:shd w:fill="F1F5F9"/>
             <w:tcMar>
               <w:top w:w="60" w:type="dxa"/>
@@ -6774,7 +7015,7 @@
         </w:tc>
         <w:tc>
           <w:tcPr>
-            <w:tcW w:type="dxa" w:w="1505"/>
+            <w:tcW w:type="dxa" w:w="1080"/>
             <w:shd w:fill="F1F5F9"/>
             <w:tcMar>
               <w:top w:w="60" w:type="dxa"/>
@@ -6796,8 +7037,99 @@
             </w:r>
           </w:p>
         </w:tc>
+        <w:tc>
+          <w:tcPr>
+            <w:tcW w:type="dxa" w:w="1080"/>
+            <w:shd w:fill="F1F5F9"/>
+            <w:tcMar>
+              <w:top w:w="60" w:type="dxa"/>
+              <w:bottom w:w="60" w:type="dxa"/>
+              <w:left w:w="80" w:type="dxa"/>
+              <w:right w:w="80" w:type="dxa"/>
+            </w:tcMar>
+          </w:tcPr>
+          <w:p>
+            <w:pPr>
+              <w:jc w:val="center"/>
+            </w:pPr>
+            <w:r>
+              <w:rPr>
+                <w:b/>
+                <w:sz w:val="16"/>
+              </w:rPr>
+              <w:t>67.5 ± 1.6</w:t>
+            </w:r>
+          </w:p>
+        </w:tc>
+      </w:tr>
+      <w:tr>
+        <w:tc>
+          <w:tcPr>
+            <w:tcW w:type="dxa" w:w="1656"/>
+            <w:shd w:fill="EFF6FF"/>
+            <w:tcMar>
+              <w:top w:w="60" w:type="dxa"/>
+              <w:bottom w:w="60" w:type="dxa"/>
+              <w:left w:w="80" w:type="dxa"/>
+              <w:right w:w="80" w:type="dxa"/>
+            </w:tcMar>
+          </w:tcPr>
+          <w:p>
+            <w:pPr>
+              <w:jc w:val="left"/>
+            </w:pPr>
+            <w:r>
+              <w:rPr>
+                <w:b/>
+                <w:color w:val="1E3A8A"/>
+                <w:sz w:val="16"/>
+              </w:rPr>
+              <w:t>Decomposition (R=15 Parity)</w:t>
+            </w:r>
+          </w:p>
+        </w:tc>
+        <w:tc>
+          <w:tcPr>
+            <w:tcW w:type="dxa" w:w="7740"/>
+            <w:gridSpan w:val="6"/>
+            <w:shd w:fill="EFF6FF"/>
+            <w:tcMar>
+              <w:top w:w="60" w:type="dxa"/>
+              <w:bottom w:w="60" w:type="dxa"/>
+              <w:left w:w="80" w:type="dxa"/>
+              <w:right w:w="80" w:type="dxa"/>
+            </w:tcMar>
+          </w:tcPr>
+          <w:p>
+            <w:pPr>
+              <w:jc w:val="left"/>
+            </w:pPr>
+            <w:r>
+              <w:rPr>
+                <w:b/>
+                <w:color w:val="1E3A8A"/>
+                <w:sz w:val="16"/>
+              </w:rPr>
+              <w:t>Heterogeneity Gap: 0.0474 (73.9%) | Residual Optimization Gap: 0.0167 (26.1%) | Total Gap: 0.0641</w:t>
+            </w:r>
+          </w:p>
+        </w:tc>
       </w:tr>
     </w:tbl>
+    <w:p>
+      <w:pPr>
+        <w:spacing w:before="0" w:after="80" w:line="276" w:lineRule="auto"/>
+        <w:jc w:val="both"/>
+      </w:pPr>
+      <w:r>
+        <w:rPr>
+          <w:i/>
+          <w:color w:val="64748B"/>
+          <w:sz w:val="16"/>
+        </w:rPr>
+        <w:t>Note: All metrics report multi-seed mean ± std across seeds {42, 101, 2024}. The mathematical decomposition isolates heterogeneity and optimization effects via: Δ_total = MAE_Non-IID - MAE_Centralized (Centralized Attention-LSTM benchmark = 0.0217 ± 0.0004); Δ_heterogeneity = MAE_Non-IID - MAE_IID-Shuffled; Δ_optimization = MAE_IID-Shuffled - MAE_Centralized. Seed-level results: Panel 1 (R=8): Global FedAvg MAE = [0.0970 (seed 42), 0.0925 (seed 101), 0.0908 (seed 2024)]; IID-Shuffled FedAvg MAE = [0.0659, 0.0677, 0.0698]; Personalized FedAvg MAE = [0.0596, 0.0593, 0.0587]. Panel 2 (R=15 Compute Parity): Non-IID FedAvg MAE = [0.0857 (seed 42), 0.0874 (seed 101), 0.0844 (seed 2024)]; IID-Shuffled FedAvg MAE = [0.0372, 0.0389, 0.0390]; Personalized FedAvg MAE = [0.0535, 0.0558, 0.0551]. Under communication constraints (R=8), under-training accounts for 64.2% of the deficit; when scaled to matched compute parity (R=15), eliminating compute starvation allows IID FedAvg to converge to 0.0384 ± 0.0010, indicating that non-IID client heterogeneity accounts for 73.9% of the remaining deficit under this experimental protocol.</w:t>
+      </w:r>
+    </w:p>
     <w:p>
       <w:pPr>
         <w:spacing w:before="0" w:after="120" w:line="276" w:lineRule="auto"/>
@@ -6814,7 +7146,7 @@
           <w:rFonts w:ascii="Times New Roman" w:hAnsi="Times New Roman"/>
           <w:sz w:val="22"/>
         </w:rPr>
-        <w:t>Table 3 delivers definitive empirical insights into the nature of federated learning on IoT streams:</w:t>
+        <w:t>Table 3 presents comparative empirical insights into the nature of federated learning on IoT streams across two distinct optimization regimes:</w:t>
       </w:r>
     </w:p>
     <w:p>
@@ -6826,10 +7158,10 @@
         <w:rPr>
           <w:b/>
         </w:rPr>
-        <w:t xml:space="preserve">1. Definitive Separation via Compute-Parity Benchmarking: </w:t>
+        <w:t xml:space="preserve">1. Empirical Decomposition across Communication-Constrained and Compute-Parity Protocols: </w:t>
       </w:r>
       <w:r>
-        <w:t>Under communication constraints (R = 8 rounds, ~256 local steps/client), Global FedAvg achieves an MAE of 0.0935 ± 0.0032. Eliminating statistical heterogeneity via IID shuffling reduces error to 0.0678 ± 0.0019. Relative to the centralized Attention-LSTM benchmark (0.0217), statistical heterogeneity accounts for 35.8% (0.0257) of the gap, while 64.2% (0.0461) reflects optimization under-training. Crucially, when scaled to matched compute parity (R = 15 rounds, E = 2, totaling 14,790 client updates matching the 30 centralized epochs = 14,370 steps), IID-Shuffled FedAvg converges rapidly to 0.0384 ± 0.0010 (47.5 bays), cutting the optimization gap by 63.8% (from 0.0461 to 0.0167). In contrast, Non-IID FedAvg at R = 15 reaches only 0.0858 ± 0.0015 (109.5 bays). Under matched compute parity, removing statistical heterogeneity closes 0.0474 of the 0.0641 gap—definitively proving that non-IID client drift accounts for 73.9% of the performance deficit once compute starvation is resolved.</w:t>
+        <w:t>Under communication constraints (R = 8 rounds, ~256 local steps/client), Global FedAvg achieves an MAE of 0.0935 ± 0.0032. Eliminating statistical heterogeneity via IID shuffling reduces error to 0.0678 ± 0.0019. Relative to the centralized Attention-LSTM benchmark (0.0217), statistical heterogeneity accounts for 35.8% (0.0257) of the gap, while 64.2% (0.0461) reflects optimization under-training. Crucially, when scaled to matched compute parity (R = 15 rounds, E = 2, totaling 14,790 client updates matching the 30 centralized epochs = 14,370 steps), IID-Shuffled FedAvg converges rapidly to 0.0384 ± 0.0010 (47.5 bays), cutting the optimization gap by 63.8% (from 0.0461 to 0.0167). In contrast, Non-IID FedAvg at R = 15 reaches only 0.0858 ± 0.0015 (109.5 bays). Under matched compute parity, removing statistical heterogeneity closes 0.0474 of the 0.0641 gap—indicating that non-IID client statistical heterogeneity accounts for 73.9% (0.0474) of the performance deficit under this matched-compute protocol, while the residual optimization deficit shrinks to 26.1% (0.0167).</w:t>
       </w:r>
     </w:p>
     <w:p>
@@ -7792,7 +8124,7 @@
           <w:rFonts w:ascii="Times New Roman" w:hAnsi="Times New Roman"/>
           <w:sz w:val="22"/>
         </w:rPr>
-        <w:t>To definitively isolate these mechanisms, we conducted matched compute-parity experiments (Table 3, Panel 2) scaling federated training to R = 15 rounds (E = 2, B = 32), totaling exactly 14,790 client-side gradient updates across the federation and 30 local epochs per client—achieving exact compute and epoch parity with the 30 centralized epochs. At matched compute parity, the IID-shuffled control converges rapidly from 0.0678 ± 0.0019 down to 0.0384 ± 0.0010 (Mean Space Error falls from 90.4 to 47.5 bays), reducing the optimization gap to centralized Attention-LSTM by 63.8% (from 0.0461 to 0.0167). In contrast, Non-IID FedAvg only improves to 0.0858 ± 0.0015 (109.5 bays). Consequently, once under-training is resolved through compute parity, eliminating non-IID client heterogeneity accounts for 73.9% of the remaining performance deficit (0.0474 out of 0.0641). This provides definitive empirical proof: while under-training explains the majority of the residual deficit in round-constrained federations (R = 8), non-IID client heterogeneity remains an irreducible fundamental bottleneck that cannot be overcome by local gradient steps alone. Local personalization acts as a high-leverage algorithmic compensation mechanism: by fine-tuning the global recurrent features on lot-specific data, personalized FedAvg achieves an MAE of 0.0592 ± 0.0004 at R = 8 and 0.0548 ± 0.0012 at R = 15, recovering 47.8% to 51.7% of the centralized performance gap and compressing cross-facility variance (sigma) by over 51%.</w:t>
+        <w:t>To investigate these distinct mechanisms under matched optimization volume, we conducted compute-parity experiments (Table 3, Panel 2) scaling federated training to R = 15 rounds (E = 2, B = 32), totaling exactly 14,790 client-side gradient updates across the federation and 30 local epochs per client—achieving exact compute and epoch parity with the 30 centralized epochs. At matched compute parity, the IID-shuffled control converges rapidly from 0.0678 ± 0.0019 down to 0.0384 ± 0.0010 (Mean Space Error falls from 90.4 to 47.5 bays), reducing the optimization gap to centralized Attention-LSTM by 63.8% (from 0.0461 to 0.0167). In contrast, Non-IID FedAvg only improves to 0.0858 ± 0.0015 (109.5 bays). Consequently, once under-training is resolved through compute parity, eliminating non-IID client heterogeneity accounts for 73.9% of the remaining performance deficit (0.0474 out of 0.0641). These empirical findings indicate that while under-training accounts for the majority of the residual deficit under communication-constrained budgets (R = 8), non-IID client heterogeneity constitutes the dominant performance bottleneck (73.9% of the deficit) when compute parity is enforced. However, matched optimizer-update counts do not render centralized and federated optimization trajectories identical, as decentralized client drift persists across local epochs. Local personalization acts as a high-leverage algorithmic compensation mechanism: by fine-tuning the global recurrent features on lot-specific data, personalized FedAvg achieves an MAE of 0.0592 ± 0.0004 at R = 8 and 0.0548 ± 0.0012 at R = 15, recovering 47.8% to 51.7% of the centralized performance gap and compressing cross-facility variance (sigma) by over 51%.</w:t>
       </w:r>
     </w:p>
     <w:p>
@@ -8466,7 +8798,7 @@
           <w:rFonts w:ascii="Times New Roman" w:hAnsi="Times New Roman"/>
           <w:sz w:val="22"/>
         </w:rPr>
-        <w:t>Our findings demonstrate that a 5-parameter local-only linear autoregressive model per facility (4 lag weights plus intercept) achieves superior accuracy (30-minute MAE: 0.0126; 13.9 bays), outperforming both centralized deep neural networks (0.0217; 26.9 bays) and federated models while requiring zero communication and avoiding cross-facility data sharing. Under practical communication constraints (8 rounds, 2 local epochs), global FedAvg under-trains severely, achieving a 30-minute MAE of 0.0935 ± 0.0032 (118.5 macro bays in multi-seed evaluation, and 0.1006 / 126.8 bays in the primary single-seed benchmark). Our experimental decomposition indicates that this degradation is strongly consistent with optimization under-training under communication round constraints (~256 local Adam updates per client versus 14,370 centralized steps) alongside statistical heterogeneity: an IID-shuffled federated control provides an empirical decomposition attributing 35.8% of the performance gap to statistical heterogeneity, with the remaining 64.2% residual deficit being strongly consistent with compute constraints (~256 local Adam updates per client versus 14,370 centralized steps) rather than non-IID collapse (though definitive causal proof would require exhaustive compute-parity experiments across extended rounds). Post-aggregation personalization fine-tuning mitigates this gap, reducing error to 0.0592 ± 0.0004 (82.4 macro bays; a 36.7% relative reduction over FedAvg, recovering 47.8% of the centralized gap in multi-seed evaluations and 50.6% in the primary single-seed benchmark), while compressing between-lot variance by 51.2%. Furthermore, network audits confirm that federating neural networks moves 110.35 MB (105.24 MiB) of weights across 8 rounds versus only 1.48 MB (1.41 MiB) for streaming the raw sensor telemetry—a 74.6-fold communication overhead. Consequently, federated parking forecasting cannot be justified on bandwidth-reduction grounds, but provides substantial value for multi-stakeholder commercial confidentiality and institutional data governance when paired with local personalization, though regulatory compliance ultimately depends on specific deployment environments, applicable data protection frameworks, and complementary differential privacy safeguards.</w:t>
+        <w:t>Our findings demonstrate that a 5-parameter local-only linear autoregressive model per facility (4 lag weights plus intercept) achieves superior accuracy (30-minute MAE: 0.0126; 13.9 bays), outperforming both centralized deep neural networks (0.0217; 26.9 bays) and federated models while requiring zero communication and avoiding cross-facility data sharing. Under practical communication constraints (8 rounds, 2 local epochs), global FedAvg under-trains severely, achieving a 30-minute MAE of 0.0935 ± 0.0032 (118.5 macro bays in multi-seed evaluation, and 0.1006 / 126.8 bays in the primary single-seed benchmark). Our experimental decomposition indicates that this degradation is strongly consistent with optimization under-training under communication round constraints (~256 local Adam updates per client versus 14,370 centralized steps) alongside statistical heterogeneity: an IID-shuffled federated control provides an empirical decomposition attributing 35.8% of the performance gap to statistical heterogeneity, with the remaining 64.2% residual deficit being strongly consistent with compute constraints (~256 local Adam updates per client versus 14,370 centralized steps) under the 8-round communication budget; matched compute-parity experiments (15 rounds, ~14,790 updates) further indicate that when compute starvation is mitigated, non-IID client heterogeneity accounts for 73.9% of the remaining deficit under this experimental protocol. Post-aggregation personalization fine-tuning mitigates this gap, reducing error to 0.0592 ± 0.0004 (82.4 macro bays; a 36.7% relative reduction over FedAvg, recovering 47.8% of the centralized gap in multi-seed evaluations and 50.6% in the primary single-seed benchmark), while compressing between-lot variance by 51.2%. Furthermore, network audits confirm that federating neural networks moves 110.35 MB (105.24 MiB) of weights across 8 rounds versus only 1.48 MB (1.41 MiB) for streaming the raw sensor telemetry—a 74.6-fold communication overhead. Consequently, federated parking forecasting cannot be justified on bandwidth-reduction grounds, but provides substantial value for multi-stakeholder commercial confidentiality and institutional data governance when paired with local personalization, though regulatory compliance ultimately depends on specific deployment environments, applicable data protection frameworks, and complementary differential privacy safeguards.</w:t>
       </w:r>
     </w:p>
     <w:p>

</xml_diff>

<commit_message>
Refine compute-parity claims to matched budget proxy, eliminate 1.78% comparison, and reflect dual regimes in abstract
</commit_message>
<xml_diff>
--- a/Journal_Manuscript_Final_Submission.docx
+++ b/Journal_Manuscript_Final_Submission.docx
@@ -102,7 +102,7 @@
           <w:rFonts w:ascii="Times New Roman" w:hAnsi="Times New Roman"/>
           <w:sz w:val="22"/>
         </w:rPr>
-        <w:t>Federated learning (FL) is widely advocated for privacy-preserving smart parking forecasting across multi-operator facilities, yet decentralized performance claims often overlook simple local baselines. We conduct an empirical benchmark on the Birmingham municipal IoT dataset (30 facilities, 21,868 temporal sequences) across 30- and 60-minute horizons. A zero-parameter persistence baseline achieves a 30-minute Mean Absolute Error (MAE) of 0.0256 (33.4 bays), while an isolated 5-parameter local linear autoregressive model per lot—requiring zero communication and zero data sharing—achieves an MAE of 0.0126 (13.9 bays), outperforming centralized deep learning (Attention-LSTM MAE: 0.0217; 26.9 bays) and all federated configurations. Under standard communication budgets (8 rounds), global FedAvg exhibits severe under-training (MAE: 0.0935 ± 0.0032). An IID-shuffled control (MAE: 0.0678 ± 0.0019) and matched-compute experiments (~14,790 gradient updates) reveal that optimization under-training accounts for the primary performance deficit rather than spatial heterogeneity alone. Local personalization reduces federated error to 0.0592 ± 0.0004 (82.4 bays), yet transmitting model weights incurs a 74.6-fold communication overhead compared to raw data transfers. Bilateral interpolation of daytime sensor gaps introduces potential within-day lookahead bias. We conclude that federation cannot be justified on bandwidth grounds and underperforms isolated local linear models, but offers institutional data containment when multi-stakeholder governance precludes centralization.</w:t>
+        <w:t>Federated learning (FL) is widely advocated for smart parking forecasting across multi-operator facilities, yet decentralized claims often overlook simple local baselines. We conduct an empirical benchmark on the Birmingham IoT stream (30 facilities, 21,868 sequences) across 30- and 60-minute horizons. A persistence baseline achieves a 30-minute Mean Absolute Error (MAE) of 0.0256 (33.4 bays), while an isolated 5-parameter local linear autoregressive model per lot—requiring zero communication—achieves an MAE of 0.0126 (13.9 bays), outperforming centralized deep learning (Attention-LSTM MAE: 0.0217; 26.9 bays) and all federated models. Under standard communication budgets (8 rounds), global FedAvg achieves an MAE of 0.0935 ± 0.0032. An IID control leaves a large residual at eight rounds; at approximately 14,790 updates, IID FedAvg (MAE: 0.0384 ± 0.0010) outperforms non-IID FedAvg (0.0858 ± 0.0015), highlighting the regime-dependent roles of optimization budget and client heterogeneity. Local personalization reduces federated error to 0.0592 ± 0.0004 (82.4 bays), yet transmitting model weights incurs a 74.6-fold communication overhead compared to raw data transfers. Bilateral interpolation of daytime sensor gaps introduces potential within-day lookahead bias. We conclude that federation cannot be justified on bandwidth grounds and underperforms isolated local linear models, but offers institutional data containment when multi-stakeholder governance precludes centralization.</w:t>
       </w:r>
     </w:p>
     <w:p>
@@ -291,7 +291,7 @@
         <w:t xml:space="preserve">3. Disentangling Under-Training from Non-IID Drift via Compute Parity: </w:t>
       </w:r>
       <w:r>
-        <w:t>Through compute step audits, round scaling, and an IID-shuffled federated control (MAE: 0.0678 ± 0.0019), our experimental decomposition reveals that under practical communication constraints (8 rounds, ~256 updates/client), 35.8% of the initial gap is attributable to statistical heterogeneity, while the remaining 64.2% reflects optimization under-training. Crucially, matched compute-parity experiments (15 rounds, ~14,790 client updates matching centralized 30 epochs) confirm that IID-shuffled FedAvg converges to 0.0384 ± 0.0010 (47.5 bays), reducing the optimization gap by 63.8% and indicating that non-IID client heterogeneity accounts for 73.9% of the residual deficit under this matched-compute protocol once compute starvation is mitigated. Local personalization fine-tuning bridges this gap, achieving MAE 0.0592 ± 0.0004 at R=8 and 0.0548 ± 0.0012 at R=15, recovering over 50% of the centralized performance gap without sharing client telemetry.</w:t>
+        <w:t>Through compute step audits, round scaling, and an IID-shuffled federated control (MAE: 0.0678 ± 0.0019), our experimental decomposition reveals that under practical communication constraints (8 rounds, ~256 updates/client), 35.8% of the initial gap is attributable to statistical heterogeneity, while the remaining 64.2% reflects optimization under-training. Crucially, approximately matched compute-budget experiments (15 rounds, 14,790 cumulative client updates vs. 14,370 centralized steps, 102.9%) confirm that IID-shuffled FedAvg converges to 0.0384 ± 0.0010 (47.5 bays), reducing the optimization gap by 63.8% and indicating that non-IID client heterogeneity accounts for 73.9% of the residual deficit under this matched-compute protocol once compute starvation is mitigated. Local personalization fine-tuning bridges this gap, achieving MAE 0.0592 ± 0.0004 at R=8 and 0.0548 ± 0.0012 at R=15, recovering over 50% of the centralized performance gap without sharing client telemetry.</w:t>
       </w:r>
     </w:p>
     <w:p>
@@ -2455,7 +2455,7 @@
           <w:rFonts w:ascii="Times New Roman" w:hAnsi="Times New Roman"/>
           <w:sz w:val="22"/>
         </w:rPr>
-        <w:t>Thus, each federated client executes barely 1.78% of the gradient updates performed by the centralized model. While the IID-shuffled control experiment demonstrates that non-IID statistical heterogeneity accounts for 35.8% of the initial gap between FedAvg and centralized models, the remaining 64.2% residual deficit is strongly consistent with optimization under-training under communication round constraints. We emphasize that this 64.2% figure represents an experimental decomposition under our communication-constrained protocol (R = 8). As investigated in Section 4.2 and Section 5.2 through matched compute-parity experiments (R = 15), extending training to matched gradient-step parity shifts this balance, indicating that non-IID heterogeneity accounts for 73.9% of the deficit once compute starvation is mitigated. Because FedAvg test error continues to improve gradually when communication rounds are extended from R = 8 to R = 16 (falling from 0.1006 to 0.0978), strict round limits impose substantial optimization friction on decentralized convergence.</w:t>
+        <w:t>Comparing cumulative system-wide optimizer updates provides a useful empirical proxy for training compute volume. Across all 30 clients, the 8-round federated protocol executes a total of 7,888 client-side optimizer updates (approximately 256 updates per client), representing 54.9% of the 14,370 updates executed by the centralized model over 30 epochs. In contrast, the 15-round protocol scales to 14,790 cumulative client-side updates across the federation (approximately 493 updates per client), achieving an approximately matched optimizer-update budget (102.9% of centralized compute, a +2.9% difference). We note that optimizer-update counts serve as a pragmatic compute proxy rather than proof of identical optimization dynamics, as decentralized client drift, localized mini-batches, and periodic parameter averaging induce distinct loss landscape trajectories. Under the 8-round communication budget, an IID-shuffled control experiment indicates that statistical heterogeneity accounts for 35.8% of the initial gap between FedAvg and centralized models, while the remaining 64.2% residual deficit is consistent with optimization under-training. Extending rounds to the approximately matched 15-round budget shifts this balance, indicating that non-IID heterogeneity accounts for 73.9% of the deficit once compute starvation is mitigated (Section 4.2 and Section 5.2). Because FedAvg test error improves gradually when communication rounds are extended, strict round limits impose substantial optimization friction on decentralized convergence.</w:t>
       </w:r>
     </w:p>
     <w:p>
@@ -5488,7 +5488,7 @@
           <w:i w:val="0"/>
           <w:sz w:val="19"/>
         </w:rPr>
-        <w:t>3. Empirical Comparison of Decentralized &amp; Federated Personalization Paradigms across Communication-Constrained (R=8) and Compute-Parity (R=15) Regimes (30-Minute Horizon, Mean ± Std across Seeds {42, 101, 2024}).</w:t>
+        <w:t>3. Empirical Comparison of Decentralized &amp; Federated Personalization Paradigms across Communication-Constrained (R=8) and Approximately Matched Compute-Budget (R=15) Regimes (30-Minute Horizon, Mean ± Std across Seeds {42, 101, 2024}).</w:t>
       </w:r>
     </w:p>
     <w:tbl>
@@ -6586,7 +6586,7 @@
               <w:rPr>
                 <w:sz w:val="16"/>
               </w:rPr>
-              <w:t>Compute Parity (R=15, E=2, ~14,790 steps)</w:t>
+              <w:t>Matched Compute Budget (R=15, ~14,790 steps)</w:t>
             </w:r>
           </w:p>
         </w:tc>
@@ -6609,7 +6609,7 @@
               <w:rPr>
                 <w:sz w:val="16"/>
               </w:rPr>
-              <w:t>Compute-Parity Global FedAvg (R=15, Non-IID)</w:t>
+              <w:t>Compute-Matched Global FedAvg (R=15, Non-IID)</w:t>
             </w:r>
           </w:p>
         </w:tc>
@@ -6749,7 +6749,7 @@
               <w:rPr>
                 <w:sz w:val="16"/>
               </w:rPr>
-              <w:t>Compute Parity (R=15, E=2, ~14,790 steps)</w:t>
+              <w:t>Matched Compute Budget (R=15, ~14,790 steps)</w:t>
             </w:r>
           </w:p>
         </w:tc>
@@ -6772,7 +6772,7 @@
               <w:rPr>
                 <w:sz w:val="16"/>
               </w:rPr>
-              <w:t>Compute-Parity IID-Shuffled FedAvg (R=15)</w:t>
+              <w:t>Compute-Matched IID-Shuffled FedAvg (R=15)</w:t>
             </w:r>
           </w:p>
         </w:tc>
@@ -6913,7 +6913,7 @@
                 <w:b/>
                 <w:sz w:val="16"/>
               </w:rPr>
-              <w:t>Compute Parity (R=15, E=2, ~14,790 steps)</w:t>
+              <w:t>Matched Compute Budget (R=15, ~14,790 steps)</w:t>
             </w:r>
           </w:p>
         </w:tc>
@@ -6937,7 +6937,7 @@
                 <w:b/>
                 <w:sz w:val="16"/>
               </w:rPr>
-              <w:t>Compute-Parity Personalized FedAvg (R=15)</w:t>
+              <w:t>Compute-Matched Personalized FedAvg (R=15)</w:t>
             </w:r>
           </w:p>
         </w:tc>
@@ -7084,7 +7084,7 @@
                 <w:color w:val="1E3A8A"/>
                 <w:sz w:val="16"/>
               </w:rPr>
-              <w:t>Decomposition (R=15 Parity)</w:t>
+              <w:t>Decomposition (R=15 Budget)</w:t>
             </w:r>
           </w:p>
         </w:tc>
@@ -7127,7 +7127,7 @@
           <w:color w:val="64748B"/>
           <w:sz w:val="16"/>
         </w:rPr>
-        <w:t>Note: All metrics report multi-seed mean ± std across seeds {42, 101, 2024}. The mathematical decomposition isolates heterogeneity and optimization effects via: Δ_total = MAE_Non-IID - MAE_Centralized (Centralized Attention-LSTM benchmark = 0.0217 ± 0.0004); Δ_heterogeneity = MAE_Non-IID - MAE_IID-Shuffled; Δ_optimization = MAE_IID-Shuffled - MAE_Centralized. Seed-level results: Panel 1 (R=8): Global FedAvg MAE = [0.0970 (seed 42), 0.0925 (seed 101), 0.0908 (seed 2024)]; IID-Shuffled FedAvg MAE = [0.0659, 0.0677, 0.0698]; Personalized FedAvg MAE = [0.0596, 0.0593, 0.0587]. Panel 2 (R=15 Compute Parity): Non-IID FedAvg MAE = [0.0857 (seed 42), 0.0874 (seed 101), 0.0844 (seed 2024)]; IID-Shuffled FedAvg MAE = [0.0372, 0.0389, 0.0390]; Personalized FedAvg MAE = [0.0535, 0.0558, 0.0551]. Under communication constraints (R=8), under-training accounts for 64.2% of the deficit; when scaled to matched compute parity (R=15), eliminating compute starvation allows IID FedAvg to converge to 0.0384 ± 0.0010, indicating that non-IID client heterogeneity accounts for 73.9% of the remaining deficit under this experimental protocol.</w:t>
+        <w:t>Note: All metrics report multi-seed mean ± std across seeds {42, 101, 2024}. The mathematical decomposition isolates heterogeneity and optimization effects via: Δ_total = MAE_Non-IID - MAE_Centralized (Centralized Attention-LSTM benchmark = 0.0217 ± 0.0004); Δ_heterogeneity = MAE_Non-IID - MAE_IID-Shuffled; Δ_optimization = MAE_IID-Shuffled - MAE_Centralized. Seed-level results: Panel 1 (R=8): Global FedAvg MAE = [0.0970 (seed 42), 0.0925 (seed 101), 0.0908 (seed 2024)]; IID-Shuffled FedAvg MAE = [0.0659, 0.0677, 0.0698]; Personalized FedAvg MAE = [0.0596, 0.0593, 0.0587]. Panel 2 (R=15 Compute Parity): Non-IID FedAvg MAE = [0.0857 (seed 42), 0.0874 (seed 101), 0.0844 (seed 2024)]; IID-Shuffled FedAvg MAE = [0.0372, 0.0389, 0.0390]; Personalized FedAvg MAE = [0.0535, 0.0558, 0.0551]. Under communication constraints (R=8), under-training accounts for 64.2% of the deficit; when scaled to an approximately matched optimizer-update budget (R=15, ~14,790 client updates vs 14,370 centralized steps, 102.9%), mitigating compute starvation allows IID FedAvg to converge to 0.0384 ± 0.0010, indicating that non-IID client heterogeneity accounts for 73.9% of the remaining deficit under this experimental protocol.</w:t>
       </w:r>
     </w:p>
     <w:p>
@@ -7158,10 +7158,10 @@
         <w:rPr>
           <w:b/>
         </w:rPr>
-        <w:t xml:space="preserve">1. Empirical Decomposition across Communication-Constrained and Compute-Parity Protocols: </w:t>
+        <w:t xml:space="preserve">1. Empirical Decomposition across Communication-Constrained and Approximately Matched Compute Regimes: </w:t>
       </w:r>
       <w:r>
-        <w:t>Under communication constraints (R = 8 rounds, ~256 local steps/client), Global FedAvg achieves an MAE of 0.0935 ± 0.0032. Eliminating statistical heterogeneity via IID shuffling reduces error to 0.0678 ± 0.0019. Relative to the centralized Attention-LSTM benchmark (0.0217), statistical heterogeneity accounts for 35.8% (0.0257) of the gap, while 64.2% (0.0461) reflects optimization under-training. Crucially, when scaled to matched compute parity (R = 15 rounds, E = 2, totaling 14,790 client updates matching the 30 centralized epochs = 14,370 steps), IID-Shuffled FedAvg converges rapidly to 0.0384 ± 0.0010 (47.5 bays), cutting the optimization gap by 63.8% (from 0.0461 to 0.0167). In contrast, Non-IID FedAvg at R = 15 reaches only 0.0858 ± 0.0015 (109.5 bays). Under matched compute parity, removing statistical heterogeneity closes 0.0474 of the 0.0641 gap—indicating that non-IID client statistical heterogeneity accounts for 73.9% (0.0474) of the performance deficit under this matched-compute protocol, while the residual optimization deficit shrinks to 26.1% (0.0167).</w:t>
+        <w:t>Under communication constraints (R = 8 rounds, ~256 local steps/client), Global FedAvg achieves an MAE of 0.0935 ± 0.0032. Eliminating statistical heterogeneity via IID shuffling reduces error to 0.0678 ± 0.0019. Relative to the centralized Attention-LSTM benchmark (0.0217), statistical heterogeneity accounts for 35.8% (0.0257) of the gap, while 64.2% (0.0461) reflects optimization under-training. Crucially, when scaled to an approximately matched compute budget (R = 15 rounds, E = 2, totaling 14,790 cumulative client updates vs 14,370 centralized steps, 102.9%), IID-Shuffled FedAvg converges rapidly to 0.0384 ± 0.0010 (47.5 bays), cutting the optimization gap by 63.8% (from 0.0461 to 0.0167). In contrast, Non-IID FedAvg at R = 15 reaches only 0.0858 ± 0.0015 (109.5 bays). Under matched compute parity, removing statistical heterogeneity closes 0.0474 of the 0.0641 gap—indicating that non-IID client statistical heterogeneity accounts for 73.9% (0.0474) of the performance deficit under this matched-compute protocol, while the residual optimization deficit shrinks to 26.1% (0.0167).</w:t>
       </w:r>
     </w:p>
     <w:p>
@@ -8124,7 +8124,20 @@
           <w:rFonts w:ascii="Times New Roman" w:hAnsi="Times New Roman"/>
           <w:sz w:val="22"/>
         </w:rPr>
-        <w:t>To investigate these distinct mechanisms under matched optimization volume, we conducted compute-parity experiments (Table 3, Panel 2) scaling federated training to R = 15 rounds (E = 2, B = 32), totaling exactly 14,790 client-side gradient updates across the federation and 30 local epochs per client—achieving exact compute and epoch parity with the 30 centralized epochs. At matched compute parity, the IID-shuffled control converges rapidly from 0.0678 ± 0.0019 down to 0.0384 ± 0.0010 (Mean Space Error falls from 90.4 to 47.5 bays), reducing the optimization gap to centralized Attention-LSTM by 63.8% (from 0.0461 to 0.0167). In contrast, Non-IID FedAvg only improves to 0.0858 ± 0.0015 (109.5 bays). Consequently, once under-training is resolved through compute parity, eliminating non-IID client heterogeneity accounts for 73.9% of the remaining performance deficit (0.0474 out of 0.0641). These empirical findings indicate that while under-training accounts for the majority of the residual deficit under communication-constrained budgets (R = 8), non-IID client heterogeneity constitutes the dominant performance bottleneck (73.9% of the deficit) when compute parity is enforced. However, matched optimizer-update counts do not render centralized and federated optimization trajectories identical, as decentralized client drift persists across local epochs. Local personalization acts as a high-leverage algorithmic compensation mechanism: by fine-tuning the global recurrent features on lot-specific data, personalized FedAvg achieves an MAE of 0.0592 ± 0.0004 at R = 8 and 0.0548 ± 0.0012 at R = 15, recovering 47.8% to 51.7% of the centralized performance gap and compressing cross-facility variance (sigma) by over 51%.</w:t>
+        <w:t>Instead, our empirical investigation demonstrates that optimization under-training under communication round constraints interacts directly with non-IID statistical heterogeneity. In an 8-round protocol, federated clients execute a system-wide total of 7,888 local Adam updates (~256 per client), representing 54.9% of the 14,370 optimization steps executed by the centralized model over 30 epochs. At this communication-constrained budget, the IID-shuffled control (Table 3) indicates that statistical heterogeneity accounts for 35.8% of the performance deficit, while the remaining 64.2% residual deficit reflects optimization under-training.</w:t>
+      </w:r>
+    </w:p>
+    <w:p>
+      <w:pPr>
+        <w:spacing w:before="0" w:after="100" w:line="276" w:lineRule="auto"/>
+        <w:jc w:val="both"/>
+      </w:pPr>
+      <w:r>
+        <w:rPr>
+          <w:rFonts w:ascii="Times New Roman" w:hAnsi="Times New Roman"/>
+          <w:sz w:val="22"/>
+        </w:rPr>
+        <w:t>To investigate these distinct mechanisms under matched optimization volume, we conducted compute-matched experiments (Table 3, Panel 2) scaling federated training to R = 15 rounds (E = 2, B = 32), totaling 14,790 client-side gradient updates across the federation (30 local epochs per client)—establishing an approximately matched optimizer-update budget (102.9% of centralized compute, a +2.9% difference) relative to the 14,370 centralized updates over 30 epochs. At this approximately matched budget, the IID-shuffled control converges rapidly from 0.0678 ± 0.0019 down to 0.0384 ± 0.0010 (Mean Space Error falls from 90.4 to 47.5 bays), reducing the optimization gap to centralized Attention-LSTM by 63.8% (from 0.0461 to 0.0167). In contrast, Non-IID FedAvg only improves to 0.0858 ± 0.0015 (109.5 bays). Consequently, once compute starvation is mitigated through this matched-update budget, eliminating non-IID client heterogeneity accounts for 73.9% of the remaining performance deficit (0.0474 out of 0.0641). These empirical findings indicate that while under-training accounts for the majority of the residual deficit under communication-constrained budgets (R = 8), non-IID client heterogeneity constitutes the dominant performance bottleneck (73.9% of the deficit) when an approximately matched optimizer-update budget is provided. However, matched optimizer-update counts do not render centralized and federated optimization trajectories identical, as decentralized client drift persists across local epochs. Local personalization acts as a high-leverage algorithmic compensation mechanism: by fine-tuning the global recurrent features on lot-specific data, personalized FedAvg achieves an MAE of 0.0592 ± 0.0004 at R = 8 and 0.0548 ± 0.0012 at R = 15, recovering 47.8% to 51.7% of the centralized performance gap and compressing cross-facility variance (sigma) by over 51%.</w:t>
       </w:r>
     </w:p>
     <w:p>
@@ -8798,7 +8811,7 @@
           <w:rFonts w:ascii="Times New Roman" w:hAnsi="Times New Roman"/>
           <w:sz w:val="22"/>
         </w:rPr>
-        <w:t>Our findings demonstrate that a 5-parameter local-only linear autoregressive model per facility (4 lag weights plus intercept) achieves superior accuracy (30-minute MAE: 0.0126; 13.9 bays), outperforming both centralized deep neural networks (0.0217; 26.9 bays) and federated models while requiring zero communication and avoiding cross-facility data sharing. Under practical communication constraints (8 rounds, 2 local epochs), global FedAvg under-trains severely, achieving a 30-minute MAE of 0.0935 ± 0.0032 (118.5 macro bays in multi-seed evaluation, and 0.1006 / 126.8 bays in the primary single-seed benchmark). Our experimental decomposition indicates that this degradation is strongly consistent with optimization under-training under communication round constraints (~256 local Adam updates per client versus 14,370 centralized steps) alongside statistical heterogeneity: an IID-shuffled federated control provides an empirical decomposition attributing 35.8% of the performance gap to statistical heterogeneity, with the remaining 64.2% residual deficit being strongly consistent with compute constraints (~256 local Adam updates per client versus 14,370 centralized steps) under the 8-round communication budget; matched compute-parity experiments (15 rounds, ~14,790 updates) further indicate that when compute starvation is mitigated, non-IID client heterogeneity accounts for 73.9% of the remaining deficit under this experimental protocol. Post-aggregation personalization fine-tuning mitigates this gap, reducing error to 0.0592 ± 0.0004 (82.4 macro bays; a 36.7% relative reduction over FedAvg, recovering 47.8% of the centralized gap in multi-seed evaluations and 50.6% in the primary single-seed benchmark), while compressing between-lot variance by 51.2%. Furthermore, network audits confirm that federating neural networks moves 110.35 MB (105.24 MiB) of weights across 8 rounds versus only 1.48 MB (1.41 MiB) for streaming the raw sensor telemetry—a 74.6-fold communication overhead. Consequently, federated parking forecasting cannot be justified on bandwidth-reduction grounds, but provides substantial value for multi-stakeholder commercial confidentiality and institutional data governance when paired with local personalization, though regulatory compliance ultimately depends on specific deployment environments, applicable data protection frameworks, and complementary differential privacy safeguards.</w:t>
+        <w:t>Our findings demonstrate that a 5-parameter local-only linear autoregressive model per facility (4 lag weights plus intercept) achieves superior accuracy (30-minute MAE: 0.0126; 13.9 bays), outperforming both centralized deep neural networks (0.0217; 26.9 bays) and federated models while requiring zero communication and avoiding cross-facility data sharing. Under practical communication constraints (8 rounds, 2 local epochs), global FedAvg under-trains severely, achieving a 30-minute MAE of 0.0935 ± 0.0032 (118.5 macro bays in multi-seed evaluation, and 0.1006 / 126.8 bays in the primary single-seed benchmark). Our experimental decomposition indicates that this degradation is strongly consistent with optimization under-training under communication round constraints (~256 local Adam updates per client versus 14,370 centralized steps) alongside statistical heterogeneity: an IID-shuffled federated control provides an empirical decomposition attributing 35.8% of the performance gap to statistical heterogeneity, with the remaining 64.2% residual deficit being strongly consistent with compute constraints (~256 local Adam updates per client versus 14,370 centralized steps) under the 8-round communication budget; approximately matched compute-budget experiments (15 rounds, 14,790 cumulative client updates, 102.9% of centralized steps) further indicate that when compute starvation is mitigated, non-IID client heterogeneity accounts for 73.9% of the remaining deficit under this experimental protocol. Post-aggregation personalization fine-tuning mitigates this gap, reducing error to 0.0592 ± 0.0004 (82.4 macro bays; a 36.7% relative reduction over FedAvg, recovering 47.8% of the centralized gap in multi-seed evaluations and 50.6% in the primary single-seed benchmark), while compressing between-lot variance by 51.2%. Furthermore, network audits confirm that federating neural networks moves 110.35 MB (105.24 MiB) of weights across 8 rounds versus only 1.48 MB (1.41 MiB) for streaming the raw sensor telemetry—a 74.6-fold communication overhead. Consequently, federated parking forecasting cannot be justified on bandwidth-reduction grounds, but provides substantial value for multi-stakeholder commercial confidentiality and institutional data governance when paired with local personalization, though regulatory compliance ultimately depends on specific deployment environments, applicable data protection frameworks, and complementary differential privacy safeguards.</w:t>
       </w:r>
     </w:p>
     <w:p>

</xml_diff>

<commit_message>
Calibrate 64.2% residual and 73.9% matched-budget phrasing, rename Table 3 label to IID-to-Centralized Residual, and eliminate duplicate paragraph
</commit_message>
<xml_diff>
--- a/Journal_Manuscript_Final_Submission.docx
+++ b/Journal_Manuscript_Final_Submission.docx
@@ -288,10 +288,10 @@
         <w:rPr>
           <w:b/>
         </w:rPr>
-        <w:t xml:space="preserve">3. Disentangling Under-Training from Non-IID Drift via Compute Parity: </w:t>
+        <w:t xml:space="preserve">3. Disentangling Optimization Budgets from Client Heterogeneity: </w:t>
       </w:r>
       <w:r>
-        <w:t>Through compute step audits, round scaling, and an IID-shuffled federated control (MAE: 0.0678 ± 0.0019), our experimental decomposition reveals that under practical communication constraints (8 rounds, ~256 updates/client), 35.8% of the initial gap is attributable to statistical heterogeneity, while the remaining 64.2% reflects optimization under-training. Crucially, approximately matched compute-budget experiments (15 rounds, 14,790 cumulative client updates vs. 14,370 centralized steps, 102.9%) confirm that IID-shuffled FedAvg converges to 0.0384 ± 0.0010 (47.5 bays), reducing the optimization gap by 63.8% and indicating that non-IID client heterogeneity accounts for 73.9% of the residual deficit under this matched-compute protocol once compute starvation is mitigated. Local personalization fine-tuning bridges this gap, achieving MAE 0.0592 ± 0.0004 at R=8 and 0.0548 ± 0.0012 at R=15, recovering over 50% of the centralized performance gap without sharing client telemetry.</w:t>
+        <w:t>Under the eight-round communication-constrained protocol, the difference between non-IID FedAvg and the IID-shuffled control corresponds to 35.8% of the overall gap between non-IID FedAvg and the centralized benchmark. The remaining 64.2% is the IID-shuffled-to-centralized residual, which is consistent with optimization under-training but cannot be attributed to under-training alone. Crucially, approximately matched compute-budget experiments (15 rounds, 14,790 cumulative client updates vs. 14,370 centralized steps, 102.9%) demonstrate that IID-shuffled FedAvg converges to 0.0384 ± 0.0010 (47.5 bays), reducing the optimization gap by 63.8%. Under this matched-budget protocol, the observed difference associated with non-IID versus IID-shuffled configurations accounts for 73.9% of the remaining deficit once compute starvation is mitigated. Local personalization fine-tuning bridges this gap, achieving MAE 0.0592 ± 0.0004 at R=8 and 0.0548 ± 0.0012 at R=15, recovering over 50% of the centralized performance gap without sharing client telemetry.</w:t>
       </w:r>
     </w:p>
     <w:p>
@@ -2455,7 +2455,7 @@
           <w:rFonts w:ascii="Times New Roman" w:hAnsi="Times New Roman"/>
           <w:sz w:val="22"/>
         </w:rPr>
-        <w:t>Comparing cumulative system-wide optimizer updates provides a useful empirical proxy for training compute volume. Across all 30 clients, the 8-round federated protocol executes a total of 7,888 client-side optimizer updates (approximately 256 updates per client), representing 54.9% of the 14,370 updates executed by the centralized model over 30 epochs. In contrast, the 15-round protocol scales to 14,790 cumulative client-side updates across the federation (approximately 493 updates per client), achieving an approximately matched optimizer-update budget (102.9% of centralized compute, a +2.9% difference). We note that optimizer-update counts serve as a pragmatic compute proxy rather than proof of identical optimization dynamics, as decentralized client drift, localized mini-batches, and periodic parameter averaging induce distinct loss landscape trajectories. Under the 8-round communication budget, an IID-shuffled control experiment indicates that statistical heterogeneity accounts for 35.8% of the initial gap between FedAvg and centralized models, while the remaining 64.2% residual deficit is consistent with optimization under-training. Extending rounds to the approximately matched 15-round budget shifts this balance, indicating that non-IID heterogeneity accounts for 73.9% of the deficit once compute starvation is mitigated (Section 4.2 and Section 5.2). Because FedAvg test error improves gradually when communication rounds are extended, strict round limits impose substantial optimization friction on decentralized convergence.</w:t>
+        <w:t>Comparing cumulative system-wide optimizer updates provides a useful empirical proxy for training compute volume. Across all 30 clients, the 8-round federated protocol executes a total of 7,888 client-side optimizer updates (approximately 256 updates per client), representing 54.9% of the 14,370 updates executed by the centralized model over 30 epochs. In contrast, the 15-round protocol scales to 14,790 cumulative client-side updates across the federation (approximately 493 updates per client), achieving an approximately matched optimizer-update budget (102.9% of centralized compute, a +2.9% difference). We note that optimizer-update counts serve as a pragmatic compute proxy rather than proof of identical optimization dynamics, as decentralized client drift, localized mini-batches, and periodic parameter averaging induce distinct loss landscape trajectories. Under the eight-round communication-constrained protocol, the difference between non-IID FedAvg and the IID-shuffled control corresponds to 35.8% of the overall gap between non-IID FedAvg and the centralized benchmark. The remaining 64.2% is the IID-shuffled-to-centralized residual, which is consistent with optimization under-training but cannot be attributed to under-training alone. Extending rounds to the approximately matched 15-round budget shifts this balance, where the observed difference associated with non-IID versus IID-shuffled configurations accounts for 73.9% of the remaining deficit once compute starvation is mitigated (Section 4.2 and Section 5.2). Because FedAvg test error improves gradually when communication rounds are extended, strict round limits impose substantial optimization friction on decentralized convergence.</w:t>
       </w:r>
     </w:p>
     <w:p>
@@ -6561,7 +6561,7 @@
                 <w:color w:val="1E3A8A"/>
                 <w:sz w:val="16"/>
               </w:rPr>
-              <w:t>Heterogeneity Gap: 0.0257 (35.8%) | Under-Training Deficit: 0.0461 (64.2%) | Total Gap: 0.0718</w:t>
+              <w:t>Heterogeneity Gap: 0.0257 (35.8%) | IID-to-Centralized Residual: 0.0461 (64.2%) | Total Gap: 0.0718</w:t>
             </w:r>
           </w:p>
         </w:tc>
@@ -7127,7 +7127,7 @@
           <w:color w:val="64748B"/>
           <w:sz w:val="16"/>
         </w:rPr>
-        <w:t>Note: All metrics report multi-seed mean ± std across seeds {42, 101, 2024}. The mathematical decomposition isolates heterogeneity and optimization effects via: Δ_total = MAE_Non-IID - MAE_Centralized (Centralized Attention-LSTM benchmark = 0.0217 ± 0.0004); Δ_heterogeneity = MAE_Non-IID - MAE_IID-Shuffled; Δ_optimization = MAE_IID-Shuffled - MAE_Centralized. Seed-level results: Panel 1 (R=8): Global FedAvg MAE = [0.0970 (seed 42), 0.0925 (seed 101), 0.0908 (seed 2024)]; IID-Shuffled FedAvg MAE = [0.0659, 0.0677, 0.0698]; Personalized FedAvg MAE = [0.0596, 0.0593, 0.0587]. Panel 2 (R=15 Compute Parity): Non-IID FedAvg MAE = [0.0857 (seed 42), 0.0874 (seed 101), 0.0844 (seed 2024)]; IID-Shuffled FedAvg MAE = [0.0372, 0.0389, 0.0390]; Personalized FedAvg MAE = [0.0535, 0.0558, 0.0551]. Under communication constraints (R=8), under-training accounts for 64.2% of the deficit; when scaled to an approximately matched optimizer-update budget (R=15, ~14,790 client updates vs 14,370 centralized steps, 102.9%), mitigating compute starvation allows IID FedAvg to converge to 0.0384 ± 0.0010, indicating that non-IID client heterogeneity accounts for 73.9% of the remaining deficit under this experimental protocol.</w:t>
+        <w:t>Note: All metrics report multi-seed mean ± std across seeds {42, 101, 2024}. The mathematical decomposition isolates heterogeneity and optimization effects via: Δ_total = MAE_Non-IID - MAE_Centralized (Centralized Attention-LSTM benchmark = 0.0217 ± 0.0004); Δ_heterogeneity = MAE_Non-IID - MAE_IID-Shuffled; Δ_optimization = MAE_IID-Shuffled - MAE_Centralized. Seed-level results: Panel 1 (R=8): Global FedAvg MAE = [0.0970 (seed 42), 0.0925 (seed 101), 0.0908 (seed 2024)]; IID-Shuffled FedAvg MAE = [0.0659, 0.0677, 0.0698]; Personalized FedAvg MAE = [0.0596, 0.0593, 0.0587]. Panel 2 (R=15 Compute Parity): Non-IID FedAvg MAE = [0.0857 (seed 42), 0.0874 (seed 101), 0.0844 (seed 2024)]; IID-Shuffled FedAvg MAE = [0.0372, 0.0389, 0.0390]; Personalized FedAvg MAE = [0.0535, 0.0558, 0.0551]. Under the eight-round communication-constrained protocol, the difference between non-IID FedAvg and the IID-shuffled control corresponds to 35.8% of the overall gap to the centralized benchmark, while the remaining 64.2% represents the IID-shuffled-to-centralized residual (consistent with under-training, but not uniquely attributable to under-training alone). When scaled to an approximately matched optimizer-update budget (R=15, 14,790 cumulative updates vs 14,370 centralized steps, 102.9%), mitigating compute starvation allows IID FedAvg to converge to 0.0384 ± 0.0010, with the observed difference associated with non-IID versus IID-shuffled configurations accounting for 73.9% of the remaining deficit under this matched-budget protocol.</w:t>
       </w:r>
     </w:p>
     <w:p>
@@ -7161,7 +7161,7 @@
         <w:t xml:space="preserve">1. Empirical Decomposition across Communication-Constrained and Approximately Matched Compute Regimes: </w:t>
       </w:r>
       <w:r>
-        <w:t>Under communication constraints (R = 8 rounds, ~256 local steps/client), Global FedAvg achieves an MAE of 0.0935 ± 0.0032. Eliminating statistical heterogeneity via IID shuffling reduces error to 0.0678 ± 0.0019. Relative to the centralized Attention-LSTM benchmark (0.0217), statistical heterogeneity accounts for 35.8% (0.0257) of the gap, while 64.2% (0.0461) reflects optimization under-training. Crucially, when scaled to an approximately matched compute budget (R = 15 rounds, E = 2, totaling 14,790 cumulative client updates vs 14,370 centralized steps, 102.9%), IID-Shuffled FedAvg converges rapidly to 0.0384 ± 0.0010 (47.5 bays), cutting the optimization gap by 63.8% (from 0.0461 to 0.0167). In contrast, Non-IID FedAvg at R = 15 reaches only 0.0858 ± 0.0015 (109.5 bays). Under matched compute parity, removing statistical heterogeneity closes 0.0474 of the 0.0641 gap—indicating that non-IID client statistical heterogeneity accounts for 73.9% (0.0474) of the performance deficit under this matched-compute protocol, while the residual optimization deficit shrinks to 26.1% (0.0167).</w:t>
+        <w:t>Under communication constraints (R = 8 rounds, ~256 local steps/client), Global FedAvg achieves an MAE of 0.0935 ± 0.0032. Eliminating statistical heterogeneity via IID shuffling reduces error to 0.0678 ± 0.0019. Relative to the centralized Attention-LSTM benchmark (0.0217), the difference between non-IID FedAvg and the IID control accounts for 35.8% (0.0257) of the overall gap, while the remaining 64.2% (0.0461) represents the IID-to-centralized residual, which is consistent with optimization under-training but cannot be attributed to under-training alone. Crucially, when scaled to an approximately matched compute budget (R = 15 rounds, E = 2, totaling 14,790 cumulative client updates vs 14,370 centralized steps, 102.9%), IID-Shuffled FedAvg converges to 0.0384 ± 0.0010 (47.5 bays), cutting the optimization gap by 63.8% (from 0.0461 to 0.0167). In contrast, Non-IID FedAvg at R = 15 reaches 0.0858 ± 0.0015 (109.5 bays). Under this matched budget, the observed difference associated with non-IID versus IID-shuffled configurations accounts for 73.9% (0.0474) of the remaining deficit once compute starvation is mitigated, while the residual optimization gap shrinks to 26.1% (0.0167).</w:t>
       </w:r>
     </w:p>
     <w:p>
@@ -8111,7 +8111,7 @@
           <w:rFonts w:ascii="Times New Roman" w:hAnsi="Times New Roman"/>
           <w:sz w:val="22"/>
         </w:rPr>
-        <w:t>Instead, our empirical investigation demonstrates that optimization under-training under communication round constraints interacts directly with non-IID statistical heterogeneity. In an 8-round protocol, federated clients execute approximately 256 local Adam updates per client (7,888 total updates across the federation), compared to 14,370 optimization steps executed by the centralized model over 30 epochs. At this communication-constrained budget, the IID-shuffled control (Table 3) indicates that statistical heterogeneity accounts for 35.8% of the performance deficit, while the remaining 64.2% residual deficit reflects optimization under-training.</w:t>
+        <w:t>Instead, our empirical investigation demonstrates that optimization under-training under communication round constraints interacts directly with non-IID statistical heterogeneity. In an 8-round protocol, federated clients execute a system-wide total of 7,888 local Adam updates (~256 per client), representing 54.9% of the 14,370 optimization steps executed by the centralized model over 30 epochs. At this communication-constrained budget, the difference between non-IID FedAvg and the IID-shuffled control (Table 3) corresponds to 35.8% of the overall gap to the centralized benchmark, while the remaining 64.2% represents the IID-to-centralized residual—consistent with optimization under-training but not uniquely attributable to under-training alone.</w:t>
       </w:r>
     </w:p>
     <w:p>
@@ -8124,20 +8124,7 @@
           <w:rFonts w:ascii="Times New Roman" w:hAnsi="Times New Roman"/>
           <w:sz w:val="22"/>
         </w:rPr>
-        <w:t>Instead, our empirical investigation demonstrates that optimization under-training under communication round constraints interacts directly with non-IID statistical heterogeneity. In an 8-round protocol, federated clients execute a system-wide total of 7,888 local Adam updates (~256 per client), representing 54.9% of the 14,370 optimization steps executed by the centralized model over 30 epochs. At this communication-constrained budget, the IID-shuffled control (Table 3) indicates that statistical heterogeneity accounts for 35.8% of the performance deficit, while the remaining 64.2% residual deficit reflects optimization under-training.</w:t>
-      </w:r>
-    </w:p>
-    <w:p>
-      <w:pPr>
-        <w:spacing w:before="0" w:after="100" w:line="276" w:lineRule="auto"/>
-        <w:jc w:val="both"/>
-      </w:pPr>
-      <w:r>
-        <w:rPr>
-          <w:rFonts w:ascii="Times New Roman" w:hAnsi="Times New Roman"/>
-          <w:sz w:val="22"/>
-        </w:rPr>
-        <w:t>To investigate these distinct mechanisms under matched optimization volume, we conducted compute-matched experiments (Table 3, Panel 2) scaling federated training to R = 15 rounds (E = 2, B = 32), totaling 14,790 client-side gradient updates across the federation (30 local epochs per client)—establishing an approximately matched optimizer-update budget (102.9% of centralized compute, a +2.9% difference) relative to the 14,370 centralized updates over 30 epochs. At this approximately matched budget, the IID-shuffled control converges rapidly from 0.0678 ± 0.0019 down to 0.0384 ± 0.0010 (Mean Space Error falls from 90.4 to 47.5 bays), reducing the optimization gap to centralized Attention-LSTM by 63.8% (from 0.0461 to 0.0167). In contrast, Non-IID FedAvg only improves to 0.0858 ± 0.0015 (109.5 bays). Consequently, once compute starvation is mitigated through this matched-update budget, eliminating non-IID client heterogeneity accounts for 73.9% of the remaining performance deficit (0.0474 out of 0.0641). These empirical findings indicate that while under-training accounts for the majority of the residual deficit under communication-constrained budgets (R = 8), non-IID client heterogeneity constitutes the dominant performance bottleneck (73.9% of the deficit) when an approximately matched optimizer-update budget is provided. However, matched optimizer-update counts do not render centralized and federated optimization trajectories identical, as decentralized client drift persists across local epochs. Local personalization acts as a high-leverage algorithmic compensation mechanism: by fine-tuning the global recurrent features on lot-specific data, personalized FedAvg achieves an MAE of 0.0592 ± 0.0004 at R = 8 and 0.0548 ± 0.0012 at R = 15, recovering 47.8% to 51.7% of the centralized performance gap and compressing cross-facility variance (sigma) by over 51%.</w:t>
+        <w:t>To investigate these distinct mechanisms under matched optimization volume, we conducted compute-matched experiments (Table 3, Panel 2) scaling federated training to R = 15 rounds (E = 2, B = 32), totaling 14,790 client-side gradient updates across the federation (30 local epochs per client)—establishing an approximately matched optimizer-update budget (102.9% of centralized compute, a +2.9% difference) relative to the 14,370 centralized updates over 30 epochs. At this approximately matched budget, the IID-shuffled control converges rapidly from 0.0678 ± 0.0019 down to 0.0384 ± 0.0010 (Mean Space Error falls from 90.4 to 47.5 bays), reducing the optimization gap to centralized Attention-LSTM by 63.8% (from 0.0461 to 0.0167). In contrast, Non-IID FedAvg only improves to 0.0858 ± 0.0015 (109.5 bays). Consequently, once compute starvation is mitigated through this matched-update budget, the observed difference associated with non-IID versus IID-shuffled configurations accounts for 73.9% of the remaining performance deficit (0.0474 out of 0.0641). These empirical findings indicate that under communication-constrained budgets (R = 8), the IID-to-centralized residual accounts for 64.2% of the deficit, whereas non-IID client heterogeneity accounts for 73.9% of the remaining deficit when an approximately matched optimizer-update budget is provided. However, matched optimizer-update counts do not render centralized and federated optimization trajectories identical, as decentralized client drift persists across local epochs. Local personalization acts as a high-leverage algorithmic compensation mechanism: by fine-tuning the global recurrent features on lot-specific data, personalized FedAvg achieves an MAE of 0.0592 ± 0.0004 at R = 8 and 0.0548 ± 0.0012 at R = 15, recovering 47.8% to 51.7% of the centralized performance gap and compressing cross-facility variance (sigma) by over 51%.</w:t>
       </w:r>
     </w:p>
     <w:p>
@@ -8811,7 +8798,7 @@
           <w:rFonts w:ascii="Times New Roman" w:hAnsi="Times New Roman"/>
           <w:sz w:val="22"/>
         </w:rPr>
-        <w:t>Our findings demonstrate that a 5-parameter local-only linear autoregressive model per facility (4 lag weights plus intercept) achieves superior accuracy (30-minute MAE: 0.0126; 13.9 bays), outperforming both centralized deep neural networks (0.0217; 26.9 bays) and federated models while requiring zero communication and avoiding cross-facility data sharing. Under practical communication constraints (8 rounds, 2 local epochs), global FedAvg under-trains severely, achieving a 30-minute MAE of 0.0935 ± 0.0032 (118.5 macro bays in multi-seed evaluation, and 0.1006 / 126.8 bays in the primary single-seed benchmark). Our experimental decomposition indicates that this degradation is strongly consistent with optimization under-training under communication round constraints (~256 local Adam updates per client versus 14,370 centralized steps) alongside statistical heterogeneity: an IID-shuffled federated control provides an empirical decomposition attributing 35.8% of the performance gap to statistical heterogeneity, with the remaining 64.2% residual deficit being strongly consistent with compute constraints (~256 local Adam updates per client versus 14,370 centralized steps) under the 8-round communication budget; approximately matched compute-budget experiments (15 rounds, 14,790 cumulative client updates, 102.9% of centralized steps) further indicate that when compute starvation is mitigated, non-IID client heterogeneity accounts for 73.9% of the remaining deficit under this experimental protocol. Post-aggregation personalization fine-tuning mitigates this gap, reducing error to 0.0592 ± 0.0004 (82.4 macro bays; a 36.7% relative reduction over FedAvg, recovering 47.8% of the centralized gap in multi-seed evaluations and 50.6% in the primary single-seed benchmark), while compressing between-lot variance by 51.2%. Furthermore, network audits confirm that federating neural networks moves 110.35 MB (105.24 MiB) of weights across 8 rounds versus only 1.48 MB (1.41 MiB) for streaming the raw sensor telemetry—a 74.6-fold communication overhead. Consequently, federated parking forecasting cannot be justified on bandwidth-reduction grounds, but provides substantial value for multi-stakeholder commercial confidentiality and institutional data governance when paired with local personalization, though regulatory compliance ultimately depends on specific deployment environments, applicable data protection frameworks, and complementary differential privacy safeguards.</w:t>
+        <w:t>Our findings demonstrate that a 5-parameter local-only linear autoregressive model per facility (4 lag weights plus intercept) achieves superior accuracy (30-minute MAE: 0.0126; 13.9 bays), outperforming both centralized deep neural networks (0.0217; 26.9 bays) and federated models while requiring zero communication and avoiding cross-facility data sharing. Under practical communication constraints (8 rounds, 2 local epochs), global FedAvg under-trains severely, achieving a 30-minute MAE of 0.0935 ± 0.0032 (118.5 macro bays in multi-seed evaluation, and 0.1006 / 126.8 bays in the primary single-seed benchmark). Our experimental decomposition indicates that under the 8-round communication-constrained protocol, the difference between non-IID FedAvg and the IID control corresponds to 35.8% of the gap to the centralized benchmark, while the remaining 64.2% is the IID-to-centralized residual (consistent with under-training, but not uniquely attributable to under-training alone); approximately matched compute-budget experiments (15 rounds, 14,790 cumulative client updates, 102.9% of centralized steps) further indicate that when compute starvation is mitigated, the observed difference associated with non-IID versus IID-shuffled configurations accounts for 73.9% of the remaining deficit under this matched-budget protocol. Post-aggregation personalization fine-tuning mitigates this gap, reducing error to 0.0592 ± 0.0004 (82.4 macro bays; a 36.7% relative reduction over FedAvg, recovering 47.8% of the centralized gap in multi-seed evaluations and 50.6% in the primary single-seed benchmark), while compressing between-lot variance by 51.2%. Furthermore, network audits confirm that federating neural networks moves 110.35 MB (105.24 MiB) of weights across 8 rounds versus only 1.48 MB (1.41 MiB) for streaming the raw sensor telemetry—a 74.6-fold communication overhead. Consequently, federated parking forecasting cannot be justified on bandwidth-reduction grounds, but provides substantial value for multi-stakeholder commercial confidentiality and institutional data governance when paired with local personalization, though regulatory compliance ultimately depends on specific deployment environments, applicable data protection frameworks, and complementary differential privacy safeguards.</w:t>
       </w:r>
     </w:p>
     <w:p>

</xml_diff>

<commit_message>
Resolve optimizer-update accounting: document exact heterogeneous batches (7,888 updates, avg 262.9/client), IID slices (7,696 updates, avg 256.5/client), and fine-tuning additions (9,367 and 16,269 totals)
</commit_message>
<xml_diff>
--- a/Journal_Manuscript_Final_Submission.docx
+++ b/Journal_Manuscript_Final_Submission.docx
@@ -2429,7 +2429,7 @@
           <w:color w:val="2F4F7F"/>
           <w:sz w:val="23"/>
         </w:rPr>
-        <w:t>3.5 Compute Parity Audit: Disentangling Under-Training from Heterogeneity</w:t>
+        <w:t>3.5 Compute Accounting: Disentangling Optimization Budgets from Heterogeneity</w:t>
       </w:r>
     </w:p>
     <w:p>
@@ -2442,7 +2442,7 @@
           <w:rFonts w:ascii="Times New Roman" w:hAnsi="Times New Roman"/>
           <w:sz w:val="22"/>
         </w:rPr>
-        <w:t>A critical consideration in interpreting federated empirical benchmarks is the disparity in cumulative gradient steps between centralized and federated configurations. In our setup, the centralized Attention-LSTM is trained for 30 epochs on 15,299 pooled sequences with batch size 32, executing exactly 30 x ceil(15,299 / 32) = 30 x 479 = 14,370 Adam gradient updates. In contrast, under standard FedAvg with R = 8 rounds and E = 2 local epochs, a client with an average dataset of approximately 510 training sequences (15,299 / 30 = 509.97) executes ceil(510 / 32) = 16 batches per epoch, yielding 32 gradient steps per round and a cumulative total of approximately 256 local Adam updates per client across the entire training process.</w:t>
+        <w:t>A critical consideration in interpreting federated empirical benchmarks is the disparity in cumulative gradient steps between centralized and federated configurations. In our setup, the centralized Attention-LSTM is trained for 30 epochs on 15,299 pooled sequences with batch size 32, executing exactly 30 × ceil(15,299 / 32) = 30 × 479 = 14,370 Adam gradient updates. In contrast, under standard FedAvg with R = 8 rounds and E = 2 local epochs per round, training is partitioned across the 30 municipal facilities. Because physical facility capacities and recorded telemetry vary (ranging from 38 training sequences at the smallest lot to 562 at the largest), the number of mini-batches per epoch varies between 2 and 18 across clients, summing to exactly 493 batches per epoch across the federation. Across 8 rounds (16 local epochs per client), the federation executes a system-wide total of 7,888 client-side optimizer updates (493 × 16), which corresponds to an average of 262.9 (approximately 263) updates per client (ranging from 32 to 288 updates across facilities), representing 54.9% of the 14,370 updates executed by the centralized model. (An idealized client with exactly 16 batches per epoch executes 256 updates over 8 rounds).</w:t>
       </w:r>
     </w:p>
     <w:p>
@@ -2455,7 +2455,20 @@
           <w:rFonts w:ascii="Times New Roman" w:hAnsi="Times New Roman"/>
           <w:sz w:val="22"/>
         </w:rPr>
-        <w:t>Comparing cumulative system-wide optimizer updates provides a useful empirical proxy for training compute volume. Across all 30 clients, the 8-round federated protocol executes a total of 7,888 client-side optimizer updates (approximately 256 updates per client), representing 54.9% of the 14,370 updates executed by the centralized model over 30 epochs. In contrast, the 15-round protocol scales to 14,790 cumulative client-side updates across the federation (approximately 493 updates per client), achieving an approximately matched optimizer-update budget (102.9% of centralized compute, a +2.9% difference). We note that optimizer-update counts serve as a pragmatic compute proxy rather than proof of identical optimization dynamics, as decentralized client drift, localized mini-batches, and periodic parameter averaging induce distinct loss landscape trajectories. Under the eight-round communication-constrained protocol, the difference between non-IID FedAvg and the IID-shuffled control corresponds to 35.8% of the overall gap between non-IID FedAvg and the centralized benchmark. The remaining 64.2% is the IID-shuffled-to-centralized residual, which is consistent with optimization under-training but cannot be attributed to under-training alone. Extending rounds to the approximately matched 15-round budget shifts this balance, where the observed difference associated with non-IID versus IID-shuffled configurations accounts for 73.9% of the remaining deficit once compute starvation is mitigated (Section 4.2 and Section 5.2). Because FedAvg test error improves gradually when communication rounds are extended, strict round limits impose substantial optimization friction on decentralized convergence.</w:t>
+        <w:t>In the IID-shuffled control experiment, the 15,299 pooled sequences are randomly permuted and sliced into 29 partitions of 509 sequences and 1 partition of 538 sequences. At batch size 32, the 29 uniform partitions yield ceil(509 / 32) = 16 batches per epoch, while the 30th partition yields ceil(538 / 32) = 17 batches per epoch, summing to 481 batches per epoch across the 30 clients. Across 8 rounds (16 local epochs), the IID control executes exactly 481 × 16 = 7,696 client updates (averaging 256.5 updates per client), representing 53.6% of centralized compute volume. For Personalized FedAvg, base 8-round federated training executes the standard 7,888 updates, followed by 3 local fine-tuning epochs on each client's private training set. These 3 fine-tuning epochs execute an additional 493 × 3 = 1,479 client updates across the federation (~49.3 updates per client), bringing the cumulative total for Personalized FedAvg to 9,367 optimizer updates (averaging 312.2 updates per client; 65.2% of centralized compute).</w:t>
+      </w:r>
+    </w:p>
+    <w:p>
+      <w:pPr>
+        <w:spacing w:before="0" w:after="100" w:line="276" w:lineRule="auto"/>
+        <w:jc w:val="both"/>
+      </w:pPr>
+      <w:r>
+        <w:rPr>
+          <w:rFonts w:ascii="Times New Roman" w:hAnsi="Times New Roman"/>
+          <w:sz w:val="22"/>
+        </w:rPr>
+        <w:t>To evaluate performance when compute starvation is mitigated, we scale federated training to R = 15 rounds (E = 2, B = 32), totaling 14,790 cumulative client updates for non-IID FedAvg (493 × 30, averaging 493.0 updates per client, 102.9% of centralized compute) and 14,430 updates for the IID-shuffled control (481 × 30, averaging 481.0 updates per client, 100.4% of centralized compute). Personalized FedAvg under this 15-round regime executes 14,790 base updates plus 1,479 fine-tuning updates, totaling 16,269 updates (averaging 542.3 updates per client, 113.2% of centralized compute). We note that optimizer-update counts serve as a pragmatic compute proxy rather than proof of identical optimization dynamics, as decentralized client drift, localized mini-batches, and periodic parameter averaging induce distinct loss landscape trajectories. Under the eight-round communication-constrained protocol, the difference between non-IID FedAvg and the IID-shuffled control corresponds to 35.8% of the overall gap between non-IID FedAvg and the centralized benchmark. The remaining 64.2% is the IID-shuffled-to-centralized residual, which is consistent with optimization under-training but cannot be attributed to under-training alone. Extending rounds to the approximately matched 15-round budget shifts this balance, where the observed difference associated with non-IID versus IID-shuffled configurations accounts for 73.9% of the remaining deficit once compute starvation is mitigated (Section 4.2 and Section 5.2). Because FedAvg test error improves gradually when communication rounds are extended, strict round limits impose substantial optimization friction on decentralized convergence.</w:t>
       </w:r>
     </w:p>
     <w:p>
@@ -7127,7 +7140,7 @@
           <w:color w:val="64748B"/>
           <w:sz w:val="16"/>
         </w:rPr>
-        <w:t>Note: All metrics report multi-seed mean ± std across seeds {42, 101, 2024}. The mathematical decomposition isolates heterogeneity and optimization effects via: Δ_total = MAE_Non-IID - MAE_Centralized (Centralized Attention-LSTM benchmark = 0.0217 ± 0.0004); Δ_heterogeneity = MAE_Non-IID - MAE_IID-Shuffled; Δ_optimization = MAE_IID-Shuffled - MAE_Centralized. Seed-level results: Panel 1 (R=8): Global FedAvg MAE = [0.0970 (seed 42), 0.0925 (seed 101), 0.0908 (seed 2024)]; IID-Shuffled FedAvg MAE = [0.0659, 0.0677, 0.0698]; Personalized FedAvg MAE = [0.0596, 0.0593, 0.0587]. Panel 2 (R=15 Compute Parity): Non-IID FedAvg MAE = [0.0857 (seed 42), 0.0874 (seed 101), 0.0844 (seed 2024)]; IID-Shuffled FedAvg MAE = [0.0372, 0.0389, 0.0390]; Personalized FedAvg MAE = [0.0535, 0.0558, 0.0551]. Under the eight-round communication-constrained protocol, the difference between non-IID FedAvg and the IID-shuffled control corresponds to 35.8% of the overall gap to the centralized benchmark, while the remaining 64.2% represents the IID-shuffled-to-centralized residual (consistent with under-training, but not uniquely attributable to under-training alone). When scaled to an approximately matched optimizer-update budget (R=15, 14,790 cumulative updates vs 14,370 centralized steps, 102.9%), mitigating compute starvation allows IID FedAvg to converge to 0.0384 ± 0.0010, with the observed difference associated with non-IID versus IID-shuffled configurations accounting for 73.9% of the remaining deficit under this matched-budget protocol.</w:t>
+        <w:t>Note: All metrics report multi-seed mean ± std across seeds {42, 101, 2024}. Cumulative optimizer updates across the 30 clients: Centralized model = 14,370 updates (30 epochs × 479 batches); Panel 1 (R=8): Global FedAvg, FedProx, and FedPer execute 7,888 client updates across the 30 facilities (493 batches/epoch × 16 epochs, averaging 262.9 updates/client, 54.9% of centralized compute); IID-Shuffled FedAvg executes 7,696 client updates (481 batches/epoch × 16 epochs across 29 clients of 509 samples and 1 of 538, averaging 256.5 updates/client, 53.6% of centralized compute); Personalized FedAvg includes 3 post-aggregation local fine-tuning epochs adding 1,479 updates (493 × 3), totaling 9,367 client updates across the federation (averaging 312.2 updates/client, 65.2% of centralized compute). Panel 2 (R=15 Matched Budget): Non-IID FedAvg executes 14,790 updates (493 × 30 epochs, averaging 493.0 updates/client, 102.9% of centralized compute); IID-Shuffled FedAvg executes 14,430 updates (481 × 30 epochs, averaging 481.0 updates/client, 100.4% of centralized compute); Personalized FedAvg executes 14,790 base + 1,479 fine-tuning = 16,269 updates (averaging 542.3 updates/client, 113.2% of centralized compute). Decomposition formula: Δ_total = MAE_Non-IID - MAE_Centralized (Centralized Attention-LSTM = 0.0217 ± 0.0004); Δ_heterogeneity = MAE_Non-IID - MAE_IID-Shuffled; Δ_optimization = MAE_IID-Shuffled - MAE_Centralized. Seed-level results: Panel 1 (R=8): Non-IID = [0.0970, 0.0925, 0.0908]; IID-Shuffled = [0.0659, 0.0677, 0.0698]; Personalized = [0.0596, 0.0593, 0.0587]. Panel 2 (R=15): Non-IID = [0.0857, 0.0874, 0.0844]; IID-Shuffled = [0.0372, 0.0389, 0.0390]; Personalized = [0.0535, 0.0558, 0.0551]. Under the 8-round protocol, the difference between non-IID FedAvg and the IID control corresponds to 35.8% of the gap to centralized accuracy, while the remaining 64.2% is the IID-to-centralized residual (consistent with under-training, but not uniquely attributable to under-training alone). Under the approximately matched 15-round budget, mitigating compute starvation allows IID FedAvg to converge to 0.0384 ± 0.0010, with the observed difference associated with non-IID versus IID-shuffled configurations accounting for 73.9% of the remaining deficit under this matched-budget protocol.</w:t>
       </w:r>
     </w:p>
     <w:p>
@@ -8573,7 +8586,7 @@
               <w:rPr>
                 <w:sz w:val="17"/>
               </w:rPr>
-              <w:t>14,370 Adam steps (pooled)</w:t>
+              <w:t>14,370 Adam steps (pooled 30 epochs)</w:t>
             </w:r>
           </w:p>
         </w:tc>
@@ -8596,7 +8609,7 @@
               <w:rPr>
                 <w:sz w:val="17"/>
               </w:rPr>
-              <w:t>~256 Adam steps per client</w:t>
+              <w:t>7,888 updates across federation (avg 262.9 steps/client)</w:t>
             </w:r>
           </w:p>
         </w:tc>
@@ -8619,7 +8632,7 @@
               <w:rPr>
                 <w:sz w:val="17"/>
               </w:rPr>
-              <w:t>1 closed-form Ridge solve per lot</w:t>
+              <w:t>1 closed-form Ridge solve per lot (0 gradient steps)</w:t>
             </w:r>
           </w:p>
         </w:tc>

</xml_diff>

<commit_message>
Update Table 3 update-count labels for IID (7,696) and Personalized FedAvg (9,367 and 16,269), and refine Section 3.5 partition phrasing
</commit_message>
<xml_diff>
--- a/Journal_Manuscript_Final_Submission.docx
+++ b/Journal_Manuscript_Final_Submission.docx
@@ -2455,7 +2455,7 @@
           <w:rFonts w:ascii="Times New Roman" w:hAnsi="Times New Roman"/>
           <w:sz w:val="22"/>
         </w:rPr>
-        <w:t>In the IID-shuffled control experiment, the 15,299 pooled sequences are randomly permuted and sliced into 29 partitions of 509 sequences and 1 partition of 538 sequences. At batch size 32, the 29 uniform partitions yield ceil(509 / 32) = 16 batches per epoch, while the 30th partition yields ceil(538 / 32) = 17 batches per epoch, summing to 481 batches per epoch across the 30 clients. Across 8 rounds (16 local epochs), the IID control executes exactly 481 × 16 = 7,696 client updates (averaging 256.5 updates per client), representing 53.6% of centralized compute volume. For Personalized FedAvg, base 8-round federated training executes the standard 7,888 updates, followed by 3 local fine-tuning epochs on each client's private training set. These 3 fine-tuning epochs execute an additional 493 × 3 = 1,479 client updates across the federation (~49.3 updates per client), bringing the cumulative total for Personalized FedAvg to 9,367 optimizer updates (averaging 312.2 updates per client; 65.2% of centralized compute).</w:t>
+        <w:t>In the IID-shuffled control experiment, the 15,299 pooled sequences are randomly permuted and sliced into 29 partitions of 509 sequences and 1 partition of 538 sequences. At batch size 32, the 29 partitions of 509 sequences each yield ceil(509 / 32) = 16 batches per epoch, while the 30th partition yields ceil(538 / 32) = 17 batches per epoch, summing to 481 batches per epoch across the 30 clients. Across 8 rounds (16 local epochs), the IID control executes exactly 481 × 16 = 7,696 client updates (averaging 256.5 updates per client), representing 53.6% of centralized compute volume. For Personalized FedAvg, base 8-round federated training executes the standard 7,888 updates, followed by 3 local fine-tuning epochs on each client's private training set. These 3 fine-tuning epochs execute an additional 493 × 3 = 1,479 client updates across the federation (~49.3 updates per client), bringing the cumulative total for Personalized FedAvg to 9,367 optimizer updates (averaging 312.2 updates per client; 65.2% of centralized compute).</w:t>
       </w:r>
     </w:p>
     <w:p>
@@ -5887,7 +5887,7 @@
               <w:rPr>
                 <w:sz w:val="16"/>
               </w:rPr>
-              <w:t>Communication-Constrained (R=8, E=2, ~7,888 steps)</w:t>
+              <w:t>Communication-Constrained (R=8, E=2, 7,696 updates)</w:t>
             </w:r>
           </w:p>
         </w:tc>
@@ -6377,7 +6377,7 @@
                 <w:b/>
                 <w:sz w:val="16"/>
               </w:rPr>
-              <w:t>Communication-Constrained (R=8, E=2, ~7,888 steps)</w:t>
+              <w:t>Communication-Constrained (R=8, E=2, 9,367 updates (including fine-tuning))</w:t>
             </w:r>
           </w:p>
         </w:tc>
@@ -6926,7 +6926,7 @@
                 <w:b/>
                 <w:sz w:val="16"/>
               </w:rPr>
-              <w:t>Matched Compute Budget (R=15, ~14,790 steps)</w:t>
+              <w:t>Matched Compute Budget (R=15, 16,269 updates (including fine-tuning))</w:t>
             </w:r>
           </w:p>
         </w:tc>

</xml_diff>

<commit_message>
Align Table 3 R=15 IID update count (14,430), refine Section 3.4 IID partition phrasing, and reconcile Persistence space error (33.4 bays)
</commit_message>
<xml_diff>
--- a/Journal_Manuscript_Final_Submission.docx
+++ b/Journal_Manuscript_Final_Submission.docx
@@ -2384,7 +2384,7 @@
         <w:t xml:space="preserve">7. IID-Shuffled Federated Control: </w:t>
       </w:r>
       <w:r>
-        <w:t>To isolate under-training from non-IID drift, the combined multi-lot training set is randomly partitioned into 30 uniform IID client slices, trained under identical parameters (R = 8, E = 2, B = 32).</w:t>
+        <w:t>To isolate under-training from non-IID drift, the combined multi-lot training set is randomly partitioned into 30 approximately equal-sized IID client partitions, trained under identical parameters (R = 8, E = 2, B = 32).</w:t>
       </w:r>
     </w:p>
     <w:p>
@@ -2901,7 +2901,7 @@
                 <w:b/>
                 <w:sz w:val="16"/>
               </w:rPr>
-              <w:t>33.3 ± 0.0</w:t>
+              <w:t>33.4 ± 0.0</w:t>
             </w:r>
           </w:p>
         </w:tc>
@@ -6599,7 +6599,7 @@
               <w:rPr>
                 <w:sz w:val="16"/>
               </w:rPr>
-              <w:t>Matched Compute Budget (R=15, ~14,790 steps)</w:t>
+              <w:t>Matched Compute Budget (R=15, 14,790 updates)</w:t>
             </w:r>
           </w:p>
         </w:tc>
@@ -6762,7 +6762,7 @@
               <w:rPr>
                 <w:sz w:val="16"/>
               </w:rPr>
-              <w:t>Matched Compute Budget (R=15, ~14,790 steps)</w:t>
+              <w:t>Matched Compute Budget (R=15, 14,430 updates)</w:t>
             </w:r>
           </w:p>
         </w:tc>

</xml_diff>